<commit_message>
feat: perbaikan form layanan surat pintar, perbaikan UI, penambahan UMKM & Sejarah, dan logo baru
</commit_message>
<xml_diff>
--- a/apps/web/public/templates/Surat_Beda_Nama.docx
+++ b/apps/web/public/templates/Surat_Beda_Nama.docx
@@ -1,6 +1,6 @@
 
 <file path=word/document.xml><?xml version="1.0" encoding="utf-8"?>
-<w:document xmlns:wpc="http://schemas.microsoft.com/office/word/2010/wordprocessingCanvas" xmlns:cx="http://schemas.microsoft.com/office/drawing/2014/chartex" xmlns:cx1="http://schemas.microsoft.com/office/drawing/2015/9/8/chartex" xmlns:cx2="http://schemas.microsoft.com/office/drawing/2015/10/21/chartex" xmlns:cx3="http://schemas.microsoft.com/office/drawing/2016/5/9/chartex" xmlns:cx4="http://schemas.microsoft.com/office/drawing/2016/5/10/chartex" xmlns:cx5="http://schemas.microsoft.com/office/drawing/2016/5/11/chartex" xmlns:cx6="http://schemas.microsoft.com/office/drawing/2016/5/12/chartex" xmlns:cx7="http://schemas.microsoft.com/office/drawing/2016/5/13/chartex" xmlns:cx8="http://schemas.microsoft.com/office/drawing/2016/5/14/chartex" xmlns:mc="http://schemas.openxmlformats.org/markup-compatibility/2006" xmlns:aink="http://schemas.microsoft.com/office/drawing/2016/ink" xmlns:am3d="http://schemas.microsoft.com/office/drawing/2017/model3d" xmlns:o="urn:schemas-microsoft-com:office:office" xmlns:r="http://schemas.openxmlformats.org/officeDocument/2006/relationships" xmlns:m="http://schemas.openxmlformats.org/officeDocument/2006/math" xmlns:v="urn:schemas-microsoft-com:vml" xmlns:wp14="http://schemas.microsoft.com/office/word/2010/wordprocessingDrawing" xmlns:wp="http://schemas.openxmlformats.org/drawingml/2006/wordprocessingDrawing" xmlns:w10="urn:schemas-microsoft-com:office:word" xmlns:w="http://schemas.openxmlformats.org/wordprocessingml/2006/main" xmlns:w14="http://schemas.microsoft.com/office/word/2010/wordml" xmlns:w15="http://schemas.microsoft.com/office/word/2012/wordml" xmlns:w16cex="http://schemas.microsoft.com/office/word/2018/wordml/cex" xmlns:w16cid="http://schemas.microsoft.com/office/word/2016/wordml/cid" xmlns:w16="http://schemas.microsoft.com/office/word/2018/wordml" xmlns:w16sdtdh="http://schemas.microsoft.com/office/word/2020/wordml/sdtdatahash" xmlns:w16se="http://schemas.microsoft.com/office/word/2015/wordml/symex" xmlns:wpg="http://schemas.microsoft.com/office/word/2010/wordprocessingGroup" xmlns:wpi="http://schemas.microsoft.com/office/word/2010/wordprocessingInk" xmlns:wne="http://schemas.microsoft.com/office/word/2006/wordml" xmlns:wps="http://schemas.microsoft.com/office/word/2010/wordprocessingShape" mc:Ignorable="w14 w15 w16se w16cid w16 w16cex w16sdtdh wp14">
+<w:document xmlns:wpc="http://schemas.microsoft.com/office/word/2010/wordprocessingCanvas" xmlns:cx="http://schemas.microsoft.com/office/drawing/2014/chartex" xmlns:cx1="http://schemas.microsoft.com/office/drawing/2015/9/8/chartex" xmlns:cx2="http://schemas.microsoft.com/office/drawing/2015/10/21/chartex" xmlns:cx3="http://schemas.microsoft.com/office/drawing/2016/5/9/chartex" xmlns:cx4="http://schemas.microsoft.com/office/drawing/2016/5/10/chartex" xmlns:cx5="http://schemas.microsoft.com/office/drawing/2016/5/11/chartex" xmlns:cx6="http://schemas.microsoft.com/office/drawing/2016/5/12/chartex" xmlns:cx7="http://schemas.microsoft.com/office/drawing/2016/5/13/chartex" xmlns:cx8="http://schemas.microsoft.com/office/drawing/2016/5/14/chartex" xmlns:mc="http://schemas.openxmlformats.org/markup-compatibility/2006" xmlns:aink="http://schemas.microsoft.com/office/drawing/2016/ink" xmlns:am3d="http://schemas.microsoft.com/office/drawing/2017/model3d" xmlns:o="urn:schemas-microsoft-com:office:office" xmlns:oel="http://schemas.microsoft.com/office/2019/extlst" xmlns:r="http://schemas.openxmlformats.org/officeDocument/2006/relationships" xmlns:m="http://schemas.openxmlformats.org/officeDocument/2006/math" xmlns:v="urn:schemas-microsoft-com:vml" xmlns:wp14="http://schemas.microsoft.com/office/word/2010/wordprocessingDrawing" xmlns:wp="http://schemas.openxmlformats.org/drawingml/2006/wordprocessingDrawing" xmlns:w10="urn:schemas-microsoft-com:office:word" xmlns:w="http://schemas.openxmlformats.org/wordprocessingml/2006/main" xmlns:w14="http://schemas.microsoft.com/office/word/2010/wordml" xmlns:w15="http://schemas.microsoft.com/office/word/2012/wordml" xmlns:w16cei="http://schemas.microsoft.com/office/word/2026/wordml/cei" xmlns:w16cex="http://schemas.microsoft.com/office/word/2018/wordml/cex" xmlns:w16cid="http://schemas.microsoft.com/office/word/2016/wordml/cid" xmlns:w16="http://schemas.microsoft.com/office/word/2018/wordml" xmlns:w16du="http://schemas.microsoft.com/office/word/2023/wordml/word16du" xmlns:w16sdtdh="http://schemas.microsoft.com/office/word/2020/wordml/sdtdatahash" xmlns:w16sdtfl="http://schemas.microsoft.com/office/word/2024/wordml/sdtformatlock" xmlns:w16se="http://schemas.microsoft.com/office/word/2015/wordml/symex" xmlns:wpg="http://schemas.microsoft.com/office/word/2010/wordprocessingGroup" xmlns:wpi="http://schemas.microsoft.com/office/word/2010/wordprocessingInk" xmlns:wne="http://schemas.microsoft.com/office/word/2006/wordml" xmlns:wps="http://schemas.microsoft.com/office/word/2010/wordprocessingShape" mc:Ignorable="w14 w15 w16se w16cid w16 w16cex w16sdtdh w16sdtfl w16du wp14">
   <w:body>
     <w:p>
       <w:pPr>
@@ -198,7 +198,7 @@
           <w:szCs w:val="20"/>
           <w:lang w:eastAsia="en-ID"/>
         </w:rPr>
-        <w:t xml:space="preserve">. </w:t>
+        <w:t xml:space="preserve">. Jati </w:t>
       </w:r>
       <w:proofErr w:type="spellStart"/>
       <w:r>
@@ -210,7 +210,7 @@
           <w:szCs w:val="20"/>
           <w:lang w:eastAsia="en-ID"/>
         </w:rPr>
-        <w:t>Jati</w:t>
+        <w:t>Sukarama</w:t>
       </w:r>
       <w:proofErr w:type="spellEnd"/>
       <w:r>
@@ -222,7 +222,7 @@
           <w:szCs w:val="20"/>
           <w:lang w:eastAsia="en-ID"/>
         </w:rPr>
-        <w:t xml:space="preserve"> </w:t>
+        <w:t xml:space="preserve"> KM. 09 </w:t>
       </w:r>
       <w:proofErr w:type="spellStart"/>
       <w:r>
@@ -234,7 +234,7 @@
           <w:szCs w:val="20"/>
           <w:lang w:eastAsia="en-ID"/>
         </w:rPr>
-        <w:t>Sukarama</w:t>
+        <w:t>Bojongpicung-Cianjur</w:t>
       </w:r>
       <w:proofErr w:type="spellEnd"/>
       <w:r>
@@ -246,55 +246,7 @@
           <w:szCs w:val="20"/>
           <w:lang w:eastAsia="en-ID"/>
         </w:rPr>
-        <w:t xml:space="preserve"> KM. 09 </w:t>
-      </w:r>
-      <w:proofErr w:type="spellStart"/>
-      <w:r>
-        <w:rPr>
-          <w:rFonts w:ascii="Abadi" w:eastAsia="Times New Roman" w:hAnsi="Abadi" w:cs="Times New Roman"/>
-          <w:b/>
-          <w:bCs/>
-          <w:sz w:val="20"/>
-          <w:szCs w:val="20"/>
-          <w:lang w:eastAsia="en-ID"/>
-        </w:rPr>
-        <w:t>Bojongpicung-Cianjur</w:t>
-      </w:r>
-      <w:proofErr w:type="spellEnd"/>
-      <w:r>
-        <w:rPr>
-          <w:rFonts w:ascii="Abadi" w:eastAsia="Times New Roman" w:hAnsi="Abadi" w:cs="Times New Roman"/>
-          <w:b/>
-          <w:bCs/>
-          <w:sz w:val="20"/>
-          <w:szCs w:val="20"/>
-          <w:lang w:eastAsia="en-ID"/>
-        </w:rPr>
-        <w:t xml:space="preserve"> </w:t>
-      </w:r>
-      <w:proofErr w:type="spellStart"/>
-      <w:r>
-        <w:rPr>
-          <w:rFonts w:ascii="Abadi" w:eastAsia="Times New Roman" w:hAnsi="Abadi" w:cs="Times New Roman"/>
-          <w:b/>
-          <w:bCs/>
-          <w:sz w:val="20"/>
-          <w:szCs w:val="20"/>
-          <w:lang w:eastAsia="en-ID"/>
-        </w:rPr>
-        <w:t>Pos</w:t>
-      </w:r>
-      <w:proofErr w:type="spellEnd"/>
-      <w:r>
-        <w:rPr>
-          <w:rFonts w:ascii="Abadi" w:eastAsia="Times New Roman" w:hAnsi="Abadi" w:cs="Times New Roman"/>
-          <w:b/>
-          <w:bCs/>
-          <w:sz w:val="20"/>
-          <w:szCs w:val="20"/>
-          <w:lang w:eastAsia="en-ID"/>
-        </w:rPr>
-        <w:t xml:space="preserve"> 43283 </w:t>
+        <w:t xml:space="preserve"> Pos 43283 </w:t>
       </w:r>
     </w:p>
     <w:p>
@@ -451,7 +403,7 @@
               </wp:anchor>
             </w:drawing>
           </mc:Choice>
-          <mc:Fallback xmlns:oel="http://schemas.microsoft.com/office/2019/extlst">
+          <mc:Fallback>
             <w:pict>
               <v:line w14:anchorId="6577995C" id="Straight Connector 1" o:spid="_x0000_s1026" style="position:absolute;flip:y;z-index:251659264;visibility:visible;mso-wrap-style:square;mso-width-percent:0;mso-height-percent:0;mso-wrap-distance-left:9pt;mso-wrap-distance-top:0;mso-wrap-distance-right:9pt;mso-wrap-distance-bottom:0;mso-position-horizontal:right;mso-position-horizontal-relative:margin;mso-position-vertical:absolute;mso-position-vertical-relative:text;mso-width-percent:0;mso-height-percent:0;mso-width-relative:margin;mso-height-relative:margin" from="411.1pt,.45pt" to="873.4pt,4.65pt" o:gfxdata="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" strokecolor="black [3213]" strokeweight="3pt">
                 <v:stroke joinstyle="miter"/>
@@ -488,7 +440,7 @@
           <w:sz w:val="28"/>
           <w:szCs w:val="28"/>
           <w:u w:val="single"/>
-          <w:lang w:val="ms-ID" w:eastAsia="en-ID"/>
+          <w:lang w:eastAsia="en-ID"/>
         </w:rPr>
       </w:pPr>
       <w:r>
@@ -826,7 +778,27 @@
           <w:bCs/>
           <w:lang w:eastAsia="en-ID"/>
         </w:rPr>
-        <w:t>WAHYU KOMARA</w:t>
+        <w:t>{</w:t>
+      </w:r>
+      <w:proofErr w:type="spellStart"/>
+      <w:r>
+        <w:rPr>
+          <w:rFonts w:ascii="Abadi" w:eastAsia="Times New Roman" w:hAnsi="Abadi" w:cs="Times New Roman"/>
+          <w:b/>
+          <w:bCs/>
+          <w:lang w:eastAsia="en-ID"/>
+        </w:rPr>
+        <w:t>namaPejabat</w:t>
+      </w:r>
+      <w:proofErr w:type="spellEnd"/>
+      <w:r>
+        <w:rPr>
+          <w:rFonts w:ascii="Abadi" w:eastAsia="Times New Roman" w:hAnsi="Abadi" w:cs="Times New Roman"/>
+          <w:b/>
+          <w:bCs/>
+          <w:lang w:eastAsia="en-ID"/>
+        </w:rPr>
+        <w:t>}</w:t>
       </w:r>
     </w:p>
     <w:p>
@@ -886,7 +858,23 @@
           <w:rFonts w:ascii="Abadi" w:eastAsia="Times New Roman" w:hAnsi="Abadi" w:cs="Times New Roman"/>
           <w:lang w:eastAsia="en-ID"/>
         </w:rPr>
-        <w:t>KEPALA DESA SUKARAMA</w:t>
+        <w:t>{</w:t>
+      </w:r>
+      <w:proofErr w:type="spellStart"/>
+      <w:r>
+        <w:rPr>
+          <w:rFonts w:ascii="Abadi" w:eastAsia="Times New Roman" w:hAnsi="Abadi" w:cs="Times New Roman"/>
+          <w:lang w:eastAsia="en-ID"/>
+        </w:rPr>
+        <w:t>jabatan</w:t>
+      </w:r>
+      <w:proofErr w:type="spellEnd"/>
+      <w:r>
+        <w:rPr>
+          <w:rFonts w:ascii="Abadi" w:eastAsia="Times New Roman" w:hAnsi="Abadi" w:cs="Times New Roman"/>
+          <w:lang w:eastAsia="en-ID"/>
+        </w:rPr>
+        <w:t>}</w:t>
       </w:r>
     </w:p>
     <w:p>
@@ -990,10 +978,12 @@
           <w:bCs/>
           <w:i/>
           <w:iCs/>
-          <w:lang w:val="ms-ID" w:eastAsia="en-ID"/>
-        </w:rPr>
-        <w:t xml:space="preserve">Nama Dalam </w:t>
-      </w:r>
+          <w:lang w:eastAsia="en-ID"/>
+        </w:rPr>
+        <w:t xml:space="preserve">Nama </w:t>
+      </w:r>
+      <w:proofErr w:type="spellStart"/>
+      <w:proofErr w:type="gramStart"/>
       <w:r>
         <w:rPr>
           <w:rFonts w:ascii="Abadi" w:eastAsia="Times New Roman" w:hAnsi="Abadi" w:cs="Times New Roman"/>
@@ -1001,10 +991,11 @@
           <w:bCs/>
           <w:i/>
           <w:iCs/>
-          <w:lang w:val="id-ID" w:eastAsia="en-ID"/>
-        </w:rPr>
-        <w:t xml:space="preserve"> </w:t>
-      </w:r>
+          <w:lang w:eastAsia="en-ID"/>
+        </w:rPr>
+        <w:t>Dalam</w:t>
+      </w:r>
+      <w:proofErr w:type="spellEnd"/>
       <w:r>
         <w:rPr>
           <w:rFonts w:ascii="Abadi" w:eastAsia="Times New Roman" w:hAnsi="Abadi" w:cs="Times New Roman"/>
@@ -1012,447 +1003,11 @@
           <w:bCs/>
           <w:i/>
           <w:iCs/>
-          <w:lang w:val="id-ID" w:eastAsia="en-ID"/>
-        </w:rPr>
-        <w:t>Kartu Keluarga (KK)</w:t>
-      </w:r>
-    </w:p>
-    <w:p>
-      <w:pPr>
-        <w:spacing w:after="0" w:line="240" w:lineRule="auto"/>
-        <w:rPr>
-          <w:rFonts w:ascii="Abadi" w:eastAsia="Times New Roman" w:hAnsi="Abadi" w:cs="Times New Roman"/>
-          <w:lang w:val="id-ID" w:eastAsia="en-ID"/>
-        </w:rPr>
-      </w:pPr>
-      <w:r>
-        <w:rPr>
-          <w:rFonts w:ascii="Abadi" w:eastAsia="Times New Roman" w:hAnsi="Abadi" w:cs="Times New Roman"/>
-          <w:lang w:eastAsia="en-ID"/>
-        </w:rPr>
-        <w:t>Nama</w:t>
-      </w:r>
-      <w:r>
-        <w:rPr>
-          <w:rFonts w:ascii="Abadi" w:eastAsia="Times New Roman" w:hAnsi="Abadi" w:cs="Times New Roman"/>
-          <w:lang w:eastAsia="en-ID"/>
-        </w:rPr>
-        <w:tab/>
-      </w:r>
-      <w:r>
-        <w:rPr>
-          <w:rFonts w:ascii="Abadi" w:eastAsia="Times New Roman" w:hAnsi="Abadi" w:cs="Times New Roman"/>
-          <w:lang w:eastAsia="en-ID"/>
-        </w:rPr>
-        <w:tab/>
-      </w:r>
-      <w:r>
-        <w:rPr>
-          <w:rFonts w:ascii="Abadi" w:eastAsia="Times New Roman" w:hAnsi="Abadi" w:cs="Times New Roman"/>
-          <w:lang w:eastAsia="en-ID"/>
-        </w:rPr>
-        <w:tab/>
-        <w:t xml:space="preserve">: </w:t>
-      </w:r>
-      <w:r>
-        <w:rPr>
-          <w:rFonts w:ascii="Abadi" w:eastAsia="Times New Roman" w:hAnsi="Abadi" w:cs="Times New Roman"/>
-          <w:lang w:val="id-ID" w:eastAsia="en-ID"/>
-        </w:rPr>
-        <w:t>IKBAL</w:t>
-      </w:r>
-    </w:p>
-    <w:p>
-      <w:pPr>
-        <w:spacing w:after="0" w:line="240" w:lineRule="auto"/>
-        <w:rPr>
-          <w:rFonts w:ascii="Abadi" w:eastAsia="Times New Roman" w:hAnsi="Abadi" w:cs="Times New Roman"/>
-          <w:lang w:val="id-ID" w:eastAsia="en-ID"/>
-        </w:rPr>
-      </w:pPr>
-      <w:r>
-        <w:rPr>
-          <w:rFonts w:ascii="Abadi" w:eastAsia="Times New Roman" w:hAnsi="Abadi" w:cs="Times New Roman"/>
-          <w:lang w:val="id-ID" w:eastAsia="en-ID"/>
-        </w:rPr>
-        <w:t xml:space="preserve">Nik </w:t>
-      </w:r>
-      <w:r>
-        <w:rPr>
-          <w:rFonts w:ascii="Abadi" w:eastAsia="Times New Roman" w:hAnsi="Abadi" w:cs="Times New Roman"/>
-          <w:lang w:val="id-ID" w:eastAsia="en-ID"/>
-        </w:rPr>
-        <w:tab/>
-      </w:r>
-      <w:r>
-        <w:rPr>
-          <w:rFonts w:ascii="Abadi" w:eastAsia="Times New Roman" w:hAnsi="Abadi" w:cs="Times New Roman"/>
-          <w:lang w:val="id-ID" w:eastAsia="en-ID"/>
-        </w:rPr>
-        <w:tab/>
-      </w:r>
-      <w:r>
-        <w:rPr>
-          <w:rFonts w:ascii="Abadi" w:eastAsia="Times New Roman" w:hAnsi="Abadi" w:cs="Times New Roman"/>
-          <w:lang w:val="id-ID" w:eastAsia="en-ID"/>
-        </w:rPr>
-        <w:tab/>
-        <w:t>: 32030630129860009</w:t>
-      </w:r>
-    </w:p>
-    <w:p>
-      <w:pPr>
-        <w:spacing w:after="0" w:line="240" w:lineRule="auto"/>
-        <w:rPr>
-          <w:rFonts w:ascii="Abadi" w:eastAsia="Times New Roman" w:hAnsi="Abadi" w:cs="Times New Roman"/>
-          <w:lang w:val="id-ID" w:eastAsia="en-ID"/>
-        </w:rPr>
-      </w:pPr>
-      <w:r>
-        <w:rPr>
-          <w:rFonts w:ascii="Abadi" w:eastAsia="Times New Roman" w:hAnsi="Abadi" w:cs="Times New Roman"/>
-          <w:lang w:val="id-ID" w:eastAsia="en-ID"/>
-        </w:rPr>
-        <w:t>Tempat/Tgl lahir</w:t>
-      </w:r>
-      <w:r>
-        <w:rPr>
-          <w:rFonts w:ascii="Abadi" w:eastAsia="Times New Roman" w:hAnsi="Abadi" w:cs="Times New Roman"/>
-          <w:lang w:val="id-ID" w:eastAsia="en-ID"/>
-        </w:rPr>
-        <w:tab/>
-        <w:t>: Cianjur, 27/09/1996</w:t>
-      </w:r>
-    </w:p>
-    <w:p>
-      <w:pPr>
-        <w:spacing w:after="0" w:line="240" w:lineRule="auto"/>
-        <w:rPr>
-          <w:rFonts w:ascii="Abadi" w:eastAsia="Times New Roman" w:hAnsi="Abadi" w:cs="Times New Roman"/>
-          <w:lang w:val="id-ID" w:eastAsia="en-ID"/>
-        </w:rPr>
-      </w:pPr>
-      <w:r>
-        <w:rPr>
-          <w:rFonts w:ascii="Abadi" w:eastAsia="Times New Roman" w:hAnsi="Abadi" w:cs="Times New Roman"/>
-          <w:lang w:val="id-ID" w:eastAsia="en-ID"/>
-        </w:rPr>
-        <w:t>Jenis Kelamin</w:t>
-      </w:r>
-      <w:r>
-        <w:rPr>
-          <w:rFonts w:ascii="Abadi" w:eastAsia="Times New Roman" w:hAnsi="Abadi" w:cs="Times New Roman"/>
-          <w:lang w:val="id-ID" w:eastAsia="en-ID"/>
-        </w:rPr>
-        <w:tab/>
-      </w:r>
-      <w:r>
-        <w:rPr>
-          <w:rFonts w:ascii="Abadi" w:eastAsia="Times New Roman" w:hAnsi="Abadi" w:cs="Times New Roman"/>
-          <w:lang w:val="id-ID" w:eastAsia="en-ID"/>
-        </w:rPr>
-        <w:tab/>
-        <w:t>: Laki-Laki</w:t>
-      </w:r>
-    </w:p>
-    <w:p>
-      <w:pPr>
-        <w:spacing w:after="0" w:line="240" w:lineRule="auto"/>
-        <w:rPr>
-          <w:rFonts w:ascii="Abadi" w:eastAsia="Times New Roman" w:hAnsi="Abadi" w:cs="Times New Roman"/>
-          <w:lang w:val="id-ID" w:eastAsia="en-ID"/>
-        </w:rPr>
-      </w:pPr>
-      <w:r>
-        <w:rPr>
-          <w:rFonts w:ascii="Abadi" w:eastAsia="Times New Roman" w:hAnsi="Abadi" w:cs="Times New Roman"/>
-          <w:lang w:val="id-ID" w:eastAsia="en-ID"/>
-        </w:rPr>
-        <w:t>Status</w:t>
-      </w:r>
-      <w:r>
-        <w:rPr>
-          <w:rFonts w:ascii="Abadi" w:eastAsia="Times New Roman" w:hAnsi="Abadi" w:cs="Times New Roman"/>
-          <w:lang w:val="id-ID" w:eastAsia="en-ID"/>
-        </w:rPr>
-        <w:tab/>
-      </w:r>
-      <w:r>
-        <w:rPr>
-          <w:rFonts w:ascii="Abadi" w:eastAsia="Times New Roman" w:hAnsi="Abadi" w:cs="Times New Roman"/>
-          <w:lang w:val="id-ID" w:eastAsia="en-ID"/>
-        </w:rPr>
-        <w:tab/>
-      </w:r>
-      <w:r>
-        <w:rPr>
-          <w:rFonts w:ascii="Abadi" w:eastAsia="Times New Roman" w:hAnsi="Abadi" w:cs="Times New Roman"/>
-          <w:lang w:val="id-ID" w:eastAsia="en-ID"/>
-        </w:rPr>
-        <w:tab/>
-        <w:t>: Belum Kawin</w:t>
-      </w:r>
-    </w:p>
-    <w:p>
-      <w:pPr>
-        <w:spacing w:after="0" w:line="240" w:lineRule="auto"/>
-        <w:rPr>
-          <w:rFonts w:ascii="Abadi" w:eastAsia="Times New Roman" w:hAnsi="Abadi" w:cs="Times New Roman"/>
-          <w:lang w:val="id-ID" w:eastAsia="en-ID"/>
-        </w:rPr>
-      </w:pPr>
-      <w:r>
-        <w:rPr>
-          <w:rFonts w:ascii="Abadi" w:eastAsia="Times New Roman" w:hAnsi="Abadi" w:cs="Times New Roman"/>
-          <w:lang w:val="id-ID" w:eastAsia="en-ID"/>
-        </w:rPr>
-        <w:t>Agama</w:t>
-      </w:r>
-      <w:r>
-        <w:rPr>
-          <w:rFonts w:ascii="Abadi" w:eastAsia="Times New Roman" w:hAnsi="Abadi" w:cs="Times New Roman"/>
-          <w:lang w:val="id-ID" w:eastAsia="en-ID"/>
-        </w:rPr>
-        <w:tab/>
-      </w:r>
-      <w:r>
-        <w:rPr>
-          <w:rFonts w:ascii="Abadi" w:eastAsia="Times New Roman" w:hAnsi="Abadi" w:cs="Times New Roman"/>
-          <w:lang w:val="id-ID" w:eastAsia="en-ID"/>
-        </w:rPr>
-        <w:tab/>
-      </w:r>
-      <w:r>
-        <w:rPr>
-          <w:rFonts w:ascii="Abadi" w:eastAsia="Times New Roman" w:hAnsi="Abadi" w:cs="Times New Roman"/>
-          <w:lang w:val="id-ID" w:eastAsia="en-ID"/>
-        </w:rPr>
-        <w:tab/>
-        <w:t>: Islam</w:t>
-      </w:r>
-    </w:p>
-    <w:p>
-      <w:pPr>
-        <w:spacing w:after="0" w:line="240" w:lineRule="auto"/>
-        <w:rPr>
-          <w:rFonts w:ascii="Abadi" w:eastAsia="Times New Roman" w:hAnsi="Abadi" w:cs="Times New Roman"/>
-          <w:lang w:val="id-ID" w:eastAsia="en-ID"/>
-        </w:rPr>
-      </w:pPr>
-      <w:r>
-        <w:rPr>
-          <w:rFonts w:ascii="Abadi" w:eastAsia="Times New Roman" w:hAnsi="Abadi" w:cs="Times New Roman"/>
-          <w:lang w:val="id-ID" w:eastAsia="en-ID"/>
-        </w:rPr>
-        <w:t>Pekerjaan</w:t>
-      </w:r>
-      <w:r>
-        <w:rPr>
-          <w:rFonts w:ascii="Abadi" w:eastAsia="Times New Roman" w:hAnsi="Abadi" w:cs="Times New Roman"/>
-          <w:lang w:val="id-ID" w:eastAsia="en-ID"/>
-        </w:rPr>
-        <w:tab/>
-      </w:r>
-      <w:r>
-        <w:rPr>
-          <w:rFonts w:ascii="Abadi" w:eastAsia="Times New Roman" w:hAnsi="Abadi" w:cs="Times New Roman"/>
-          <w:lang w:val="id-ID" w:eastAsia="en-ID"/>
-        </w:rPr>
-        <w:tab/>
-        <w:t>: Belum Bekerja</w:t>
-      </w:r>
-    </w:p>
-    <w:p>
-      <w:pPr>
-        <w:spacing w:after="0" w:line="240" w:lineRule="auto"/>
-        <w:rPr>
-          <w:rFonts w:ascii="Abadi" w:eastAsia="Times New Roman" w:hAnsi="Abadi" w:cs="Times New Roman"/>
-          <w:lang w:val="id-ID" w:eastAsia="en-ID"/>
-        </w:rPr>
-      </w:pPr>
-      <w:r>
-        <w:rPr>
-          <w:rFonts w:ascii="Abadi" w:eastAsia="Times New Roman" w:hAnsi="Abadi" w:cs="Times New Roman"/>
-          <w:lang w:eastAsia="en-ID"/>
-        </w:rPr>
-        <w:t>Alamat</w:t>
-      </w:r>
-      <w:r>
-        <w:rPr>
-          <w:rFonts w:ascii="Abadi" w:eastAsia="Times New Roman" w:hAnsi="Abadi" w:cs="Times New Roman"/>
-          <w:lang w:eastAsia="en-ID"/>
-        </w:rPr>
-        <w:tab/>
-      </w:r>
-      <w:r>
-        <w:rPr>
-          <w:rFonts w:ascii="Abadi" w:eastAsia="Times New Roman" w:hAnsi="Abadi" w:cs="Times New Roman"/>
-          <w:lang w:eastAsia="en-ID"/>
-        </w:rPr>
-        <w:tab/>
-      </w:r>
-      <w:r>
-        <w:rPr>
-          <w:rFonts w:ascii="Abadi" w:eastAsia="Times New Roman" w:hAnsi="Abadi" w:cs="Times New Roman"/>
-          <w:lang w:eastAsia="en-ID"/>
-        </w:rPr>
-        <w:tab/>
-        <w:t xml:space="preserve">: </w:t>
-      </w:r>
-      <w:proofErr w:type="spellStart"/>
-      <w:r>
-        <w:rPr>
-          <w:rFonts w:ascii="Abadi" w:eastAsia="Times New Roman" w:hAnsi="Abadi" w:cs="Times New Roman"/>
-          <w:lang w:eastAsia="en-ID"/>
-        </w:rPr>
-        <w:t>Kp</w:t>
-      </w:r>
-      <w:proofErr w:type="spellEnd"/>
-      <w:r>
-        <w:rPr>
-          <w:rFonts w:ascii="Abadi" w:eastAsia="Times New Roman" w:hAnsi="Abadi" w:cs="Times New Roman"/>
-          <w:lang w:eastAsia="en-ID"/>
-        </w:rPr>
-        <w:t xml:space="preserve">. </w:t>
-      </w:r>
-      <w:r>
-        <w:rPr>
-          <w:rFonts w:ascii="Abadi" w:eastAsia="Times New Roman" w:hAnsi="Abadi" w:cs="Times New Roman"/>
-          <w:lang w:val="id-ID" w:eastAsia="en-ID"/>
-        </w:rPr>
-        <w:t>Tegalpanjang</w:t>
-      </w:r>
-      <w:r>
-        <w:rPr>
-          <w:rFonts w:ascii="Abadi" w:eastAsia="Times New Roman" w:hAnsi="Abadi" w:cs="Times New Roman"/>
-          <w:lang w:val="en-US" w:eastAsia="en-ID"/>
+          <w:lang w:eastAsia="en-ID"/>
         </w:rPr>
         <w:t xml:space="preserve"> </w:t>
       </w:r>
       <w:r>
-        <w:rPr>
-          <w:rFonts w:ascii="Abadi" w:eastAsia="Times New Roman" w:hAnsi="Abadi" w:cs="Times New Roman"/>
-          <w:lang w:eastAsia="en-ID"/>
-        </w:rPr>
-        <w:t>Rt. 00</w:t>
-      </w:r>
-      <w:r>
-        <w:rPr>
-          <w:rFonts w:ascii="Abadi" w:eastAsia="Times New Roman" w:hAnsi="Abadi" w:cs="Times New Roman"/>
-          <w:lang w:val="id-ID" w:eastAsia="en-ID"/>
-        </w:rPr>
-        <w:t>3</w:t>
-      </w:r>
-      <w:r>
-        <w:rPr>
-          <w:rFonts w:ascii="Abadi" w:eastAsia="Times New Roman" w:hAnsi="Abadi" w:cs="Times New Roman"/>
-          <w:lang w:eastAsia="en-ID"/>
-        </w:rPr>
-        <w:t xml:space="preserve"> </w:t>
-      </w:r>
-      <w:proofErr w:type="spellStart"/>
-      <w:r>
-        <w:rPr>
-          <w:rFonts w:ascii="Abadi" w:eastAsia="Times New Roman" w:hAnsi="Abadi" w:cs="Times New Roman"/>
-          <w:lang w:eastAsia="en-ID"/>
-        </w:rPr>
-        <w:t>Rw</w:t>
-      </w:r>
-      <w:proofErr w:type="spellEnd"/>
-      <w:r>
-        <w:rPr>
-          <w:rFonts w:ascii="Abadi" w:eastAsia="Times New Roman" w:hAnsi="Abadi" w:cs="Times New Roman"/>
-          <w:lang w:eastAsia="en-ID"/>
-        </w:rPr>
-        <w:t>. 00</w:t>
-      </w:r>
-      <w:r>
-        <w:rPr>
-          <w:rFonts w:ascii="Abadi" w:eastAsia="Times New Roman" w:hAnsi="Abadi" w:cs="Times New Roman"/>
-          <w:lang w:val="id-ID" w:eastAsia="en-ID"/>
-        </w:rPr>
-        <w:t>4</w:t>
-      </w:r>
-      <w:r>
-        <w:rPr>
-          <w:rFonts w:ascii="Abadi" w:eastAsia="Times New Roman" w:hAnsi="Abadi" w:cs="Times New Roman"/>
-          <w:lang w:val="en-US" w:eastAsia="en-ID"/>
-        </w:rPr>
-        <w:t xml:space="preserve"> </w:t>
-      </w:r>
-      <w:proofErr w:type="spellStart"/>
-      <w:r>
-        <w:rPr>
-          <w:rFonts w:ascii="Abadi" w:eastAsia="Times New Roman" w:hAnsi="Abadi" w:cs="Times New Roman"/>
-          <w:lang w:eastAsia="en-ID"/>
-        </w:rPr>
-        <w:t>Desa</w:t>
-      </w:r>
-      <w:proofErr w:type="spellEnd"/>
-      <w:r>
-        <w:rPr>
-          <w:rFonts w:ascii="Abadi" w:eastAsia="Times New Roman" w:hAnsi="Abadi" w:cs="Times New Roman"/>
-          <w:lang w:val="en-US" w:eastAsia="en-ID"/>
-        </w:rPr>
-        <w:t xml:space="preserve"> </w:t>
-      </w:r>
-      <w:r>
-        <w:rPr>
-          <w:rFonts w:ascii="Abadi" w:eastAsia="Times New Roman" w:hAnsi="Abadi" w:cs="Times New Roman"/>
-          <w:lang w:val="id-ID" w:eastAsia="en-ID"/>
-        </w:rPr>
-        <w:t xml:space="preserve">Sukarama Kecamatan </w:t>
-      </w:r>
-    </w:p>
-    <w:p>
-      <w:pPr>
-        <w:spacing w:after="0" w:line="240" w:lineRule="auto"/>
-        <w:rPr>
-          <w:rFonts w:ascii="Abadi" w:eastAsia="Times New Roman" w:hAnsi="Abadi" w:cs="Times New Roman"/>
-          <w:lang w:val="id-ID" w:eastAsia="en-ID"/>
-        </w:rPr>
-      </w:pPr>
-      <w:r>
-        <w:rPr>
-          <w:rFonts w:ascii="Abadi" w:eastAsia="Times New Roman" w:hAnsi="Abadi" w:cs="Times New Roman"/>
-          <w:lang w:val="id-ID" w:eastAsia="en-ID"/>
-        </w:rPr>
-        <w:t xml:space="preserve">                                   </w:t>
-      </w:r>
-      <w:r>
-        <w:rPr>
-          <w:rFonts w:ascii="Abadi" w:eastAsia="Times New Roman" w:hAnsi="Abadi" w:cs="Times New Roman"/>
-          <w:lang w:val="id-ID" w:eastAsia="en-ID"/>
-        </w:rPr>
-        <w:t>Bojongpicung</w:t>
-      </w:r>
-      <w:r>
-        <w:rPr>
-          <w:rFonts w:ascii="Abadi" w:eastAsia="Times New Roman" w:hAnsi="Abadi" w:cs="Times New Roman"/>
-          <w:lang w:val="id-ID" w:eastAsia="en-ID"/>
-        </w:rPr>
-        <w:t xml:space="preserve"> Kabupaten</w:t>
-      </w:r>
-      <w:r>
-        <w:rPr>
-          <w:rFonts w:ascii="Abadi" w:eastAsia="Times New Roman" w:hAnsi="Abadi" w:cs="Times New Roman"/>
-          <w:lang w:val="id-ID" w:eastAsia="en-ID"/>
-        </w:rPr>
-        <w:t xml:space="preserve"> Cianjur</w:t>
-      </w:r>
-    </w:p>
-    <w:p>
-      <w:pPr>
-        <w:spacing w:after="0" w:line="240" w:lineRule="auto"/>
-        <w:rPr>
-          <w:rFonts w:ascii="Abadi" w:eastAsia="Times New Roman" w:hAnsi="Abadi" w:cs="Times New Roman"/>
-          <w:lang w:eastAsia="en-ID"/>
-        </w:rPr>
-      </w:pPr>
-    </w:p>
-    <w:p>
-      <w:pPr>
-        <w:spacing w:after="0" w:line="360" w:lineRule="auto"/>
         <w:rPr>
           <w:rFonts w:ascii="Abadi" w:eastAsia="Times New Roman" w:hAnsi="Abadi" w:cs="Times New Roman"/>
           <w:b/>
@@ -1461,7 +1016,8 @@
           <w:iCs/>
           <w:lang w:val="id-ID" w:eastAsia="en-ID"/>
         </w:rPr>
-      </w:pPr>
+        <w:t xml:space="preserve"> </w:t>
+      </w:r>
       <w:r>
         <w:rPr>
           <w:rFonts w:ascii="Abadi" w:eastAsia="Times New Roman" w:hAnsi="Abadi" w:cs="Times New Roman"/>
@@ -1469,10 +1025,11 @@
           <w:bCs/>
           <w:i/>
           <w:iCs/>
-          <w:lang w:val="ms-ID" w:eastAsia="en-ID"/>
-        </w:rPr>
-        <w:t xml:space="preserve">Nama Dalam </w:t>
-      </w:r>
+          <w:lang w:val="id-ID" w:eastAsia="en-ID"/>
+        </w:rPr>
+        <w:t>Kartu</w:t>
+      </w:r>
+      <w:proofErr w:type="gramEnd"/>
       <w:r>
         <w:rPr>
           <w:rFonts w:ascii="Abadi" w:eastAsia="Times New Roman" w:hAnsi="Abadi" w:cs="Times New Roman"/>
@@ -1482,6 +1039,421 @@
           <w:iCs/>
           <w:lang w:val="id-ID" w:eastAsia="en-ID"/>
         </w:rPr>
+        <w:t xml:space="preserve"> Keluarga (KK)</w:t>
+      </w:r>
+    </w:p>
+    <w:p>
+      <w:pPr>
+        <w:spacing w:after="0" w:line="240" w:lineRule="auto"/>
+        <w:rPr>
+          <w:rFonts w:ascii="Abadi" w:eastAsia="Times New Roman" w:hAnsi="Abadi" w:cs="Times New Roman"/>
+          <w:lang w:val="id-ID" w:eastAsia="en-ID"/>
+        </w:rPr>
+      </w:pPr>
+      <w:r>
+        <w:rPr>
+          <w:rFonts w:ascii="Abadi" w:eastAsia="Times New Roman" w:hAnsi="Abadi" w:cs="Times New Roman"/>
+          <w:lang w:eastAsia="en-ID"/>
+        </w:rPr>
+        <w:t>Nama</w:t>
+      </w:r>
+      <w:r>
+        <w:rPr>
+          <w:rFonts w:ascii="Abadi" w:eastAsia="Times New Roman" w:hAnsi="Abadi" w:cs="Times New Roman"/>
+          <w:lang w:eastAsia="en-ID"/>
+        </w:rPr>
+        <w:tab/>
+      </w:r>
+      <w:r>
+        <w:rPr>
+          <w:rFonts w:ascii="Abadi" w:eastAsia="Times New Roman" w:hAnsi="Abadi" w:cs="Times New Roman"/>
+          <w:lang w:eastAsia="en-ID"/>
+        </w:rPr>
+        <w:tab/>
+      </w:r>
+      <w:r>
+        <w:rPr>
+          <w:rFonts w:ascii="Abadi" w:eastAsia="Times New Roman" w:hAnsi="Abadi" w:cs="Times New Roman"/>
+          <w:lang w:eastAsia="en-ID"/>
+        </w:rPr>
+        <w:tab/>
+        <w:t xml:space="preserve">: </w:t>
+      </w:r>
+      <w:r>
+        <w:rPr>
+          <w:rFonts w:ascii="Abadi" w:eastAsia="Times New Roman" w:hAnsi="Abadi" w:cs="Times New Roman"/>
+          <w:lang w:val="ms-MY" w:eastAsia="en-ID"/>
+        </w:rPr>
+        <w:t>{nama</w:t>
+      </w:r>
+      <w:r>
+        <w:rPr>
+          <w:rFonts w:ascii="Abadi" w:eastAsia="Times New Roman" w:hAnsi="Abadi" w:cs="Times New Roman"/>
+          <w:lang w:eastAsia="en-ID"/>
+        </w:rPr>
+        <w:t>Kk</w:t>
+      </w:r>
+      <w:r>
+        <w:rPr>
+          <w:rFonts w:ascii="Abadi" w:eastAsia="Times New Roman" w:hAnsi="Abadi" w:cs="Times New Roman"/>
+          <w:lang w:val="ms-MY" w:eastAsia="en-ID"/>
+        </w:rPr>
+        <w:t>}</w:t>
+      </w:r>
+    </w:p>
+    <w:p>
+      <w:pPr>
+        <w:spacing w:after="0" w:line="240" w:lineRule="auto"/>
+        <w:rPr>
+          <w:rFonts w:ascii="Abadi" w:eastAsia="Times New Roman" w:hAnsi="Abadi" w:cs="Times New Roman"/>
+          <w:lang w:val="id-ID" w:eastAsia="en-ID"/>
+        </w:rPr>
+      </w:pPr>
+      <w:r>
+        <w:rPr>
+          <w:rFonts w:ascii="Abadi" w:eastAsia="Times New Roman" w:hAnsi="Abadi" w:cs="Times New Roman"/>
+          <w:lang w:val="id-ID" w:eastAsia="en-ID"/>
+        </w:rPr>
+        <w:t xml:space="preserve">Nik </w:t>
+      </w:r>
+      <w:r>
+        <w:rPr>
+          <w:rFonts w:ascii="Abadi" w:eastAsia="Times New Roman" w:hAnsi="Abadi" w:cs="Times New Roman"/>
+          <w:lang w:val="id-ID" w:eastAsia="en-ID"/>
+        </w:rPr>
+        <w:tab/>
+      </w:r>
+      <w:r>
+        <w:rPr>
+          <w:rFonts w:ascii="Abadi" w:eastAsia="Times New Roman" w:hAnsi="Abadi" w:cs="Times New Roman"/>
+          <w:lang w:val="id-ID" w:eastAsia="en-ID"/>
+        </w:rPr>
+        <w:tab/>
+      </w:r>
+      <w:r>
+        <w:rPr>
+          <w:rFonts w:ascii="Abadi" w:eastAsia="Times New Roman" w:hAnsi="Abadi" w:cs="Times New Roman"/>
+          <w:lang w:val="id-ID" w:eastAsia="en-ID"/>
+        </w:rPr>
+        <w:tab/>
+        <w:t xml:space="preserve">: </w:t>
+      </w:r>
+      <w:r>
+        <w:rPr>
+          <w:rFonts w:ascii="Abadi" w:eastAsia="Times New Roman" w:hAnsi="Abadi" w:cs="Times New Roman"/>
+          <w:lang w:val="ms-MY" w:eastAsia="en-ID"/>
+        </w:rPr>
+        <w:t>{nik}</w:t>
+      </w:r>
+    </w:p>
+    <w:p>
+      <w:pPr>
+        <w:spacing w:after="0" w:line="240" w:lineRule="auto"/>
+        <w:rPr>
+          <w:rFonts w:ascii="Abadi" w:eastAsia="Times New Roman" w:hAnsi="Abadi" w:cs="Times New Roman"/>
+          <w:lang w:val="id-ID" w:eastAsia="en-ID"/>
+        </w:rPr>
+      </w:pPr>
+      <w:r>
+        <w:rPr>
+          <w:rFonts w:ascii="Abadi" w:eastAsia="Times New Roman" w:hAnsi="Abadi" w:cs="Times New Roman"/>
+          <w:lang w:val="id-ID" w:eastAsia="en-ID"/>
+        </w:rPr>
+        <w:t>Tempat/Tgl lahir</w:t>
+      </w:r>
+      <w:r>
+        <w:rPr>
+          <w:rFonts w:ascii="Abadi" w:eastAsia="Times New Roman" w:hAnsi="Abadi" w:cs="Times New Roman"/>
+          <w:lang w:val="id-ID" w:eastAsia="en-ID"/>
+        </w:rPr>
+        <w:tab/>
+        <w:t xml:space="preserve">: </w:t>
+      </w:r>
+      <w:r>
+        <w:rPr>
+          <w:rFonts w:ascii="Abadi" w:eastAsia="Times New Roman" w:hAnsi="Abadi" w:cs="Times New Roman"/>
+          <w:lang w:val="ms-MY" w:eastAsia="en-ID"/>
+        </w:rPr>
+        <w:t>{tempatLahir}, {tanggalLahir}</w:t>
+      </w:r>
+    </w:p>
+    <w:p>
+      <w:pPr>
+        <w:spacing w:after="0" w:line="240" w:lineRule="auto"/>
+        <w:rPr>
+          <w:rFonts w:ascii="Abadi" w:eastAsia="Times New Roman" w:hAnsi="Abadi" w:cs="Times New Roman"/>
+          <w:lang w:val="id-ID" w:eastAsia="en-ID"/>
+        </w:rPr>
+      </w:pPr>
+      <w:r>
+        <w:rPr>
+          <w:rFonts w:ascii="Abadi" w:eastAsia="Times New Roman" w:hAnsi="Abadi" w:cs="Times New Roman"/>
+          <w:lang w:val="id-ID" w:eastAsia="en-ID"/>
+        </w:rPr>
+        <w:t>Jenis Kelamin</w:t>
+      </w:r>
+      <w:r>
+        <w:rPr>
+          <w:rFonts w:ascii="Abadi" w:eastAsia="Times New Roman" w:hAnsi="Abadi" w:cs="Times New Roman"/>
+          <w:lang w:val="id-ID" w:eastAsia="en-ID"/>
+        </w:rPr>
+        <w:tab/>
+      </w:r>
+      <w:r>
+        <w:rPr>
+          <w:rFonts w:ascii="Abadi" w:eastAsia="Times New Roman" w:hAnsi="Abadi" w:cs="Times New Roman"/>
+          <w:lang w:val="id-ID" w:eastAsia="en-ID"/>
+        </w:rPr>
+        <w:tab/>
+        <w:t xml:space="preserve">: </w:t>
+      </w:r>
+      <w:r>
+        <w:rPr>
+          <w:rFonts w:ascii="Abadi" w:eastAsia="Times New Roman" w:hAnsi="Abadi" w:cs="Times New Roman"/>
+          <w:lang w:val="ms-MY" w:eastAsia="en-ID"/>
+        </w:rPr>
+        <w:t>{jenisKelamin}</w:t>
+      </w:r>
+    </w:p>
+    <w:p>
+      <w:pPr>
+        <w:spacing w:after="0" w:line="240" w:lineRule="auto"/>
+        <w:rPr>
+          <w:rFonts w:ascii="Abadi" w:eastAsia="Times New Roman" w:hAnsi="Abadi" w:cs="Times New Roman"/>
+          <w:lang w:val="id-ID" w:eastAsia="en-ID"/>
+        </w:rPr>
+      </w:pPr>
+      <w:r>
+        <w:rPr>
+          <w:rFonts w:ascii="Abadi" w:eastAsia="Times New Roman" w:hAnsi="Abadi" w:cs="Times New Roman"/>
+          <w:lang w:val="id-ID" w:eastAsia="en-ID"/>
+        </w:rPr>
+        <w:t>Status</w:t>
+      </w:r>
+      <w:r>
+        <w:rPr>
+          <w:rFonts w:ascii="Abadi" w:eastAsia="Times New Roman" w:hAnsi="Abadi" w:cs="Times New Roman"/>
+          <w:lang w:val="id-ID" w:eastAsia="en-ID"/>
+        </w:rPr>
+        <w:tab/>
+      </w:r>
+      <w:r>
+        <w:rPr>
+          <w:rFonts w:ascii="Abadi" w:eastAsia="Times New Roman" w:hAnsi="Abadi" w:cs="Times New Roman"/>
+          <w:lang w:val="id-ID" w:eastAsia="en-ID"/>
+        </w:rPr>
+        <w:tab/>
+      </w:r>
+      <w:r>
+        <w:rPr>
+          <w:rFonts w:ascii="Abadi" w:eastAsia="Times New Roman" w:hAnsi="Abadi" w:cs="Times New Roman"/>
+          <w:lang w:val="id-ID" w:eastAsia="en-ID"/>
+        </w:rPr>
+        <w:tab/>
+        <w:t xml:space="preserve">: </w:t>
+      </w:r>
+      <w:r>
+        <w:rPr>
+          <w:rFonts w:ascii="Abadi" w:eastAsia="Times New Roman" w:hAnsi="Abadi" w:cs="Times New Roman"/>
+          <w:lang w:val="ms-MY" w:eastAsia="en-ID"/>
+        </w:rPr>
+        <w:t>{statusPerkawinan}</w:t>
+      </w:r>
+    </w:p>
+    <w:p>
+      <w:pPr>
+        <w:spacing w:after="0" w:line="240" w:lineRule="auto"/>
+        <w:rPr>
+          <w:rFonts w:ascii="Abadi" w:eastAsia="Times New Roman" w:hAnsi="Abadi" w:cs="Times New Roman"/>
+          <w:lang w:val="id-ID" w:eastAsia="en-ID"/>
+        </w:rPr>
+      </w:pPr>
+      <w:r>
+        <w:rPr>
+          <w:rFonts w:ascii="Abadi" w:eastAsia="Times New Roman" w:hAnsi="Abadi" w:cs="Times New Roman"/>
+          <w:lang w:val="id-ID" w:eastAsia="en-ID"/>
+        </w:rPr>
+        <w:t>Agama</w:t>
+      </w:r>
+      <w:r>
+        <w:rPr>
+          <w:rFonts w:ascii="Abadi" w:eastAsia="Times New Roman" w:hAnsi="Abadi" w:cs="Times New Roman"/>
+          <w:lang w:val="id-ID" w:eastAsia="en-ID"/>
+        </w:rPr>
+        <w:tab/>
+      </w:r>
+      <w:r>
+        <w:rPr>
+          <w:rFonts w:ascii="Abadi" w:eastAsia="Times New Roman" w:hAnsi="Abadi" w:cs="Times New Roman"/>
+          <w:lang w:val="id-ID" w:eastAsia="en-ID"/>
+        </w:rPr>
+        <w:tab/>
+      </w:r>
+      <w:r>
+        <w:rPr>
+          <w:rFonts w:ascii="Abadi" w:eastAsia="Times New Roman" w:hAnsi="Abadi" w:cs="Times New Roman"/>
+          <w:lang w:val="id-ID" w:eastAsia="en-ID"/>
+        </w:rPr>
+        <w:tab/>
+        <w:t xml:space="preserve">: </w:t>
+      </w:r>
+      <w:r>
+        <w:rPr>
+          <w:rFonts w:ascii="Abadi" w:hAnsi="Abadi"/>
+          <w:spacing w:val="1"/>
+          <w:lang w:val="ms-MY"/>
+        </w:rPr>
+        <w:t>{agama}</w:t>
+      </w:r>
+    </w:p>
+    <w:p>
+      <w:pPr>
+        <w:spacing w:after="0" w:line="240" w:lineRule="auto"/>
+        <w:rPr>
+          <w:rFonts w:ascii="Abadi" w:eastAsia="Times New Roman" w:hAnsi="Abadi" w:cs="Times New Roman"/>
+          <w:lang w:val="id-ID" w:eastAsia="en-ID"/>
+        </w:rPr>
+      </w:pPr>
+      <w:r>
+        <w:rPr>
+          <w:rFonts w:ascii="Abadi" w:eastAsia="Times New Roman" w:hAnsi="Abadi" w:cs="Times New Roman"/>
+          <w:lang w:val="id-ID" w:eastAsia="en-ID"/>
+        </w:rPr>
+        <w:t>Pekerjaan</w:t>
+      </w:r>
+      <w:r>
+        <w:rPr>
+          <w:rFonts w:ascii="Abadi" w:eastAsia="Times New Roman" w:hAnsi="Abadi" w:cs="Times New Roman"/>
+          <w:lang w:val="id-ID" w:eastAsia="en-ID"/>
+        </w:rPr>
+        <w:tab/>
+      </w:r>
+      <w:r>
+        <w:rPr>
+          <w:rFonts w:ascii="Abadi" w:eastAsia="Times New Roman" w:hAnsi="Abadi" w:cs="Times New Roman"/>
+          <w:lang w:val="id-ID" w:eastAsia="en-ID"/>
+        </w:rPr>
+        <w:tab/>
+        <w:t xml:space="preserve">: </w:t>
+      </w:r>
+      <w:r>
+        <w:rPr>
+          <w:rFonts w:ascii="Abadi" w:eastAsia="Times New Roman" w:hAnsi="Abadi" w:cs="Times New Roman"/>
+          <w:lang w:val="id-ID" w:eastAsia="en-ID"/>
+        </w:rPr>
+        <w:t>{pekerjaan}</w:t>
+      </w:r>
+    </w:p>
+    <w:p>
+      <w:pPr>
+        <w:spacing w:after="0" w:line="240" w:lineRule="auto"/>
+        <w:rPr>
+          <w:rFonts w:ascii="Abadi" w:eastAsia="Times New Roman" w:hAnsi="Abadi" w:cs="Times New Roman"/>
+          <w:lang w:val="id-ID" w:eastAsia="en-ID"/>
+        </w:rPr>
+      </w:pPr>
+      <w:r>
+        <w:rPr>
+          <w:rFonts w:ascii="Abadi" w:eastAsia="Times New Roman" w:hAnsi="Abadi" w:cs="Times New Roman"/>
+          <w:lang w:eastAsia="en-ID"/>
+        </w:rPr>
+        <w:t>Alamat</w:t>
+      </w:r>
+      <w:r>
+        <w:rPr>
+          <w:rFonts w:ascii="Abadi" w:eastAsia="Times New Roman" w:hAnsi="Abadi" w:cs="Times New Roman"/>
+          <w:lang w:eastAsia="en-ID"/>
+        </w:rPr>
+        <w:tab/>
+      </w:r>
+      <w:r>
+        <w:rPr>
+          <w:rFonts w:ascii="Abadi" w:eastAsia="Times New Roman" w:hAnsi="Abadi" w:cs="Times New Roman"/>
+          <w:lang w:eastAsia="en-ID"/>
+        </w:rPr>
+        <w:tab/>
+      </w:r>
+      <w:r>
+        <w:rPr>
+          <w:rFonts w:ascii="Abadi" w:eastAsia="Times New Roman" w:hAnsi="Abadi" w:cs="Times New Roman"/>
+          <w:lang w:eastAsia="en-ID"/>
+        </w:rPr>
+        <w:tab/>
+        <w:t xml:space="preserve">: </w:t>
+      </w:r>
+      <w:r>
+        <w:rPr>
+          <w:rFonts w:ascii="Abadi" w:eastAsia="Times New Roman" w:hAnsi="Abadi" w:cs="Times New Roman"/>
+          <w:lang w:val="ms-MY" w:eastAsia="en-ID"/>
+        </w:rPr>
+        <w:t>{alamat}</w:t>
+      </w:r>
+    </w:p>
+    <w:p>
+      <w:pPr>
+        <w:spacing w:after="0" w:line="240" w:lineRule="auto"/>
+        <w:rPr>
+          <w:rFonts w:ascii="Abadi" w:eastAsia="Times New Roman" w:hAnsi="Abadi" w:cs="Times New Roman"/>
+          <w:lang w:eastAsia="en-ID"/>
+        </w:rPr>
+      </w:pPr>
+    </w:p>
+    <w:p>
+      <w:pPr>
+        <w:spacing w:after="0" w:line="360" w:lineRule="auto"/>
+        <w:rPr>
+          <w:rFonts w:ascii="Abadi" w:eastAsia="Times New Roman" w:hAnsi="Abadi" w:cs="Times New Roman"/>
+          <w:b/>
+          <w:bCs/>
+          <w:i/>
+          <w:iCs/>
+          <w:lang w:val="id-ID" w:eastAsia="en-ID"/>
+        </w:rPr>
+      </w:pPr>
+      <w:r>
+        <w:rPr>
+          <w:rFonts w:ascii="Abadi" w:eastAsia="Times New Roman" w:hAnsi="Abadi" w:cs="Times New Roman"/>
+          <w:b/>
+          <w:bCs/>
+          <w:i/>
+          <w:iCs/>
+          <w:lang w:eastAsia="en-ID"/>
+        </w:rPr>
+        <w:t xml:space="preserve">Nama </w:t>
+      </w:r>
+      <w:proofErr w:type="spellStart"/>
+      <w:r>
+        <w:rPr>
+          <w:rFonts w:ascii="Abadi" w:eastAsia="Times New Roman" w:hAnsi="Abadi" w:cs="Times New Roman"/>
+          <w:b/>
+          <w:bCs/>
+          <w:i/>
+          <w:iCs/>
+          <w:lang w:eastAsia="en-ID"/>
+        </w:rPr>
+        <w:t>Dalam</w:t>
+      </w:r>
+      <w:proofErr w:type="spellEnd"/>
+      <w:r>
+        <w:rPr>
+          <w:rFonts w:ascii="Abadi" w:eastAsia="Times New Roman" w:hAnsi="Abadi" w:cs="Times New Roman"/>
+          <w:b/>
+          <w:bCs/>
+          <w:i/>
+          <w:iCs/>
+          <w:lang w:eastAsia="en-ID"/>
+        </w:rPr>
+        <w:t xml:space="preserve"> </w:t>
+      </w:r>
+      <w:r>
+        <w:rPr>
+          <w:rFonts w:ascii="Abadi" w:eastAsia="Times New Roman" w:hAnsi="Abadi" w:cs="Times New Roman"/>
+          <w:b/>
+          <w:bCs/>
+          <w:i/>
+          <w:iCs/>
+          <w:lang w:val="id-ID" w:eastAsia="en-ID"/>
+        </w:rPr>
         <w:t>Kartu Tanda Penduduk (KTP)</w:t>
       </w:r>
     </w:p>
@@ -1525,16 +1497,25 @@
       <w:r>
         <w:rPr>
           <w:rFonts w:ascii="Abadi" w:eastAsia="Times New Roman" w:hAnsi="Abadi" w:cs="Times New Roman"/>
-          <w:lang w:val="id-ID" w:eastAsia="en-ID"/>
-        </w:rPr>
-        <w:t>IKBAL</w:t>
-      </w:r>
-      <w:r>
-        <w:rPr>
-          <w:rFonts w:ascii="Abadi" w:eastAsia="Times New Roman" w:hAnsi="Abadi" w:cs="Times New Roman"/>
-          <w:lang w:val="id-ID" w:eastAsia="en-ID"/>
-        </w:rPr>
-        <w:t xml:space="preserve"> RAMDAN</w:t>
+          <w:lang w:eastAsia="en-ID"/>
+        </w:rPr>
+        <w:t>{</w:t>
+      </w:r>
+      <w:proofErr w:type="spellStart"/>
+      <w:r>
+        <w:rPr>
+          <w:rFonts w:ascii="Abadi" w:eastAsia="Times New Roman" w:hAnsi="Abadi" w:cs="Times New Roman"/>
+          <w:lang w:eastAsia="en-ID"/>
+        </w:rPr>
+        <w:t>namaKtp</w:t>
+      </w:r>
+      <w:proofErr w:type="spellEnd"/>
+      <w:r>
+        <w:rPr>
+          <w:rFonts w:ascii="Abadi" w:eastAsia="Times New Roman" w:hAnsi="Abadi" w:cs="Times New Roman"/>
+          <w:lang w:eastAsia="en-ID"/>
+        </w:rPr>
+        <w:t>}</w:t>
       </w:r>
     </w:p>
     <w:p>
@@ -1572,7 +1553,14 @@
           <w:lang w:val="id-ID" w:eastAsia="en-ID"/>
         </w:rPr>
         <w:tab/>
-        <w:t>: 32030630129860009</w:t>
+        <w:t xml:space="preserve">: </w:t>
+      </w:r>
+      <w:r>
+        <w:rPr>
+          <w:rFonts w:ascii="Abadi" w:eastAsia="Times New Roman" w:hAnsi="Abadi" w:cs="Times New Roman"/>
+          <w:lang w:val="ms-MY" w:eastAsia="en-ID"/>
+        </w:rPr>
+        <w:t>{nik}</w:t>
       </w:r>
     </w:p>
     <w:p>
@@ -1596,7 +1584,46 @@
           <w:lang w:val="id-ID" w:eastAsia="en-ID"/>
         </w:rPr>
         <w:tab/>
-        <w:t>: Cianjur, 27/09/1996</w:t>
+        <w:t xml:space="preserve">: </w:t>
+      </w:r>
+      <w:r>
+        <w:rPr>
+          <w:rFonts w:ascii="Abadi" w:eastAsia="Times New Roman" w:hAnsi="Abadi" w:cs="Times New Roman"/>
+          <w:lang w:eastAsia="en-ID"/>
+        </w:rPr>
+        <w:t>{</w:t>
+      </w:r>
+      <w:proofErr w:type="spellStart"/>
+      <w:r>
+        <w:rPr>
+          <w:rFonts w:ascii="Abadi" w:eastAsia="Times New Roman" w:hAnsi="Abadi" w:cs="Times New Roman"/>
+          <w:lang w:eastAsia="en-ID"/>
+        </w:rPr>
+        <w:t>tempatLahirKk</w:t>
+      </w:r>
+      <w:proofErr w:type="spellEnd"/>
+      <w:r>
+        <w:rPr>
+          <w:rFonts w:ascii="Abadi" w:eastAsia="Times New Roman" w:hAnsi="Abadi" w:cs="Times New Roman"/>
+          <w:lang w:eastAsia="en-ID"/>
+        </w:rPr>
+        <w:t>}, {</w:t>
+      </w:r>
+      <w:proofErr w:type="spellStart"/>
+      <w:r>
+        <w:rPr>
+          <w:rFonts w:ascii="Abadi" w:eastAsia="Times New Roman" w:hAnsi="Abadi" w:cs="Times New Roman"/>
+          <w:lang w:eastAsia="en-ID"/>
+        </w:rPr>
+        <w:t>tanggalLahirKk</w:t>
+      </w:r>
+      <w:proofErr w:type="spellEnd"/>
+      <w:r>
+        <w:rPr>
+          <w:rFonts w:ascii="Abadi" w:eastAsia="Times New Roman" w:hAnsi="Abadi" w:cs="Times New Roman"/>
+          <w:lang w:eastAsia="en-ID"/>
+        </w:rPr>
+        <w:t>}</w:t>
       </w:r>
     </w:p>
     <w:p>
@@ -1627,7 +1654,14 @@
           <w:lang w:val="id-ID" w:eastAsia="en-ID"/>
         </w:rPr>
         <w:tab/>
-        <w:t>: Laki-Laki</w:t>
+        <w:t xml:space="preserve">: </w:t>
+      </w:r>
+      <w:r>
+        <w:rPr>
+          <w:rFonts w:ascii="Abadi" w:eastAsia="Times New Roman" w:hAnsi="Abadi" w:cs="Times New Roman"/>
+          <w:lang w:val="ms-MY" w:eastAsia="en-ID"/>
+        </w:rPr>
+        <w:t>{jenisKelamin}</w:t>
       </w:r>
     </w:p>
     <w:p>
@@ -1665,7 +1699,14 @@
           <w:lang w:val="id-ID" w:eastAsia="en-ID"/>
         </w:rPr>
         <w:tab/>
-        <w:t>: Belum Kawin</w:t>
+        <w:t xml:space="preserve">: </w:t>
+      </w:r>
+      <w:r>
+        <w:rPr>
+          <w:rFonts w:ascii="Abadi" w:eastAsia="Times New Roman" w:hAnsi="Abadi" w:cs="Times New Roman"/>
+          <w:lang w:val="ms-MY" w:eastAsia="en-ID"/>
+        </w:rPr>
+        <w:t>{statusPerkawinan}</w:t>
       </w:r>
     </w:p>
     <w:p>
@@ -1703,7 +1744,21 @@
           <w:lang w:val="id-ID" w:eastAsia="en-ID"/>
         </w:rPr>
         <w:tab/>
-        <w:t>: Islam</w:t>
+        <w:t xml:space="preserve">: </w:t>
+      </w:r>
+      <w:r>
+        <w:rPr>
+          <w:rFonts w:ascii="Abadi" w:eastAsia="Times New Roman" w:hAnsi="Abadi" w:cs="Times New Roman"/>
+          <w:lang w:val="ms-MY" w:eastAsia="en-ID"/>
+        </w:rPr>
+        <w:t>{agama}</w:t>
+      </w:r>
+      <w:r>
+        <w:rPr>
+          <w:rFonts w:ascii="Abadi" w:eastAsia="Times New Roman" w:hAnsi="Abadi" w:cs="Times New Roman"/>
+          <w:lang w:val="id-ID" w:eastAsia="en-ID"/>
+        </w:rPr>
+        <w:tab/>
       </w:r>
     </w:p>
     <w:p>
@@ -1734,7 +1789,14 @@
           <w:lang w:val="id-ID" w:eastAsia="en-ID"/>
         </w:rPr>
         <w:tab/>
-        <w:t>: Belum Bekerja</w:t>
+        <w:t xml:space="preserve">: </w:t>
+      </w:r>
+      <w:r>
+        <w:rPr>
+          <w:rFonts w:ascii="Abadi" w:eastAsia="Times New Roman" w:hAnsi="Abadi" w:cs="Times New Roman"/>
+          <w:lang w:val="id-ID" w:eastAsia="en-ID"/>
+        </w:rPr>
+        <w:t>{pekerjaan}</w:t>
       </w:r>
     </w:p>
     <w:p>
@@ -1774,125 +1836,12 @@
         <w:tab/>
         <w:t xml:space="preserve">: </w:t>
       </w:r>
-      <w:proofErr w:type="spellStart"/>
-      <w:r>
-        <w:rPr>
-          <w:rFonts w:ascii="Abadi" w:eastAsia="Times New Roman" w:hAnsi="Abadi" w:cs="Times New Roman"/>
-          <w:lang w:eastAsia="en-ID"/>
-        </w:rPr>
-        <w:t>Kp</w:t>
-      </w:r>
-      <w:proofErr w:type="spellEnd"/>
-      <w:r>
-        <w:rPr>
-          <w:rFonts w:ascii="Abadi" w:eastAsia="Times New Roman" w:hAnsi="Abadi" w:cs="Times New Roman"/>
-          <w:lang w:eastAsia="en-ID"/>
-        </w:rPr>
-        <w:t xml:space="preserve">. </w:t>
-      </w:r>
-      <w:r>
-        <w:rPr>
-          <w:rFonts w:ascii="Abadi" w:eastAsia="Times New Roman" w:hAnsi="Abadi" w:cs="Times New Roman"/>
-          <w:lang w:val="id-ID" w:eastAsia="en-ID"/>
-        </w:rPr>
-        <w:t>Tegalpanjang</w:t>
-      </w:r>
-      <w:r>
-        <w:rPr>
-          <w:rFonts w:ascii="Abadi" w:eastAsia="Times New Roman" w:hAnsi="Abadi" w:cs="Times New Roman"/>
-          <w:lang w:val="en-US" w:eastAsia="en-ID"/>
-        </w:rPr>
-        <w:t xml:space="preserve"> </w:t>
-      </w:r>
-      <w:r>
-        <w:rPr>
-          <w:rFonts w:ascii="Abadi" w:eastAsia="Times New Roman" w:hAnsi="Abadi" w:cs="Times New Roman"/>
-          <w:lang w:eastAsia="en-ID"/>
-        </w:rPr>
-        <w:t>Rt. 00</w:t>
-      </w:r>
-      <w:r>
-        <w:rPr>
-          <w:rFonts w:ascii="Abadi" w:eastAsia="Times New Roman" w:hAnsi="Abadi" w:cs="Times New Roman"/>
-          <w:lang w:val="id-ID" w:eastAsia="en-ID"/>
-        </w:rPr>
-        <w:t>3</w:t>
-      </w:r>
-      <w:r>
-        <w:rPr>
-          <w:rFonts w:ascii="Abadi" w:eastAsia="Times New Roman" w:hAnsi="Abadi" w:cs="Times New Roman"/>
-          <w:lang w:eastAsia="en-ID"/>
-        </w:rPr>
-        <w:t xml:space="preserve"> </w:t>
-      </w:r>
-      <w:proofErr w:type="spellStart"/>
-      <w:r>
-        <w:rPr>
-          <w:rFonts w:ascii="Abadi" w:eastAsia="Times New Roman" w:hAnsi="Abadi" w:cs="Times New Roman"/>
-          <w:lang w:eastAsia="en-ID"/>
-        </w:rPr>
-        <w:t>Rw</w:t>
-      </w:r>
-      <w:proofErr w:type="spellEnd"/>
-      <w:r>
-        <w:rPr>
-          <w:rFonts w:ascii="Abadi" w:eastAsia="Times New Roman" w:hAnsi="Abadi" w:cs="Times New Roman"/>
-          <w:lang w:eastAsia="en-ID"/>
-        </w:rPr>
-        <w:t>. 00</w:t>
-      </w:r>
-      <w:r>
-        <w:rPr>
-          <w:rFonts w:ascii="Abadi" w:eastAsia="Times New Roman" w:hAnsi="Abadi" w:cs="Times New Roman"/>
-          <w:lang w:val="id-ID" w:eastAsia="en-ID"/>
-        </w:rPr>
-        <w:t>4</w:t>
-      </w:r>
-      <w:r>
-        <w:rPr>
-          <w:rFonts w:ascii="Abadi" w:eastAsia="Times New Roman" w:hAnsi="Abadi" w:cs="Times New Roman"/>
-          <w:lang w:val="en-US" w:eastAsia="en-ID"/>
-        </w:rPr>
-        <w:t xml:space="preserve"> </w:t>
-      </w:r>
-      <w:proofErr w:type="spellStart"/>
-      <w:r>
-        <w:rPr>
-          <w:rFonts w:ascii="Abadi" w:eastAsia="Times New Roman" w:hAnsi="Abadi" w:cs="Times New Roman"/>
-          <w:lang w:eastAsia="en-ID"/>
-        </w:rPr>
-        <w:t>Desa</w:t>
-      </w:r>
-      <w:proofErr w:type="spellEnd"/>
-      <w:r>
-        <w:rPr>
-          <w:rFonts w:ascii="Abadi" w:eastAsia="Times New Roman" w:hAnsi="Abadi" w:cs="Times New Roman"/>
-          <w:lang w:val="en-US" w:eastAsia="en-ID"/>
-        </w:rPr>
-        <w:t xml:space="preserve"> </w:t>
-      </w:r>
-      <w:r>
-        <w:rPr>
-          <w:rFonts w:ascii="Abadi" w:eastAsia="Times New Roman" w:hAnsi="Abadi" w:cs="Times New Roman"/>
-          <w:lang w:val="id-ID" w:eastAsia="en-ID"/>
-        </w:rPr>
-        <w:t xml:space="preserve">Sukarama Kecamatan </w:t>
-      </w:r>
-    </w:p>
-    <w:p>
-      <w:pPr>
-        <w:spacing w:after="0" w:line="240" w:lineRule="auto"/>
-        <w:rPr>
-          <w:rFonts w:ascii="Abadi" w:eastAsia="Times New Roman" w:hAnsi="Abadi" w:cs="Times New Roman"/>
-          <w:lang w:val="id-ID" w:eastAsia="en-ID"/>
-        </w:rPr>
-      </w:pPr>
-      <w:r>
-        <w:rPr>
-          <w:rFonts w:ascii="Abadi" w:eastAsia="Times New Roman" w:hAnsi="Abadi" w:cs="Times New Roman"/>
-          <w:lang w:val="id-ID" w:eastAsia="en-ID"/>
-        </w:rPr>
-        <w:t xml:space="preserve">                                   Bojongpicung Kabupaten</w:t>
+      <w:r>
+        <w:rPr>
+          <w:rFonts w:ascii="Abadi" w:eastAsia="Times New Roman" w:hAnsi="Abadi" w:cs="Times New Roman"/>
+          <w:lang w:val="ms-MY" w:eastAsia="en-ID"/>
+        </w:rPr>
+        <w:t>{alamat}</w:t>
       </w:r>
     </w:p>
     <w:p>
@@ -1992,39 +1941,7 @@
           <w:rFonts w:ascii="Abadi" w:eastAsia="Times New Roman" w:hAnsi="Abadi" w:cs="Times New Roman"/>
           <w:lang w:eastAsia="en-ID"/>
         </w:rPr>
-        <w:t xml:space="preserve"> </w:t>
-      </w:r>
-      <w:proofErr w:type="spellStart"/>
-      <w:r>
-        <w:rPr>
-          <w:rFonts w:ascii="Abadi" w:eastAsia="Times New Roman" w:hAnsi="Abadi" w:cs="Times New Roman"/>
-          <w:lang w:eastAsia="en-ID"/>
-        </w:rPr>
-        <w:t>Betul</w:t>
-      </w:r>
-      <w:proofErr w:type="spellEnd"/>
-      <w:r>
-        <w:rPr>
-          <w:rFonts w:ascii="Abadi" w:eastAsia="Times New Roman" w:hAnsi="Abadi" w:cs="Times New Roman"/>
-          <w:lang w:eastAsia="en-ID"/>
-        </w:rPr>
-        <w:t xml:space="preserve"> </w:t>
-      </w:r>
-      <w:proofErr w:type="spellStart"/>
-      <w:r>
-        <w:rPr>
-          <w:rFonts w:ascii="Abadi" w:eastAsia="Times New Roman" w:hAnsi="Abadi" w:cs="Times New Roman"/>
-          <w:lang w:eastAsia="en-ID"/>
-        </w:rPr>
-        <w:t>Warga</w:t>
-      </w:r>
-      <w:proofErr w:type="spellEnd"/>
-      <w:r>
-        <w:rPr>
-          <w:rFonts w:ascii="Abadi" w:eastAsia="Times New Roman" w:hAnsi="Abadi" w:cs="Times New Roman"/>
-          <w:lang w:eastAsia="en-ID"/>
-        </w:rPr>
-        <w:t xml:space="preserve"> Masyarakat </w:t>
+        <w:t xml:space="preserve"> Betul Warga Masyarakat </w:t>
       </w:r>
       <w:r>
         <w:rPr>
@@ -2079,15 +1996,38 @@
           <w:rFonts w:ascii="Abadi" w:eastAsia="Times New Roman" w:hAnsi="Abadi" w:cs="Times New Roman"/>
           <w:lang w:eastAsia="en-ID"/>
         </w:rPr>
-        <w:t xml:space="preserve">di </w:t>
-      </w:r>
-      <w:proofErr w:type="spellStart"/>
-      <w:r>
-        <w:rPr>
-          <w:rFonts w:ascii="Abadi" w:eastAsia="Times New Roman" w:hAnsi="Abadi" w:cs="Times New Roman"/>
-          <w:lang w:eastAsia="en-ID"/>
-        </w:rPr>
-        <w:t>Desa</w:t>
+        <w:t xml:space="preserve">di Desa </w:t>
+      </w:r>
+      <w:proofErr w:type="spellStart"/>
+      <w:r>
+        <w:rPr>
+          <w:rFonts w:ascii="Abadi" w:eastAsia="Times New Roman" w:hAnsi="Abadi" w:cs="Times New Roman"/>
+          <w:lang w:eastAsia="en-ID"/>
+        </w:rPr>
+        <w:t>Sukarama</w:t>
+      </w:r>
+      <w:proofErr w:type="spellEnd"/>
+      <w:r>
+        <w:rPr>
+          <w:rFonts w:ascii="Abadi" w:eastAsia="Times New Roman" w:hAnsi="Abadi" w:cs="Times New Roman"/>
+          <w:lang w:eastAsia="en-ID"/>
+        </w:rPr>
+        <w:t xml:space="preserve">, </w:t>
+      </w:r>
+      <w:proofErr w:type="spellStart"/>
+      <w:r>
+        <w:rPr>
+          <w:rFonts w:ascii="Abadi" w:eastAsia="Times New Roman" w:hAnsi="Abadi" w:cs="Times New Roman"/>
+          <w:lang w:eastAsia="en-ID"/>
+        </w:rPr>
+        <w:t>K</w:t>
+      </w:r>
+      <w:r>
+        <w:rPr>
+          <w:rFonts w:ascii="Abadi" w:eastAsia="Times New Roman" w:hAnsi="Abadi" w:cs="Times New Roman"/>
+          <w:lang w:eastAsia="en-ID"/>
+        </w:rPr>
+        <w:t>ecamatan</w:t>
       </w:r>
       <w:proofErr w:type="spellEnd"/>
       <w:r>
@@ -2103,30 +2043,7 @@
           <w:rFonts w:ascii="Abadi" w:eastAsia="Times New Roman" w:hAnsi="Abadi" w:cs="Times New Roman"/>
           <w:lang w:eastAsia="en-ID"/>
         </w:rPr>
-        <w:t>Sukarama</w:t>
-      </w:r>
-      <w:proofErr w:type="spellEnd"/>
-      <w:r>
-        <w:rPr>
-          <w:rFonts w:ascii="Abadi" w:eastAsia="Times New Roman" w:hAnsi="Abadi" w:cs="Times New Roman"/>
-          <w:lang w:eastAsia="en-ID"/>
-        </w:rPr>
-        <w:t xml:space="preserve">, </w:t>
-      </w:r>
-      <w:proofErr w:type="spellStart"/>
-      <w:r>
-        <w:rPr>
-          <w:rFonts w:ascii="Abadi" w:eastAsia="Times New Roman" w:hAnsi="Abadi" w:cs="Times New Roman"/>
-          <w:lang w:eastAsia="en-ID"/>
-        </w:rPr>
-        <w:t>K</w:t>
-      </w:r>
-      <w:r>
-        <w:rPr>
-          <w:rFonts w:ascii="Abadi" w:eastAsia="Times New Roman" w:hAnsi="Abadi" w:cs="Times New Roman"/>
-          <w:lang w:eastAsia="en-ID"/>
-        </w:rPr>
-        <w:t>ecamatan</w:t>
+        <w:t>Bojongpicung</w:t>
       </w:r>
       <w:proofErr w:type="spellEnd"/>
       <w:r>
@@ -2142,9 +2059,16 @@
           <w:rFonts w:ascii="Abadi" w:eastAsia="Times New Roman" w:hAnsi="Abadi" w:cs="Times New Roman"/>
           <w:lang w:eastAsia="en-ID"/>
         </w:rPr>
-        <w:t>Bojongpicung</w:t>
-      </w:r>
-      <w:proofErr w:type="spellEnd"/>
+        <w:t>Kab</w:t>
+      </w:r>
+      <w:proofErr w:type="spellEnd"/>
+      <w:r>
+        <w:rPr>
+          <w:rFonts w:ascii="Abadi" w:eastAsia="Times New Roman" w:hAnsi="Abadi" w:cs="Times New Roman"/>
+          <w:lang w:eastAsia="en-ID"/>
+        </w:rPr>
+        <w:t>.</w:t>
+      </w:r>
       <w:r>
         <w:rPr>
           <w:rFonts w:ascii="Abadi" w:eastAsia="Times New Roman" w:hAnsi="Abadi" w:cs="Times New Roman"/>
@@ -2158,16 +2082,9 @@
           <w:rFonts w:ascii="Abadi" w:eastAsia="Times New Roman" w:hAnsi="Abadi" w:cs="Times New Roman"/>
           <w:lang w:eastAsia="en-ID"/>
         </w:rPr>
-        <w:t>Kab</w:t>
-      </w:r>
-      <w:proofErr w:type="spellEnd"/>
-      <w:r>
-        <w:rPr>
-          <w:rFonts w:ascii="Abadi" w:eastAsia="Times New Roman" w:hAnsi="Abadi" w:cs="Times New Roman"/>
-          <w:lang w:eastAsia="en-ID"/>
-        </w:rPr>
-        <w:t>.</w:t>
-      </w:r>
+        <w:t>Cianjur</w:t>
+      </w:r>
+      <w:proofErr w:type="spellEnd"/>
       <w:r>
         <w:rPr>
           <w:rFonts w:ascii="Abadi" w:eastAsia="Times New Roman" w:hAnsi="Abadi" w:cs="Times New Roman"/>
@@ -2181,7 +2098,7 @@
           <w:rFonts w:ascii="Abadi" w:eastAsia="Times New Roman" w:hAnsi="Abadi" w:cs="Times New Roman"/>
           <w:lang w:eastAsia="en-ID"/>
         </w:rPr>
-        <w:t>Cianjur</w:t>
+        <w:t>ada</w:t>
       </w:r>
       <w:proofErr w:type="spellEnd"/>
       <w:r>
@@ -2197,7 +2114,14 @@
           <w:rFonts w:ascii="Abadi" w:eastAsia="Times New Roman" w:hAnsi="Abadi" w:cs="Times New Roman"/>
           <w:lang w:eastAsia="en-ID"/>
         </w:rPr>
-        <w:t>ada</w:t>
+        <w:t>P</w:t>
+      </w:r>
+      <w:r>
+        <w:rPr>
+          <w:rFonts w:ascii="Abadi" w:eastAsia="Times New Roman" w:hAnsi="Abadi" w:cs="Times New Roman"/>
+          <w:lang w:eastAsia="en-ID"/>
+        </w:rPr>
+        <w:t>erbedaan</w:t>
       </w:r>
       <w:proofErr w:type="spellEnd"/>
       <w:r>
@@ -2210,80 +2134,41 @@
       <w:r>
         <w:rPr>
           <w:rFonts w:ascii="Abadi" w:eastAsia="Times New Roman" w:hAnsi="Abadi" w:cs="Times New Roman"/>
-          <w:lang w:val="ms-ID" w:eastAsia="en-ID"/>
-        </w:rPr>
-        <w:t>P</w:t>
-      </w:r>
-      <w:proofErr w:type="spellStart"/>
-      <w:r>
-        <w:rPr>
-          <w:rFonts w:ascii="Abadi" w:eastAsia="Times New Roman" w:hAnsi="Abadi" w:cs="Times New Roman"/>
-          <w:lang w:eastAsia="en-ID"/>
-        </w:rPr>
-        <w:t>erbedaan</w:t>
-      </w:r>
-      <w:proofErr w:type="spellEnd"/>
-      <w:r>
-        <w:rPr>
-          <w:rFonts w:ascii="Abadi" w:eastAsia="Times New Roman" w:hAnsi="Abadi" w:cs="Times New Roman"/>
-          <w:lang w:eastAsia="en-ID"/>
+          <w:lang w:val="en-US" w:eastAsia="en-ID"/>
+        </w:rPr>
+        <w:t xml:space="preserve">Nama yang </w:t>
+      </w:r>
+      <w:proofErr w:type="spellStart"/>
+      <w:r>
+        <w:rPr>
+          <w:rFonts w:ascii="Abadi" w:eastAsia="Times New Roman" w:hAnsi="Abadi" w:cs="Times New Roman"/>
+          <w:lang w:val="en-US" w:eastAsia="en-ID"/>
+        </w:rPr>
+        <w:t>tercantum</w:t>
+      </w:r>
+      <w:proofErr w:type="spellEnd"/>
+      <w:r>
+        <w:rPr>
+          <w:rFonts w:ascii="Abadi" w:eastAsia="Times New Roman" w:hAnsi="Abadi" w:cs="Times New Roman"/>
+          <w:lang w:val="en-US" w:eastAsia="en-ID"/>
         </w:rPr>
         <w:t xml:space="preserve"> </w:t>
       </w:r>
+      <w:proofErr w:type="spellStart"/>
       <w:r>
         <w:rPr>
           <w:rFonts w:ascii="Abadi" w:eastAsia="Times New Roman" w:hAnsi="Abadi" w:cs="Times New Roman"/>
           <w:lang w:val="en-US" w:eastAsia="en-ID"/>
         </w:rPr>
-        <w:t xml:space="preserve">Nama yang </w:t>
-      </w:r>
-      <w:proofErr w:type="spellStart"/>
+        <w:t>dalam</w:t>
+      </w:r>
+      <w:proofErr w:type="spellEnd"/>
       <w:r>
         <w:rPr>
           <w:rFonts w:ascii="Abadi" w:eastAsia="Times New Roman" w:hAnsi="Abadi" w:cs="Times New Roman"/>
           <w:lang w:val="en-US" w:eastAsia="en-ID"/>
         </w:rPr>
-        <w:t>tercantum</w:t>
-      </w:r>
-      <w:proofErr w:type="spellEnd"/>
-      <w:r>
-        <w:rPr>
-          <w:rFonts w:ascii="Abadi" w:eastAsia="Times New Roman" w:hAnsi="Abadi" w:cs="Times New Roman"/>
-          <w:lang w:val="en-US" w:eastAsia="en-ID"/>
-        </w:rPr>
-        <w:t xml:space="preserve"> </w:t>
-      </w:r>
-      <w:proofErr w:type="spellStart"/>
-      <w:r>
-        <w:rPr>
-          <w:rFonts w:ascii="Abadi" w:eastAsia="Times New Roman" w:hAnsi="Abadi" w:cs="Times New Roman"/>
-          <w:lang w:val="en-US" w:eastAsia="en-ID"/>
-        </w:rPr>
-        <w:t>dalam</w:t>
-      </w:r>
-      <w:proofErr w:type="spellEnd"/>
-      <w:r>
-        <w:rPr>
-          <w:rFonts w:ascii="Abadi" w:eastAsia="Times New Roman" w:hAnsi="Abadi" w:cs="Times New Roman"/>
-          <w:lang w:val="en-US" w:eastAsia="en-ID"/>
-        </w:rPr>
-        <w:t xml:space="preserve"> </w:t>
-      </w:r>
-      <w:proofErr w:type="spellStart"/>
-      <w:r>
-        <w:rPr>
-          <w:rFonts w:ascii="Abadi" w:eastAsia="Times New Roman" w:hAnsi="Abadi" w:cs="Times New Roman"/>
-          <w:lang w:val="en-US" w:eastAsia="en-ID"/>
-        </w:rPr>
-        <w:t>Kartu</w:t>
-      </w:r>
-      <w:proofErr w:type="spellEnd"/>
-      <w:r>
-        <w:rPr>
-          <w:rFonts w:ascii="Abadi" w:eastAsia="Times New Roman" w:hAnsi="Abadi" w:cs="Times New Roman"/>
-          <w:lang w:val="en-US" w:eastAsia="en-ID"/>
-        </w:rPr>
-        <w:t xml:space="preserve"> </w:t>
+        <w:t xml:space="preserve"> Kartu </w:t>
       </w:r>
       <w:proofErr w:type="spellStart"/>
       <w:r>
@@ -2915,6 +2800,73 @@
       </w:pPr>
       <w:r>
         <w:rPr>
+          <w:noProof/>
+        </w:rPr>
+        <w:drawing>
+          <wp:anchor distT="0" distB="0" distL="114300" distR="114300" simplePos="0" relativeHeight="251662336" behindDoc="0" locked="0" layoutInCell="1" allowOverlap="1" wp14:anchorId="6AE23ED2" wp14:editId="40F6B76C">
+            <wp:simplePos x="0" y="0"/>
+            <wp:positionH relativeFrom="column">
+              <wp:posOffset>3954780</wp:posOffset>
+            </wp:positionH>
+            <wp:positionV relativeFrom="page">
+              <wp:posOffset>9017635</wp:posOffset>
+            </wp:positionV>
+            <wp:extent cx="1409700" cy="1126490"/>
+            <wp:effectExtent l="0" t="0" r="0" b="0"/>
+            <wp:wrapSquare wrapText="bothSides"/>
+            <wp:docPr id="914197501" name="Picture 4"/>
+            <wp:cNvGraphicFramePr>
+              <a:graphicFrameLocks xmlns:a="http://schemas.openxmlformats.org/drawingml/2006/main" noChangeAspect="1"/>
+            </wp:cNvGraphicFramePr>
+            <a:graphic xmlns:a="http://schemas.openxmlformats.org/drawingml/2006/main">
+              <a:graphicData uri="http://schemas.openxmlformats.org/drawingml/2006/picture">
+                <pic:pic xmlns:pic="http://schemas.openxmlformats.org/drawingml/2006/picture">
+                  <pic:nvPicPr>
+                    <pic:cNvPr id="0" name="Picture 6"/>
+                    <pic:cNvPicPr>
+                      <a:picLocks noChangeAspect="1" noChangeArrowheads="1"/>
+                    </pic:cNvPicPr>
+                  </pic:nvPicPr>
+                  <pic:blipFill>
+                    <a:blip r:embed="rId7" cstate="print">
+                      <a:extLst>
+                        <a:ext uri="{28A0092B-C50C-407E-A947-70E740481C1C}">
+                          <a14:useLocalDpi xmlns:a14="http://schemas.microsoft.com/office/drawing/2010/main" val="0"/>
+                        </a:ext>
+                      </a:extLst>
+                    </a:blip>
+                    <a:srcRect/>
+                    <a:stretch>
+                      <a:fillRect/>
+                    </a:stretch>
+                  </pic:blipFill>
+                  <pic:spPr bwMode="auto">
+                    <a:xfrm>
+                      <a:off x="0" y="0"/>
+                      <a:ext cx="1409700" cy="1126490"/>
+                    </a:xfrm>
+                    <a:prstGeom prst="rect">
+                      <a:avLst/>
+                    </a:prstGeom>
+                    <a:noFill/>
+                    <a:ln>
+                      <a:noFill/>
+                    </a:ln>
+                  </pic:spPr>
+                </pic:pic>
+              </a:graphicData>
+            </a:graphic>
+            <wp14:sizeRelH relativeFrom="margin">
+              <wp14:pctWidth>0</wp14:pctWidth>
+            </wp14:sizeRelH>
+            <wp14:sizeRelV relativeFrom="margin">
+              <wp14:pctHeight>0</wp14:pctHeight>
+            </wp14:sizeRelV>
+          </wp:anchor>
+        </w:drawing>
+      </w:r>
+      <w:r>
+        <w:rPr>
           <w:rFonts w:ascii="Abadi" w:eastAsia="Times New Roman" w:hAnsi="Abadi" w:cs="Times New Roman"/>
           <w:sz w:val="24"/>
           <w:szCs w:val="24"/>
@@ -2936,7 +2888,129 @@
     </w:p>
     <w:p>
       <w:pPr>
-        <w:spacing w:after="0" w:line="240" w:lineRule="auto"/>
+        <w:tabs>
+          <w:tab w:val="left" w:pos="6804"/>
+          <w:tab w:val="left" w:pos="7020"/>
+        </w:tabs>
+        <w:spacing w:after="0" w:line="240" w:lineRule="auto"/>
+        <w:ind w:right="-1084"/>
+        <w:rPr>
+          <w:rFonts w:ascii="Abadi" w:eastAsia="Times New Roman" w:hAnsi="Abadi" w:cs="Times New Roman"/>
+          <w:sz w:val="24"/>
+          <w:szCs w:val="24"/>
+          <w:lang w:eastAsia="en-ID"/>
+        </w:rPr>
+      </w:pPr>
+      <w:r>
+        <w:rPr>
+          <w:rFonts w:ascii="Abadi" w:eastAsia="Times New Roman" w:hAnsi="Abadi" w:cs="Times New Roman"/>
+          <w:sz w:val="24"/>
+          <w:szCs w:val="24"/>
+          <w:lang w:eastAsia="en-ID"/>
+        </w:rPr>
+        <w:tab/>
+      </w:r>
+      <w:r>
+        <w:rPr>
+          <w:rFonts w:ascii="Abadi" w:eastAsia="Times New Roman" w:hAnsi="Abadi" w:cs="Times New Roman"/>
+          <w:sz w:val="24"/>
+          <w:szCs w:val="24"/>
+          <w:lang w:eastAsia="en-ID"/>
+        </w:rPr>
+        <w:tab/>
+      </w:r>
+    </w:p>
+    <w:p>
+      <w:pPr>
+        <w:tabs>
+          <w:tab w:val="left" w:pos="7020"/>
+        </w:tabs>
+        <w:spacing w:after="0" w:line="240" w:lineRule="auto"/>
+        <w:ind w:right="-1084"/>
+        <w:rPr>
+          <w:rFonts w:ascii="Abadi" w:eastAsia="Times New Roman" w:hAnsi="Abadi" w:cs="Times New Roman"/>
+          <w:sz w:val="24"/>
+          <w:szCs w:val="24"/>
+          <w:lang w:eastAsia="en-ID"/>
+        </w:rPr>
+      </w:pPr>
+    </w:p>
+    <w:p>
+      <w:pPr>
+        <w:tabs>
+          <w:tab w:val="left" w:pos="7464"/>
+        </w:tabs>
+        <w:spacing w:after="0" w:line="240" w:lineRule="auto"/>
+        <w:ind w:right="-1084"/>
+        <w:rPr>
+          <w:rFonts w:ascii="Abadi" w:eastAsia="Times New Roman" w:hAnsi="Abadi" w:cs="Times New Roman"/>
+          <w:sz w:val="24"/>
+          <w:szCs w:val="24"/>
+          <w:lang w:eastAsia="en-ID"/>
+        </w:rPr>
+      </w:pPr>
+      <w:r>
+        <w:rPr>
+          <w:rFonts w:ascii="Abadi" w:eastAsia="Times New Roman" w:hAnsi="Abadi" w:cs="Times New Roman"/>
+          <w:sz w:val="24"/>
+          <w:szCs w:val="24"/>
+          <w:lang w:eastAsia="en-ID"/>
+        </w:rPr>
+        <w:tab/>
+      </w:r>
+    </w:p>
+    <w:p>
+      <w:pPr>
+        <w:tabs>
+          <w:tab w:val="left" w:pos="7464"/>
+        </w:tabs>
+        <w:spacing w:after="0" w:line="240" w:lineRule="auto"/>
+        <w:ind w:right="-1084"/>
+        <w:rPr>
+          <w:rFonts w:ascii="Abadi" w:eastAsia="Times New Roman" w:hAnsi="Abadi" w:cs="Times New Roman"/>
+          <w:sz w:val="24"/>
+          <w:szCs w:val="24"/>
+          <w:lang w:eastAsia="en-ID"/>
+        </w:rPr>
+      </w:pPr>
+    </w:p>
+    <w:p>
+      <w:pPr>
+        <w:tabs>
+          <w:tab w:val="left" w:pos="7464"/>
+        </w:tabs>
+        <w:spacing w:after="0" w:line="240" w:lineRule="auto"/>
+        <w:ind w:right="-1084"/>
+        <w:rPr>
+          <w:rFonts w:ascii="Abadi" w:eastAsia="Times New Roman" w:hAnsi="Abadi" w:cs="Times New Roman"/>
+          <w:sz w:val="24"/>
+          <w:szCs w:val="24"/>
+          <w:lang w:eastAsia="en-ID"/>
+        </w:rPr>
+      </w:pPr>
+    </w:p>
+    <w:p>
+      <w:pPr>
+        <w:tabs>
+          <w:tab w:val="left" w:pos="7020"/>
+        </w:tabs>
+        <w:spacing w:after="0" w:line="240" w:lineRule="auto"/>
+        <w:ind w:right="-1084"/>
+        <w:rPr>
+          <w:rFonts w:ascii="Abadi" w:eastAsia="Times New Roman" w:hAnsi="Abadi" w:cs="Times New Roman"/>
+          <w:sz w:val="24"/>
+          <w:szCs w:val="24"/>
+          <w:lang w:eastAsia="en-ID"/>
+        </w:rPr>
+      </w:pPr>
+    </w:p>
+    <w:p>
+      <w:pPr>
+        <w:tabs>
+          <w:tab w:val="left" w:pos="7020"/>
+        </w:tabs>
+        <w:spacing w:after="0" w:line="240" w:lineRule="auto"/>
+        <w:ind w:right="-1084"/>
         <w:rPr>
           <w:rFonts w:ascii="Abadi" w:eastAsia="Times New Roman" w:hAnsi="Abadi" w:cs="Times New Roman"/>
           <w:sz w:val="24"/>
@@ -3216,6 +3290,7 @@
         <w:rPr>
           <w:rFonts w:ascii="Abadi" w:hAnsi="Abadi"/>
         </w:rPr>
+        <w:lastRenderedPageBreak/>
         <w:t xml:space="preserve">                 </w:t>
       </w:r>
     </w:p>
@@ -3230,7 +3305,7 @@
 </file>
 
 <file path=word/numbering.xml><?xml version="1.0" encoding="utf-8"?>
-<w:numbering xmlns:wpc="http://schemas.microsoft.com/office/word/2010/wordprocessingCanvas" xmlns:cx="http://schemas.microsoft.com/office/drawing/2014/chartex" xmlns:cx1="http://schemas.microsoft.com/office/drawing/2015/9/8/chartex" xmlns:cx2="http://schemas.microsoft.com/office/drawing/2015/10/21/chartex" xmlns:cx3="http://schemas.microsoft.com/office/drawing/2016/5/9/chartex" xmlns:cx4="http://schemas.microsoft.com/office/drawing/2016/5/10/chartex" xmlns:cx5="http://schemas.microsoft.com/office/drawing/2016/5/11/chartex" xmlns:cx6="http://schemas.microsoft.com/office/drawing/2016/5/12/chartex" xmlns:cx7="http://schemas.microsoft.com/office/drawing/2016/5/13/chartex" xmlns:cx8="http://schemas.microsoft.com/office/drawing/2016/5/14/chartex" xmlns:mc="http://schemas.openxmlformats.org/markup-compatibility/2006" xmlns:aink="http://schemas.microsoft.com/office/drawing/2016/ink" xmlns:am3d="http://schemas.microsoft.com/office/drawing/2017/model3d" xmlns:o="urn:schemas-microsoft-com:office:office" xmlns:r="http://schemas.openxmlformats.org/officeDocument/2006/relationships" xmlns:m="http://schemas.openxmlformats.org/officeDocument/2006/math" xmlns:v="urn:schemas-microsoft-com:vml" xmlns:wp14="http://schemas.microsoft.com/office/word/2010/wordprocessingDrawing" xmlns:wp="http://schemas.openxmlformats.org/drawingml/2006/wordprocessingDrawing" xmlns:w10="urn:schemas-microsoft-com:office:word" xmlns:w="http://schemas.openxmlformats.org/wordprocessingml/2006/main" xmlns:w14="http://schemas.microsoft.com/office/word/2010/wordml" xmlns:w15="http://schemas.microsoft.com/office/word/2012/wordml" xmlns:w16cex="http://schemas.microsoft.com/office/word/2018/wordml/cex" xmlns:w16cid="http://schemas.microsoft.com/office/word/2016/wordml/cid" xmlns:w16="http://schemas.microsoft.com/office/word/2018/wordml" xmlns:w16sdtdh="http://schemas.microsoft.com/office/word/2020/wordml/sdtdatahash" xmlns:w16se="http://schemas.microsoft.com/office/word/2015/wordml/symex" xmlns:wpg="http://schemas.microsoft.com/office/word/2010/wordprocessingGroup" xmlns:wpi="http://schemas.microsoft.com/office/word/2010/wordprocessingInk" xmlns:wne="http://schemas.microsoft.com/office/word/2006/wordml" xmlns:wps="http://schemas.microsoft.com/office/word/2010/wordprocessingShape" mc:Ignorable="w14 w15 w16se w16cid w16 w16cex w16sdtdh wp14">
+<w:numbering xmlns:wpc="http://schemas.microsoft.com/office/word/2010/wordprocessingCanvas" xmlns:cx="http://schemas.microsoft.com/office/drawing/2014/chartex" xmlns:cx1="http://schemas.microsoft.com/office/drawing/2015/9/8/chartex" xmlns:cx2="http://schemas.microsoft.com/office/drawing/2015/10/21/chartex" xmlns:cx3="http://schemas.microsoft.com/office/drawing/2016/5/9/chartex" xmlns:cx4="http://schemas.microsoft.com/office/drawing/2016/5/10/chartex" xmlns:cx5="http://schemas.microsoft.com/office/drawing/2016/5/11/chartex" xmlns:cx6="http://schemas.microsoft.com/office/drawing/2016/5/12/chartex" xmlns:cx7="http://schemas.microsoft.com/office/drawing/2016/5/13/chartex" xmlns:cx8="http://schemas.microsoft.com/office/drawing/2016/5/14/chartex" xmlns:mc="http://schemas.openxmlformats.org/markup-compatibility/2006" xmlns:aink="http://schemas.microsoft.com/office/drawing/2016/ink" xmlns:am3d="http://schemas.microsoft.com/office/drawing/2017/model3d" xmlns:o="urn:schemas-microsoft-com:office:office" xmlns:oel="http://schemas.microsoft.com/office/2019/extlst" xmlns:r="http://schemas.openxmlformats.org/officeDocument/2006/relationships" xmlns:m="http://schemas.openxmlformats.org/officeDocument/2006/math" xmlns:v="urn:schemas-microsoft-com:vml" xmlns:wp14="http://schemas.microsoft.com/office/word/2010/wordprocessingDrawing" xmlns:wp="http://schemas.openxmlformats.org/drawingml/2006/wordprocessingDrawing" xmlns:w10="urn:schemas-microsoft-com:office:word" xmlns:w="http://schemas.openxmlformats.org/wordprocessingml/2006/main" xmlns:w14="http://schemas.microsoft.com/office/word/2010/wordml" xmlns:w15="http://schemas.microsoft.com/office/word/2012/wordml" xmlns:w16cei="http://schemas.microsoft.com/office/word/2026/wordml/cei" xmlns:w16cex="http://schemas.microsoft.com/office/word/2018/wordml/cex" xmlns:w16cid="http://schemas.microsoft.com/office/word/2016/wordml/cid" xmlns:w16="http://schemas.microsoft.com/office/word/2018/wordml" xmlns:w16du="http://schemas.microsoft.com/office/word/2023/wordml/word16du" xmlns:w16sdtdh="http://schemas.microsoft.com/office/word/2020/wordml/sdtdatahash" xmlns:w16sdtfl="http://schemas.microsoft.com/office/word/2024/wordml/sdtformatlock" xmlns:w16se="http://schemas.microsoft.com/office/word/2015/wordml/symex" xmlns:wpg="http://schemas.microsoft.com/office/word/2010/wordprocessingGroup" xmlns:wpi="http://schemas.microsoft.com/office/word/2010/wordprocessingInk" xmlns:wne="http://schemas.microsoft.com/office/word/2006/wordml" xmlns:wps="http://schemas.microsoft.com/office/word/2010/wordprocessingShape" mc:Ignorable="w14 w15 w16se w16cid w16 w16cex w16sdtdh w16sdtfl w16du wp14">
   <w:abstractNum w:abstractNumId="0" w15:restartNumberingAfterBreak="0">
     <w:nsid w:val="4CDE300C"/>
     <w:multiLevelType w:val="multilevel"/>
@@ -3457,17 +3532,17 @@
       </w:pPr>
     </w:lvl>
   </w:abstractNum>
-  <w:num w:numId="1">
+  <w:num w:numId="1" w16cid:durableId="116410364">
     <w:abstractNumId w:val="0"/>
   </w:num>
-  <w:num w:numId="2">
+  <w:num w:numId="2" w16cid:durableId="1779520891">
     <w:abstractNumId w:val="1"/>
   </w:num>
 </w:numbering>
 </file>
 
 <file path=word/styles.xml><?xml version="1.0" encoding="utf-8"?>
-<w:styles xmlns:mc="http://schemas.openxmlformats.org/markup-compatibility/2006" xmlns:r="http://schemas.openxmlformats.org/officeDocument/2006/relationships" xmlns:w="http://schemas.openxmlformats.org/wordprocessingml/2006/main" xmlns:w14="http://schemas.microsoft.com/office/word/2010/wordml" xmlns:w15="http://schemas.microsoft.com/office/word/2012/wordml" xmlns:w16cex="http://schemas.microsoft.com/office/word/2018/wordml/cex" xmlns:w16cid="http://schemas.microsoft.com/office/word/2016/wordml/cid" xmlns:w16="http://schemas.microsoft.com/office/word/2018/wordml" xmlns:w16sdtdh="http://schemas.microsoft.com/office/word/2020/wordml/sdtdatahash" xmlns:w16se="http://schemas.microsoft.com/office/word/2015/wordml/symex" mc:Ignorable="w14 w15 w16se w16cid w16 w16cex w16sdtdh">
+<w:styles xmlns:mc="http://schemas.openxmlformats.org/markup-compatibility/2006" xmlns:r="http://schemas.openxmlformats.org/officeDocument/2006/relationships" xmlns:w="http://schemas.openxmlformats.org/wordprocessingml/2006/main" xmlns:w14="http://schemas.microsoft.com/office/word/2010/wordml" xmlns:w15="http://schemas.microsoft.com/office/word/2012/wordml" xmlns:w16cex="http://schemas.microsoft.com/office/word/2018/wordml/cex" xmlns:w16cid="http://schemas.microsoft.com/office/word/2016/wordml/cid" xmlns:w16="http://schemas.microsoft.com/office/word/2018/wordml" xmlns:w16du="http://schemas.microsoft.com/office/word/2023/wordml/word16du" xmlns:w16sdtdh="http://schemas.microsoft.com/office/word/2020/wordml/sdtdatahash" xmlns:w16sdtfl="http://schemas.microsoft.com/office/word/2024/wordml/sdtformatlock" xmlns:w16se="http://schemas.microsoft.com/office/word/2015/wordml/symex" mc:Ignorable="w14 w15 w16se w16cid w16 w16cex w16sdtdh w16sdtfl w16du">
   <w:docDefaults>
     <w:rPrDefault>
       <w:rPr>

</xml_diff>

<commit_message>
feat: update document rendering to use uppercase, adjust signature size, disable template caching, and add NIP field for signatories
</commit_message>
<xml_diff>
--- a/apps/web/public/templates/Surat_Beda_Nama.docx
+++ b/apps/web/public/templates/Surat_Beda_Nama.docx
@@ -1,6 +1,6 @@
 
 <file path=word/document.xml><?xml version="1.0" encoding="utf-8"?>
-<w:document xmlns:wpc="http://schemas.microsoft.com/office/word/2010/wordprocessingCanvas" xmlns:cx="http://schemas.microsoft.com/office/drawing/2014/chartex" xmlns:cx1="http://schemas.microsoft.com/office/drawing/2015/9/8/chartex" xmlns:cx2="http://schemas.microsoft.com/office/drawing/2015/10/21/chartex" xmlns:cx3="http://schemas.microsoft.com/office/drawing/2016/5/9/chartex" xmlns:cx4="http://schemas.microsoft.com/office/drawing/2016/5/10/chartex" xmlns:cx5="http://schemas.microsoft.com/office/drawing/2016/5/11/chartex" xmlns:cx6="http://schemas.microsoft.com/office/drawing/2016/5/12/chartex" xmlns:cx7="http://schemas.microsoft.com/office/drawing/2016/5/13/chartex" xmlns:cx8="http://schemas.microsoft.com/office/drawing/2016/5/14/chartex" xmlns:mc="http://schemas.openxmlformats.org/markup-compatibility/2006" xmlns:aink="http://schemas.microsoft.com/office/drawing/2016/ink" xmlns:am3d="http://schemas.microsoft.com/office/drawing/2017/model3d" xmlns:o="urn:schemas-microsoft-com:office:office" xmlns:oel="http://schemas.microsoft.com/office/2019/extlst" xmlns:r="http://schemas.openxmlformats.org/officeDocument/2006/relationships" xmlns:m="http://schemas.openxmlformats.org/officeDocument/2006/math" xmlns:v="urn:schemas-microsoft-com:vml" xmlns:wp14="http://schemas.microsoft.com/office/word/2010/wordprocessingDrawing" xmlns:wp="http://schemas.openxmlformats.org/drawingml/2006/wordprocessingDrawing" xmlns:w10="urn:schemas-microsoft-com:office:word" xmlns:w="http://schemas.openxmlformats.org/wordprocessingml/2006/main" xmlns:w14="http://schemas.microsoft.com/office/word/2010/wordml" xmlns:w15="http://schemas.microsoft.com/office/word/2012/wordml" xmlns:w16cei="http://schemas.microsoft.com/office/word/2026/wordml/cei" xmlns:w16cex="http://schemas.microsoft.com/office/word/2018/wordml/cex" xmlns:w16cid="http://schemas.microsoft.com/office/word/2016/wordml/cid" xmlns:w16="http://schemas.microsoft.com/office/word/2018/wordml" xmlns:w16du="http://schemas.microsoft.com/office/word/2023/wordml/word16du" xmlns:w16sdtdh="http://schemas.microsoft.com/office/word/2020/wordml/sdtdatahash" xmlns:w16sdtfl="http://schemas.microsoft.com/office/word/2024/wordml/sdtformatlock" xmlns:w16se="http://schemas.microsoft.com/office/word/2015/wordml/symex" xmlns:wpg="http://schemas.microsoft.com/office/word/2010/wordprocessingGroup" xmlns:wpi="http://schemas.microsoft.com/office/word/2010/wordprocessingInk" xmlns:wne="http://schemas.microsoft.com/office/word/2006/wordml" xmlns:wps="http://schemas.microsoft.com/office/word/2010/wordprocessingShape" mc:Ignorable="w14 w15 w16se w16cid w16 w16cex w16sdtdh w16sdtfl w16du wp14">
+<w:document xmlns:wpc="http://schemas.microsoft.com/office/word/2010/wordprocessingCanvas" xmlns:cx="http://schemas.microsoft.com/office/drawing/2014/chartex" xmlns:cx1="http://schemas.microsoft.com/office/drawing/2015/9/8/chartex" xmlns:cx2="http://schemas.microsoft.com/office/drawing/2015/10/21/chartex" xmlns:cx3="http://schemas.microsoft.com/office/drawing/2016/5/9/chartex" xmlns:cx4="http://schemas.microsoft.com/office/drawing/2016/5/10/chartex" xmlns:cx5="http://schemas.microsoft.com/office/drawing/2016/5/11/chartex" xmlns:cx6="http://schemas.microsoft.com/office/drawing/2016/5/12/chartex" xmlns:cx7="http://schemas.microsoft.com/office/drawing/2016/5/13/chartex" xmlns:cx8="http://schemas.microsoft.com/office/drawing/2016/5/14/chartex" xmlns:mc="http://schemas.openxmlformats.org/markup-compatibility/2006" xmlns:m="http://schemas.openxmlformats.org/officeDocument/2006/math" xmlns:aink="http://schemas.microsoft.com/office/drawing/2016/ink" xmlns:am3d="http://schemas.microsoft.com/office/drawing/2017/model3d" xmlns:oel="http://schemas.microsoft.com/office/2019/extlst" xmlns:r="http://schemas.openxmlformats.org/officeDocument/2006/relationships" xmlns:wp14="http://schemas.microsoft.com/office/word/2010/wordprocessingDrawing" xmlns:wp="http://schemas.openxmlformats.org/drawingml/2006/wordprocessingDrawing" xmlns:wpg="http://schemas.microsoft.com/office/word/2010/wordprocessingGroup" xmlns:wpi="http://schemas.microsoft.com/office/word/2010/wordprocessingInk" xmlns:wps="http://schemas.microsoft.com/office/word/2010/wordprocessingShape" xmlns:o="urn:schemas-microsoft-com:office:office" xmlns:v="urn:schemas-microsoft-com:vml" xmlns:w10="urn:schemas-microsoft-com:office:word" xmlns:w="http://schemas.openxmlformats.org/wordprocessingml/2006/main" xmlns:w14="http://schemas.microsoft.com/office/word/2010/wordml" xmlns:w15="http://schemas.microsoft.com/office/word/2012/wordml" xmlns:w16cex="http://schemas.microsoft.com/office/word/2018/wordml/cex" xmlns:w16cid="http://schemas.microsoft.com/office/word/2016/wordml/cid" xmlns:w16="http://schemas.microsoft.com/office/word/2018/wordml" xmlns:w16sdtdh="http://schemas.microsoft.com/office/word/2020/wordml/sdtdatahash" xmlns:w16sdtfl="http://schemas.microsoft.com/office/word/2024/wordml/sdtformatlock" xmlns:w16se="http://schemas.microsoft.com/office/word/2015/wordml/symex" xmlns:w16du="http://schemas.microsoft.com/office/word/2023/wordml/word16du" xmlns:wne="http://schemas.microsoft.com/office/word/2006/wordml" mc:Ignorable="w14 w15 w16se w16cid w16 w16cex w16sdtdh w16sdtfl w16du wp14">
   <w:body>
     <w:p>
       <w:pPr>
@@ -26,16 +26,16 @@
           <w:lang w:eastAsia="en-ID"/>
         </w:rPr>
         <w:drawing>
-          <wp:anchor distT="0" distB="0" distL="114300" distR="114300" simplePos="0" relativeHeight="251660288" behindDoc="0" locked="0" layoutInCell="1" allowOverlap="1" wp14:anchorId="31401D6D" wp14:editId="4EBA3DC1">
+          <wp:anchor distT="0" distB="0" distL="114300" distR="114300" simplePos="0" relativeHeight="251660288" behindDoc="0" locked="0" layoutInCell="1" allowOverlap="1" wp14:anchorId="31401D6D" wp14:editId="5567B8C9">
             <wp:simplePos x="0" y="0"/>
             <wp:positionH relativeFrom="margin">
-              <wp:align>left</wp:align>
+              <wp:posOffset>-85618</wp:posOffset>
             </wp:positionH>
             <wp:positionV relativeFrom="paragraph">
-              <wp:posOffset>116840</wp:posOffset>
+              <wp:posOffset>22986</wp:posOffset>
             </wp:positionV>
-            <wp:extent cx="898525" cy="982867"/>
-            <wp:effectExtent l="0" t="0" r="0" b="8255"/>
+            <wp:extent cx="980440" cy="1072470"/>
+            <wp:effectExtent l="0" t="0" r="0" b="0"/>
             <wp:wrapNone/>
             <wp:docPr id="2" name="Picture 2"/>
             <wp:cNvGraphicFramePr>
@@ -63,7 +63,7 @@
                   <pic:spPr>
                     <a:xfrm>
                       <a:off x="0" y="0"/>
-                      <a:ext cx="907907" cy="993129"/>
+                      <a:ext cx="1004145" cy="1098400"/>
                     </a:xfrm>
                     <a:prstGeom prst="rect">
                       <a:avLst/>
@@ -403,7 +403,7 @@
               </wp:anchor>
             </w:drawing>
           </mc:Choice>
-          <mc:Fallback>
+          <mc:Fallback xmlns:w16cei="http://schemas.microsoft.com/office/word/2026/wordml/cei">
             <w:pict>
               <v:line w14:anchorId="6577995C" id="Straight Connector 1" o:spid="_x0000_s1026" style="position:absolute;flip:y;z-index:251659264;visibility:visible;mso-wrap-style:square;mso-width-percent:0;mso-height-percent:0;mso-wrap-distance-left:9pt;mso-wrap-distance-top:0;mso-wrap-distance-right:9pt;mso-wrap-distance-bottom:0;mso-position-horizontal:right;mso-position-horizontal-relative:margin;mso-position-vertical:absolute;mso-position-vertical-relative:text;mso-width-percent:0;mso-height-percent:0;mso-width-relative:margin;mso-height-relative:margin" from="411.1pt,.45pt" to="873.4pt,4.65pt" o:gfxdata="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" strokecolor="black [3213]" strokeweight="3pt">
                 <v:stroke joinstyle="miter"/>
@@ -547,12 +547,16 @@
         <w:spacing w:after="0" w:line="240" w:lineRule="auto"/>
         <w:rPr>
           <w:rFonts w:ascii="Times New Roman" w:eastAsia="Times New Roman" w:hAnsi="Times New Roman" w:cs="Times New Roman"/>
-          <w:lang w:eastAsia="en-ID"/>
-        </w:rPr>
-      </w:pPr>
-      <w:r>
-        <w:rPr>
-          <w:rFonts w:ascii="Times New Roman" w:eastAsia="Times New Roman" w:hAnsi="Times New Roman" w:cs="Times New Roman"/>
+          <w:sz w:val="24"/>
+          <w:szCs w:val="24"/>
+          <w:lang w:eastAsia="en-ID"/>
+        </w:rPr>
+      </w:pPr>
+      <w:r>
+        <w:rPr>
+          <w:rFonts w:ascii="Times New Roman" w:eastAsia="Times New Roman" w:hAnsi="Times New Roman" w:cs="Times New Roman"/>
+          <w:sz w:val="24"/>
+          <w:szCs w:val="24"/>
           <w:lang w:eastAsia="en-ID"/>
         </w:rPr>
         <w:t xml:space="preserve">Yang </w:t>
@@ -561,6 +565,8 @@
       <w:r>
         <w:rPr>
           <w:rFonts w:ascii="Times New Roman" w:eastAsia="Times New Roman" w:hAnsi="Times New Roman" w:cs="Times New Roman"/>
+          <w:sz w:val="24"/>
+          <w:szCs w:val="24"/>
           <w:lang w:eastAsia="en-ID"/>
         </w:rPr>
         <w:t>bertanda</w:t>
@@ -569,6 +575,8 @@
       <w:r>
         <w:rPr>
           <w:rFonts w:ascii="Times New Roman" w:eastAsia="Times New Roman" w:hAnsi="Times New Roman" w:cs="Times New Roman"/>
+          <w:sz w:val="24"/>
+          <w:szCs w:val="24"/>
           <w:lang w:eastAsia="en-ID"/>
         </w:rPr>
         <w:t xml:space="preserve"> </w:t>
@@ -577,6 +585,8 @@
       <w:r>
         <w:rPr>
           <w:rFonts w:ascii="Times New Roman" w:eastAsia="Times New Roman" w:hAnsi="Times New Roman" w:cs="Times New Roman"/>
+          <w:sz w:val="24"/>
+          <w:szCs w:val="24"/>
           <w:lang w:eastAsia="en-ID"/>
         </w:rPr>
         <w:t>tangan</w:t>
@@ -585,6 +595,8 @@
       <w:r>
         <w:rPr>
           <w:rFonts w:ascii="Times New Roman" w:eastAsia="Times New Roman" w:hAnsi="Times New Roman" w:cs="Times New Roman"/>
+          <w:sz w:val="24"/>
+          <w:szCs w:val="24"/>
           <w:lang w:eastAsia="en-ID"/>
         </w:rPr>
         <w:t xml:space="preserve"> di </w:t>
@@ -593,6 +605,8 @@
       <w:r>
         <w:rPr>
           <w:rFonts w:ascii="Times New Roman" w:eastAsia="Times New Roman" w:hAnsi="Times New Roman" w:cs="Times New Roman"/>
+          <w:sz w:val="24"/>
+          <w:szCs w:val="24"/>
           <w:lang w:eastAsia="en-ID"/>
         </w:rPr>
         <w:t>bawah</w:t>
@@ -601,6 +615,8 @@
       <w:r>
         <w:rPr>
           <w:rFonts w:ascii="Times New Roman" w:eastAsia="Times New Roman" w:hAnsi="Times New Roman" w:cs="Times New Roman"/>
+          <w:sz w:val="24"/>
+          <w:szCs w:val="24"/>
           <w:lang w:eastAsia="en-ID"/>
         </w:rPr>
         <w:t xml:space="preserve"> </w:t>
@@ -609,6 +625,8 @@
       <w:r>
         <w:rPr>
           <w:rFonts w:ascii="Times New Roman" w:eastAsia="Times New Roman" w:hAnsi="Times New Roman" w:cs="Times New Roman"/>
+          <w:sz w:val="24"/>
+          <w:szCs w:val="24"/>
           <w:lang w:eastAsia="en-ID"/>
         </w:rPr>
         <w:t>ini</w:t>
@@ -617,6 +635,8 @@
       <w:r>
         <w:rPr>
           <w:rFonts w:ascii="Times New Roman" w:eastAsia="Times New Roman" w:hAnsi="Times New Roman" w:cs="Times New Roman"/>
+          <w:sz w:val="24"/>
+          <w:szCs w:val="24"/>
           <w:lang w:eastAsia="en-ID"/>
         </w:rPr>
         <w:t xml:space="preserve"> : </w:t>
@@ -627,6 +647,8 @@
         <w:spacing w:after="0" w:line="240" w:lineRule="auto"/>
         <w:rPr>
           <w:rFonts w:ascii="Times New Roman" w:eastAsia="Times New Roman" w:hAnsi="Times New Roman" w:cs="Times New Roman"/>
+          <w:sz w:val="24"/>
+          <w:szCs w:val="24"/>
           <w:lang w:eastAsia="en-ID"/>
         </w:rPr>
       </w:pPr>
@@ -636,12 +658,16 @@
         <w:spacing w:after="0" w:line="240" w:lineRule="auto"/>
         <w:rPr>
           <w:rFonts w:ascii="Times New Roman" w:eastAsia="Times New Roman" w:hAnsi="Times New Roman" w:cs="Times New Roman"/>
-          <w:lang w:eastAsia="en-ID"/>
-        </w:rPr>
-      </w:pPr>
-      <w:r>
-        <w:rPr>
-          <w:rFonts w:ascii="Times New Roman" w:eastAsia="Times New Roman" w:hAnsi="Times New Roman" w:cs="Times New Roman"/>
+          <w:sz w:val="24"/>
+          <w:szCs w:val="24"/>
+          <w:lang w:eastAsia="en-ID"/>
+        </w:rPr>
+      </w:pPr>
+      <w:r>
+        <w:rPr>
+          <w:rFonts w:ascii="Times New Roman" w:eastAsia="Times New Roman" w:hAnsi="Times New Roman" w:cs="Times New Roman"/>
+          <w:sz w:val="24"/>
+          <w:szCs w:val="24"/>
           <w:lang w:eastAsia="en-ID"/>
         </w:rPr>
         <w:t>Nama</w:t>
@@ -649,27 +675,35 @@
       <w:r>
         <w:rPr>
           <w:rFonts w:ascii="Times New Roman" w:eastAsia="Times New Roman" w:hAnsi="Times New Roman" w:cs="Times New Roman"/>
-          <w:lang w:eastAsia="en-ID"/>
-        </w:rPr>
-        <w:tab/>
-      </w:r>
-      <w:r>
-        <w:rPr>
-          <w:rFonts w:ascii="Times New Roman" w:eastAsia="Times New Roman" w:hAnsi="Times New Roman" w:cs="Times New Roman"/>
-          <w:lang w:eastAsia="en-ID"/>
-        </w:rPr>
-        <w:tab/>
-      </w:r>
-      <w:r>
-        <w:rPr>
-          <w:rFonts w:ascii="Times New Roman" w:eastAsia="Times New Roman" w:hAnsi="Times New Roman" w:cs="Times New Roman"/>
-          <w:lang w:eastAsia="en-ID"/>
-        </w:rPr>
-        <w:tab/>
-      </w:r>
-      <w:r>
-        <w:rPr>
-          <w:rFonts w:ascii="Times New Roman" w:eastAsia="Times New Roman" w:hAnsi="Times New Roman" w:cs="Times New Roman"/>
+          <w:sz w:val="24"/>
+          <w:szCs w:val="24"/>
+          <w:lang w:eastAsia="en-ID"/>
+        </w:rPr>
+        <w:tab/>
+      </w:r>
+      <w:r>
+        <w:rPr>
+          <w:rFonts w:ascii="Times New Roman" w:eastAsia="Times New Roman" w:hAnsi="Times New Roman" w:cs="Times New Roman"/>
+          <w:sz w:val="24"/>
+          <w:szCs w:val="24"/>
+          <w:lang w:eastAsia="en-ID"/>
+        </w:rPr>
+        <w:tab/>
+      </w:r>
+      <w:r>
+        <w:rPr>
+          <w:rFonts w:ascii="Times New Roman" w:eastAsia="Times New Roman" w:hAnsi="Times New Roman" w:cs="Times New Roman"/>
+          <w:sz w:val="24"/>
+          <w:szCs w:val="24"/>
+          <w:lang w:eastAsia="en-ID"/>
+        </w:rPr>
+        <w:tab/>
+      </w:r>
+      <w:r>
+        <w:rPr>
+          <w:rFonts w:ascii="Times New Roman" w:eastAsia="Times New Roman" w:hAnsi="Times New Roman" w:cs="Times New Roman"/>
+          <w:sz w:val="24"/>
+          <w:szCs w:val="24"/>
           <w:lang w:eastAsia="en-ID"/>
         </w:rPr>
         <w:t>:</w:t>
@@ -677,13 +711,17 @@
       <w:r>
         <w:rPr>
           <w:rFonts w:ascii="Times New Roman" w:eastAsia="Times New Roman" w:hAnsi="Times New Roman" w:cs="Times New Roman"/>
+          <w:sz w:val="24"/>
+          <w:szCs w:val="24"/>
           <w:lang w:eastAsia="en-ID"/>
         </w:rPr>
         <w:t xml:space="preserve"> </w:t>
       </w:r>
       <w:r>
         <w:rPr>
-          <w:rFonts w:ascii="Times New Roman" w:eastAsia="Times New Roman" w:hAnsi="Times New Roman" w:cs="Times New Roman"/>
+          <w:rFonts w:asciiTheme="majorBidi" w:hAnsiTheme="majorBidi" w:cstheme="majorBidi"/>
+          <w:sz w:val="24"/>
+          <w:szCs w:val="24"/>
           <w:lang w:eastAsia="en-ID"/>
         </w:rPr>
         <w:t>{</w:t>
@@ -691,28 +729,36 @@
       <w:proofErr w:type="spellStart"/>
       <w:r>
         <w:rPr>
-          <w:rFonts w:ascii="Times New Roman" w:eastAsia="Times New Roman" w:hAnsi="Times New Roman" w:cs="Times New Roman"/>
+          <w:rFonts w:asciiTheme="majorBidi" w:hAnsiTheme="majorBidi" w:cstheme="majorBidi"/>
+          <w:sz w:val="24"/>
+          <w:szCs w:val="24"/>
           <w:lang w:eastAsia="en-ID"/>
         </w:rPr>
         <w:t>nama</w:t>
       </w:r>
       <w:r>
         <w:rPr>
-          <w:rFonts w:ascii="Times New Roman" w:eastAsia="Times New Roman" w:hAnsi="Times New Roman" w:cs="Times New Roman"/>
+          <w:rFonts w:asciiTheme="majorBidi" w:hAnsiTheme="majorBidi" w:cstheme="majorBidi"/>
+          <w:sz w:val="24"/>
+          <w:szCs w:val="24"/>
           <w:lang w:eastAsia="en-ID"/>
         </w:rPr>
         <w:t>_</w:t>
       </w:r>
       <w:r>
         <w:rPr>
-          <w:rFonts w:ascii="Times New Roman" w:eastAsia="Times New Roman" w:hAnsi="Times New Roman" w:cs="Times New Roman"/>
+          <w:rFonts w:asciiTheme="majorBidi" w:hAnsiTheme="majorBidi" w:cstheme="majorBidi"/>
+          <w:sz w:val="24"/>
+          <w:szCs w:val="24"/>
           <w:lang w:eastAsia="en-ID"/>
         </w:rPr>
         <w:t>p</w:t>
       </w:r>
       <w:r>
         <w:rPr>
-          <w:rFonts w:ascii="Times New Roman" w:eastAsia="Times New Roman" w:hAnsi="Times New Roman" w:cs="Times New Roman"/>
+          <w:rFonts w:asciiTheme="majorBidi" w:hAnsiTheme="majorBidi" w:cstheme="majorBidi"/>
+          <w:sz w:val="24"/>
+          <w:szCs w:val="24"/>
           <w:lang w:eastAsia="en-ID"/>
         </w:rPr>
         <w:t>enandatangan</w:t>
@@ -720,7 +766,9 @@
       <w:proofErr w:type="spellEnd"/>
       <w:r>
         <w:rPr>
-          <w:rFonts w:ascii="Times New Roman" w:eastAsia="Times New Roman" w:hAnsi="Times New Roman" w:cs="Times New Roman"/>
+          <w:rFonts w:asciiTheme="majorBidi" w:hAnsiTheme="majorBidi" w:cstheme="majorBidi"/>
+          <w:sz w:val="24"/>
+          <w:szCs w:val="24"/>
           <w:lang w:eastAsia="en-ID"/>
         </w:rPr>
         <w:t>}</w:t>
@@ -731,13 +779,17 @@
         <w:spacing w:after="0" w:line="240" w:lineRule="auto"/>
         <w:rPr>
           <w:rFonts w:ascii="Times New Roman" w:eastAsia="Times New Roman" w:hAnsi="Times New Roman" w:cs="Times New Roman"/>
-          <w:lang w:eastAsia="en-ID"/>
-        </w:rPr>
-      </w:pPr>
-      <w:proofErr w:type="spellStart"/>
-      <w:r>
-        <w:rPr>
-          <w:rFonts w:ascii="Times New Roman" w:eastAsia="Times New Roman" w:hAnsi="Times New Roman" w:cs="Times New Roman"/>
+          <w:sz w:val="24"/>
+          <w:szCs w:val="24"/>
+          <w:lang w:eastAsia="en-ID"/>
+        </w:rPr>
+      </w:pPr>
+      <w:proofErr w:type="spellStart"/>
+      <w:r>
+        <w:rPr>
+          <w:rFonts w:ascii="Times New Roman" w:eastAsia="Times New Roman" w:hAnsi="Times New Roman" w:cs="Times New Roman"/>
+          <w:sz w:val="24"/>
+          <w:szCs w:val="24"/>
           <w:lang w:eastAsia="en-ID"/>
         </w:rPr>
         <w:t>Jabatan</w:t>
@@ -746,27 +798,35 @@
       <w:r>
         <w:rPr>
           <w:rFonts w:ascii="Times New Roman" w:eastAsia="Times New Roman" w:hAnsi="Times New Roman" w:cs="Times New Roman"/>
-          <w:lang w:eastAsia="en-ID"/>
-        </w:rPr>
-        <w:tab/>
-      </w:r>
-      <w:r>
-        <w:rPr>
-          <w:rFonts w:ascii="Times New Roman" w:eastAsia="Times New Roman" w:hAnsi="Times New Roman" w:cs="Times New Roman"/>
-          <w:lang w:eastAsia="en-ID"/>
-        </w:rPr>
-        <w:tab/>
-      </w:r>
-      <w:r>
-        <w:rPr>
-          <w:rFonts w:ascii="Times New Roman" w:eastAsia="Times New Roman" w:hAnsi="Times New Roman" w:cs="Times New Roman"/>
-          <w:lang w:eastAsia="en-ID"/>
-        </w:rPr>
-        <w:tab/>
-      </w:r>
-      <w:r>
-        <w:rPr>
-          <w:rFonts w:ascii="Times New Roman" w:eastAsia="Times New Roman" w:hAnsi="Times New Roman" w:cs="Times New Roman"/>
+          <w:sz w:val="24"/>
+          <w:szCs w:val="24"/>
+          <w:lang w:eastAsia="en-ID"/>
+        </w:rPr>
+        <w:tab/>
+      </w:r>
+      <w:r>
+        <w:rPr>
+          <w:rFonts w:ascii="Times New Roman" w:eastAsia="Times New Roman" w:hAnsi="Times New Roman" w:cs="Times New Roman"/>
+          <w:sz w:val="24"/>
+          <w:szCs w:val="24"/>
+          <w:lang w:eastAsia="en-ID"/>
+        </w:rPr>
+        <w:tab/>
+      </w:r>
+      <w:r>
+        <w:rPr>
+          <w:rFonts w:ascii="Times New Roman" w:eastAsia="Times New Roman" w:hAnsi="Times New Roman" w:cs="Times New Roman"/>
+          <w:sz w:val="24"/>
+          <w:szCs w:val="24"/>
+          <w:lang w:eastAsia="en-ID"/>
+        </w:rPr>
+        <w:tab/>
+      </w:r>
+      <w:r>
+        <w:rPr>
+          <w:rFonts w:ascii="Times New Roman" w:eastAsia="Times New Roman" w:hAnsi="Times New Roman" w:cs="Times New Roman"/>
+          <w:sz w:val="24"/>
+          <w:szCs w:val="24"/>
           <w:lang w:eastAsia="en-ID"/>
         </w:rPr>
         <w:t>:</w:t>
@@ -774,6 +834,8 @@
       <w:r>
         <w:rPr>
           <w:rFonts w:ascii="Times New Roman" w:eastAsia="Times New Roman" w:hAnsi="Times New Roman" w:cs="Times New Roman"/>
+          <w:sz w:val="24"/>
+          <w:szCs w:val="24"/>
           <w:lang w:eastAsia="en-ID"/>
         </w:rPr>
         <w:t xml:space="preserve"> </w:t>
@@ -781,6 +843,8 @@
       <w:r>
         <w:rPr>
           <w:rFonts w:ascii="Times New Roman" w:eastAsia="Times New Roman" w:hAnsi="Times New Roman" w:cs="Times New Roman"/>
+          <w:sz w:val="24"/>
+          <w:szCs w:val="24"/>
           <w:lang w:eastAsia="en-ID"/>
         </w:rPr>
         <w:t>{</w:t>
@@ -789,6 +853,8 @@
       <w:r>
         <w:rPr>
           <w:rFonts w:ascii="Times New Roman" w:eastAsia="Times New Roman" w:hAnsi="Times New Roman" w:cs="Times New Roman"/>
+          <w:sz w:val="24"/>
+          <w:szCs w:val="24"/>
           <w:lang w:eastAsia="en-ID"/>
         </w:rPr>
         <w:t>jabatan</w:t>
@@ -796,6 +862,8 @@
       <w:r>
         <w:rPr>
           <w:rFonts w:ascii="Times New Roman" w:eastAsia="Times New Roman" w:hAnsi="Times New Roman" w:cs="Times New Roman"/>
+          <w:sz w:val="24"/>
+          <w:szCs w:val="24"/>
           <w:lang w:eastAsia="en-ID"/>
         </w:rPr>
         <w:t>_</w:t>
@@ -803,6 +871,8 @@
       <w:r>
         <w:rPr>
           <w:rFonts w:ascii="Times New Roman" w:eastAsia="Times New Roman" w:hAnsi="Times New Roman" w:cs="Times New Roman"/>
+          <w:sz w:val="24"/>
+          <w:szCs w:val="24"/>
           <w:lang w:eastAsia="en-ID"/>
         </w:rPr>
         <w:t>p</w:t>
@@ -810,6 +880,8 @@
       <w:r>
         <w:rPr>
           <w:rFonts w:ascii="Times New Roman" w:eastAsia="Times New Roman" w:hAnsi="Times New Roman" w:cs="Times New Roman"/>
+          <w:sz w:val="24"/>
+          <w:szCs w:val="24"/>
           <w:lang w:eastAsia="en-ID"/>
         </w:rPr>
         <w:t>enandatangan</w:t>
@@ -818,6 +890,8 @@
       <w:r>
         <w:rPr>
           <w:rFonts w:ascii="Times New Roman" w:eastAsia="Times New Roman" w:hAnsi="Times New Roman" w:cs="Times New Roman"/>
+          <w:sz w:val="24"/>
+          <w:szCs w:val="24"/>
           <w:lang w:eastAsia="en-ID"/>
         </w:rPr>
         <w:t>}</w:t>
@@ -828,6 +902,8 @@
         <w:spacing w:after="0" w:line="240" w:lineRule="auto"/>
         <w:rPr>
           <w:rFonts w:ascii="Times New Roman" w:eastAsia="Times New Roman" w:hAnsi="Times New Roman" w:cs="Times New Roman"/>
+          <w:sz w:val="24"/>
+          <w:szCs w:val="24"/>
           <w:lang w:eastAsia="en-ID"/>
         </w:rPr>
       </w:pPr>
@@ -837,21 +913,36 @@
         <w:spacing w:after="0" w:line="360" w:lineRule="auto"/>
         <w:rPr>
           <w:rFonts w:ascii="Times New Roman" w:eastAsia="Times New Roman" w:hAnsi="Times New Roman" w:cs="Times New Roman"/>
-          <w:lang w:eastAsia="en-ID"/>
-        </w:rPr>
-      </w:pPr>
-      <w:proofErr w:type="spellStart"/>
-      <w:r>
-        <w:rPr>
-          <w:rFonts w:ascii="Times New Roman" w:eastAsia="Times New Roman" w:hAnsi="Times New Roman" w:cs="Times New Roman"/>
-          <w:lang w:eastAsia="en-ID"/>
-        </w:rPr>
-        <w:t>Dengan</w:t>
-      </w:r>
-      <w:proofErr w:type="spellEnd"/>
-      <w:r>
-        <w:rPr>
-          <w:rFonts w:ascii="Times New Roman" w:eastAsia="Times New Roman" w:hAnsi="Times New Roman" w:cs="Times New Roman"/>
+          <w:sz w:val="24"/>
+          <w:szCs w:val="24"/>
+          <w:lang w:eastAsia="en-ID"/>
+        </w:rPr>
+      </w:pPr>
+      <w:r>
+        <w:rPr>
+          <w:rFonts w:ascii="Times New Roman" w:eastAsia="Times New Roman" w:hAnsi="Times New Roman" w:cs="Times New Roman"/>
+          <w:sz w:val="24"/>
+          <w:szCs w:val="24"/>
+          <w:lang w:eastAsia="en-ID"/>
+        </w:rPr>
+        <w:t xml:space="preserve">Dengan </w:t>
+      </w:r>
+      <w:proofErr w:type="spellStart"/>
+      <w:r>
+        <w:rPr>
+          <w:rFonts w:ascii="Times New Roman" w:eastAsia="Times New Roman" w:hAnsi="Times New Roman" w:cs="Times New Roman"/>
+          <w:sz w:val="24"/>
+          <w:szCs w:val="24"/>
+          <w:lang w:eastAsia="en-ID"/>
+        </w:rPr>
+        <w:t>ini</w:t>
+      </w:r>
+      <w:proofErr w:type="spellEnd"/>
+      <w:r>
+        <w:rPr>
+          <w:rFonts w:ascii="Times New Roman" w:eastAsia="Times New Roman" w:hAnsi="Times New Roman" w:cs="Times New Roman"/>
+          <w:sz w:val="24"/>
+          <w:szCs w:val="24"/>
           <w:lang w:eastAsia="en-ID"/>
         </w:rPr>
         <w:t xml:space="preserve"> </w:t>
@@ -860,14 +951,18 @@
       <w:r>
         <w:rPr>
           <w:rFonts w:ascii="Times New Roman" w:eastAsia="Times New Roman" w:hAnsi="Times New Roman" w:cs="Times New Roman"/>
-          <w:lang w:eastAsia="en-ID"/>
-        </w:rPr>
-        <w:t>ini</w:t>
-      </w:r>
-      <w:proofErr w:type="spellEnd"/>
-      <w:r>
-        <w:rPr>
-          <w:rFonts w:ascii="Times New Roman" w:eastAsia="Times New Roman" w:hAnsi="Times New Roman" w:cs="Times New Roman"/>
+          <w:sz w:val="24"/>
+          <w:szCs w:val="24"/>
+          <w:lang w:eastAsia="en-ID"/>
+        </w:rPr>
+        <w:t>menerangkan</w:t>
+      </w:r>
+      <w:proofErr w:type="spellEnd"/>
+      <w:r>
+        <w:rPr>
+          <w:rFonts w:ascii="Times New Roman" w:eastAsia="Times New Roman" w:hAnsi="Times New Roman" w:cs="Times New Roman"/>
+          <w:sz w:val="24"/>
+          <w:szCs w:val="24"/>
           <w:lang w:eastAsia="en-ID"/>
         </w:rPr>
         <w:t xml:space="preserve"> </w:t>
@@ -876,22 +971,8 @@
       <w:r>
         <w:rPr>
           <w:rFonts w:ascii="Times New Roman" w:eastAsia="Times New Roman" w:hAnsi="Times New Roman" w:cs="Times New Roman"/>
-          <w:lang w:eastAsia="en-ID"/>
-        </w:rPr>
-        <w:t>menerangkan</w:t>
-      </w:r>
-      <w:proofErr w:type="spellEnd"/>
-      <w:r>
-        <w:rPr>
-          <w:rFonts w:ascii="Times New Roman" w:eastAsia="Times New Roman" w:hAnsi="Times New Roman" w:cs="Times New Roman"/>
-          <w:lang w:eastAsia="en-ID"/>
-        </w:rPr>
-        <w:t xml:space="preserve"> </w:t>
-      </w:r>
-      <w:proofErr w:type="spellStart"/>
-      <w:r>
-        <w:rPr>
-          <w:rFonts w:ascii="Times New Roman" w:eastAsia="Times New Roman" w:hAnsi="Times New Roman" w:cs="Times New Roman"/>
+          <w:sz w:val="24"/>
+          <w:szCs w:val="24"/>
           <w:lang w:eastAsia="en-ID"/>
         </w:rPr>
         <w:t>bahwa</w:t>
@@ -900,6 +981,8 @@
       <w:r>
         <w:rPr>
           <w:rFonts w:ascii="Times New Roman" w:eastAsia="Times New Roman" w:hAnsi="Times New Roman" w:cs="Times New Roman"/>
+          <w:sz w:val="24"/>
+          <w:szCs w:val="24"/>
           <w:lang w:eastAsia="en-ID"/>
         </w:rPr>
         <w:t xml:space="preserve"> </w:t>
@@ -914,6 +997,8 @@
           <w:bCs/>
           <w:i/>
           <w:iCs/>
+          <w:sz w:val="24"/>
+          <w:szCs w:val="24"/>
           <w:lang w:val="id-ID" w:eastAsia="en-ID"/>
         </w:rPr>
       </w:pPr>
@@ -924,6 +1009,8 @@
           <w:bCs/>
           <w:i/>
           <w:iCs/>
+          <w:sz w:val="24"/>
+          <w:szCs w:val="24"/>
           <w:lang w:eastAsia="en-ID"/>
         </w:rPr>
         <w:t xml:space="preserve">Nama </w:t>
@@ -936,6 +1023,8 @@
           <w:bCs/>
           <w:i/>
           <w:iCs/>
+          <w:sz w:val="24"/>
+          <w:szCs w:val="24"/>
           <w:lang w:eastAsia="en-ID"/>
         </w:rPr>
         <w:t>Dalam</w:t>
@@ -948,6 +1037,8 @@
           <w:bCs/>
           <w:i/>
           <w:iCs/>
+          <w:sz w:val="24"/>
+          <w:szCs w:val="24"/>
           <w:lang w:eastAsia="en-ID"/>
         </w:rPr>
         <w:t xml:space="preserve"> </w:t>
@@ -959,6 +1050,8 @@
           <w:bCs/>
           <w:i/>
           <w:iCs/>
+          <w:sz w:val="24"/>
+          <w:szCs w:val="24"/>
           <w:lang w:val="id-ID" w:eastAsia="en-ID"/>
         </w:rPr>
         <w:t xml:space="preserve"> </w:t>
@@ -970,6 +1063,8 @@
           <w:bCs/>
           <w:i/>
           <w:iCs/>
+          <w:sz w:val="24"/>
+          <w:szCs w:val="24"/>
           <w:lang w:val="id-ID" w:eastAsia="en-ID"/>
         </w:rPr>
         <w:t>Kartu Keluarga (KK)</w:t>
@@ -980,34 +1075,44 @@
         <w:spacing w:after="0" w:line="240" w:lineRule="auto"/>
         <w:rPr>
           <w:rFonts w:ascii="Times New Roman" w:eastAsia="Times New Roman" w:hAnsi="Times New Roman" w:cs="Times New Roman"/>
-          <w:lang w:val="id-ID" w:eastAsia="en-ID"/>
-        </w:rPr>
-      </w:pPr>
-      <w:r>
-        <w:rPr>
-          <w:rFonts w:ascii="Times New Roman" w:eastAsia="Times New Roman" w:hAnsi="Times New Roman" w:cs="Times New Roman"/>
-          <w:lang w:eastAsia="en-ID"/>
+          <w:sz w:val="24"/>
+          <w:szCs w:val="24"/>
+          <w:lang w:val="id-ID" w:eastAsia="en-ID"/>
+        </w:rPr>
+      </w:pPr>
+      <w:r>
+        <w:rPr>
+          <w:rFonts w:ascii="Times New Roman" w:eastAsia="Times New Roman" w:hAnsi="Times New Roman" w:cs="Times New Roman"/>
+          <w:sz w:val="24"/>
+          <w:szCs w:val="24"/>
+          <w:lang w:val="id-ID" w:eastAsia="en-ID"/>
         </w:rPr>
         <w:t>Nama</w:t>
       </w:r>
       <w:r>
         <w:rPr>
           <w:rFonts w:ascii="Times New Roman" w:eastAsia="Times New Roman" w:hAnsi="Times New Roman" w:cs="Times New Roman"/>
-          <w:lang w:eastAsia="en-ID"/>
-        </w:rPr>
-        <w:tab/>
-      </w:r>
-      <w:r>
-        <w:rPr>
-          <w:rFonts w:ascii="Times New Roman" w:eastAsia="Times New Roman" w:hAnsi="Times New Roman" w:cs="Times New Roman"/>
-          <w:lang w:eastAsia="en-ID"/>
-        </w:rPr>
-        <w:tab/>
-      </w:r>
-      <w:r>
-        <w:rPr>
-          <w:rFonts w:ascii="Times New Roman" w:eastAsia="Times New Roman" w:hAnsi="Times New Roman" w:cs="Times New Roman"/>
-          <w:lang w:eastAsia="en-ID"/>
+          <w:sz w:val="24"/>
+          <w:szCs w:val="24"/>
+          <w:lang w:val="id-ID" w:eastAsia="en-ID"/>
+        </w:rPr>
+        <w:tab/>
+      </w:r>
+      <w:r>
+        <w:rPr>
+          <w:rFonts w:ascii="Times New Roman" w:eastAsia="Times New Roman" w:hAnsi="Times New Roman" w:cs="Times New Roman"/>
+          <w:sz w:val="24"/>
+          <w:szCs w:val="24"/>
+          <w:lang w:val="id-ID" w:eastAsia="en-ID"/>
+        </w:rPr>
+        <w:tab/>
+      </w:r>
+      <w:r>
+        <w:rPr>
+          <w:rFonts w:ascii="Times New Roman" w:eastAsia="Times New Roman" w:hAnsi="Times New Roman" w:cs="Times New Roman"/>
+          <w:sz w:val="24"/>
+          <w:szCs w:val="24"/>
+          <w:lang w:val="id-ID" w:eastAsia="en-ID"/>
         </w:rPr>
         <w:tab/>
         <w:t xml:space="preserve">: </w:t>
@@ -1015,20 +1120,37 @@
       <w:r>
         <w:rPr>
           <w:rFonts w:ascii="Times New Roman" w:eastAsia="Times New Roman" w:hAnsi="Times New Roman" w:cs="Times New Roman"/>
-          <w:lang w:val="id-ID" w:eastAsia="en-ID"/>
-        </w:rPr>
-        <w:t>{nama</w:t>
-      </w:r>
-      <w:r>
-        <w:rPr>
-          <w:rFonts w:ascii="Times New Roman" w:eastAsia="Times New Roman" w:hAnsi="Times New Roman" w:cs="Times New Roman"/>
+          <w:sz w:val="24"/>
+          <w:szCs w:val="24"/>
+          <w:lang w:val="id-ID" w:eastAsia="en-ID"/>
+        </w:rPr>
+        <w:t>{</w:t>
+      </w:r>
+      <w:proofErr w:type="spellStart"/>
+      <w:r>
+        <w:rPr>
+          <w:rFonts w:ascii="Times New Roman" w:eastAsia="Times New Roman" w:hAnsi="Times New Roman" w:cs="Times New Roman"/>
+          <w:sz w:val="24"/>
+          <w:szCs w:val="24"/>
+          <w:lang w:val="id-ID" w:eastAsia="en-ID"/>
+        </w:rPr>
+        <w:t>nama</w:t>
+      </w:r>
+      <w:r>
+        <w:rPr>
+          <w:rFonts w:ascii="Times New Roman" w:eastAsia="Times New Roman" w:hAnsi="Times New Roman" w:cs="Times New Roman"/>
+          <w:sz w:val="24"/>
+          <w:szCs w:val="24"/>
           <w:lang w:val="id-ID" w:eastAsia="en-ID"/>
         </w:rPr>
         <w:t>Kk</w:t>
       </w:r>
-      <w:r>
-        <w:rPr>
-          <w:rFonts w:ascii="Times New Roman" w:eastAsia="Times New Roman" w:hAnsi="Times New Roman" w:cs="Times New Roman"/>
+      <w:proofErr w:type="spellEnd"/>
+      <w:r>
+        <w:rPr>
+          <w:rFonts w:ascii="Times New Roman" w:eastAsia="Times New Roman" w:hAnsi="Times New Roman" w:cs="Times New Roman"/>
+          <w:sz w:val="24"/>
+          <w:szCs w:val="24"/>
           <w:lang w:val="id-ID" w:eastAsia="en-ID"/>
         </w:rPr>
         <w:t>}</w:t>
@@ -1039,12 +1161,16 @@
         <w:spacing w:after="0" w:line="240" w:lineRule="auto"/>
         <w:rPr>
           <w:rFonts w:ascii="Times New Roman" w:eastAsia="Times New Roman" w:hAnsi="Times New Roman" w:cs="Times New Roman"/>
-          <w:lang w:val="id-ID" w:eastAsia="en-ID"/>
-        </w:rPr>
-      </w:pPr>
-      <w:r>
-        <w:rPr>
-          <w:rFonts w:ascii="Times New Roman" w:eastAsia="Times New Roman" w:hAnsi="Times New Roman" w:cs="Times New Roman"/>
+          <w:sz w:val="24"/>
+          <w:szCs w:val="24"/>
+          <w:lang w:val="id-ID" w:eastAsia="en-ID"/>
+        </w:rPr>
+      </w:pPr>
+      <w:r>
+        <w:rPr>
+          <w:rFonts w:ascii="Times New Roman" w:eastAsia="Times New Roman" w:hAnsi="Times New Roman" w:cs="Times New Roman"/>
+          <w:sz w:val="24"/>
+          <w:szCs w:val="24"/>
           <w:lang w:val="id-ID" w:eastAsia="en-ID"/>
         </w:rPr>
         <w:t xml:space="preserve">Nik </w:t>
@@ -1052,20 +1178,26 @@
       <w:r>
         <w:rPr>
           <w:rFonts w:ascii="Times New Roman" w:eastAsia="Times New Roman" w:hAnsi="Times New Roman" w:cs="Times New Roman"/>
-          <w:lang w:val="id-ID" w:eastAsia="en-ID"/>
-        </w:rPr>
-        <w:tab/>
-      </w:r>
-      <w:r>
-        <w:rPr>
-          <w:rFonts w:ascii="Times New Roman" w:eastAsia="Times New Roman" w:hAnsi="Times New Roman" w:cs="Times New Roman"/>
-          <w:lang w:val="id-ID" w:eastAsia="en-ID"/>
-        </w:rPr>
-        <w:tab/>
-      </w:r>
-      <w:r>
-        <w:rPr>
-          <w:rFonts w:ascii="Times New Roman" w:eastAsia="Times New Roman" w:hAnsi="Times New Roman" w:cs="Times New Roman"/>
+          <w:sz w:val="24"/>
+          <w:szCs w:val="24"/>
+          <w:lang w:val="id-ID" w:eastAsia="en-ID"/>
+        </w:rPr>
+        <w:tab/>
+      </w:r>
+      <w:r>
+        <w:rPr>
+          <w:rFonts w:ascii="Times New Roman" w:eastAsia="Times New Roman" w:hAnsi="Times New Roman" w:cs="Times New Roman"/>
+          <w:sz w:val="24"/>
+          <w:szCs w:val="24"/>
+          <w:lang w:val="id-ID" w:eastAsia="en-ID"/>
+        </w:rPr>
+        <w:tab/>
+      </w:r>
+      <w:r>
+        <w:rPr>
+          <w:rFonts w:ascii="Times New Roman" w:eastAsia="Times New Roman" w:hAnsi="Times New Roman" w:cs="Times New Roman"/>
+          <w:sz w:val="24"/>
+          <w:szCs w:val="24"/>
           <w:lang w:val="id-ID" w:eastAsia="en-ID"/>
         </w:rPr>
         <w:tab/>
@@ -1074,6 +1206,8 @@
       <w:r>
         <w:rPr>
           <w:rFonts w:ascii="Times New Roman" w:eastAsia="Times New Roman" w:hAnsi="Times New Roman" w:cs="Times New Roman"/>
+          <w:sz w:val="24"/>
+          <w:szCs w:val="24"/>
           <w:lang w:val="id-ID" w:eastAsia="en-ID"/>
         </w:rPr>
         <w:t>{nik}</w:t>
@@ -1084,12 +1218,16 @@
         <w:spacing w:after="0" w:line="240" w:lineRule="auto"/>
         <w:rPr>
           <w:rFonts w:ascii="Times New Roman" w:eastAsia="Times New Roman" w:hAnsi="Times New Roman" w:cs="Times New Roman"/>
-          <w:lang w:val="id-ID" w:eastAsia="en-ID"/>
-        </w:rPr>
-      </w:pPr>
-      <w:r>
-        <w:rPr>
-          <w:rFonts w:ascii="Times New Roman" w:eastAsia="Times New Roman" w:hAnsi="Times New Roman" w:cs="Times New Roman"/>
+          <w:sz w:val="24"/>
+          <w:szCs w:val="24"/>
+          <w:lang w:val="id-ID" w:eastAsia="en-ID"/>
+        </w:rPr>
+      </w:pPr>
+      <w:r>
+        <w:rPr>
+          <w:rFonts w:ascii="Times New Roman" w:eastAsia="Times New Roman" w:hAnsi="Times New Roman" w:cs="Times New Roman"/>
+          <w:sz w:val="24"/>
+          <w:szCs w:val="24"/>
           <w:lang w:val="id-ID" w:eastAsia="en-ID"/>
         </w:rPr>
         <w:t>Tempat/Tgl lahir</w:t>
@@ -1097,6 +1235,8 @@
       <w:r>
         <w:rPr>
           <w:rFonts w:ascii="Times New Roman" w:eastAsia="Times New Roman" w:hAnsi="Times New Roman" w:cs="Times New Roman"/>
+          <w:sz w:val="24"/>
+          <w:szCs w:val="24"/>
           <w:lang w:val="id-ID" w:eastAsia="en-ID"/>
         </w:rPr>
         <w:tab/>
@@ -1105,6 +1245,8 @@
       <w:r>
         <w:rPr>
           <w:rFonts w:ascii="Times New Roman" w:eastAsia="Times New Roman" w:hAnsi="Times New Roman" w:cs="Times New Roman"/>
+          <w:sz w:val="24"/>
+          <w:szCs w:val="24"/>
           <w:lang w:val="id-ID" w:eastAsia="en-ID"/>
         </w:rPr>
         <w:t>{tempat</w:t>
@@ -1112,6 +1254,8 @@
       <w:r>
         <w:rPr>
           <w:rFonts w:ascii="Times New Roman" w:eastAsia="Times New Roman" w:hAnsi="Times New Roman" w:cs="Times New Roman"/>
+          <w:sz w:val="24"/>
+          <w:szCs w:val="24"/>
           <w:lang w:val="id-ID" w:eastAsia="en-ID"/>
         </w:rPr>
         <w:t>_</w:t>
@@ -1119,6 +1263,8 @@
       <w:r>
         <w:rPr>
           <w:rFonts w:ascii="Times New Roman" w:eastAsia="Times New Roman" w:hAnsi="Times New Roman" w:cs="Times New Roman"/>
+          <w:sz w:val="24"/>
+          <w:szCs w:val="24"/>
           <w:lang w:val="id-ID" w:eastAsia="en-ID"/>
         </w:rPr>
         <w:t>t</w:t>
@@ -1126,6 +1272,8 @@
       <w:r>
         <w:rPr>
           <w:rFonts w:ascii="Times New Roman" w:eastAsia="Times New Roman" w:hAnsi="Times New Roman" w:cs="Times New Roman"/>
+          <w:sz w:val="24"/>
+          <w:szCs w:val="24"/>
           <w:lang w:val="id-ID" w:eastAsia="en-ID"/>
         </w:rPr>
         <w:t>anggal</w:t>
@@ -1133,6 +1281,8 @@
       <w:r>
         <w:rPr>
           <w:rFonts w:ascii="Times New Roman" w:eastAsia="Times New Roman" w:hAnsi="Times New Roman" w:cs="Times New Roman"/>
+          <w:sz w:val="24"/>
+          <w:szCs w:val="24"/>
           <w:lang w:val="id-ID" w:eastAsia="en-ID"/>
         </w:rPr>
         <w:t>_</w:t>
@@ -1140,6 +1290,8 @@
       <w:r>
         <w:rPr>
           <w:rFonts w:ascii="Times New Roman" w:eastAsia="Times New Roman" w:hAnsi="Times New Roman" w:cs="Times New Roman"/>
+          <w:sz w:val="24"/>
+          <w:szCs w:val="24"/>
           <w:lang w:val="id-ID" w:eastAsia="en-ID"/>
         </w:rPr>
         <w:t>l</w:t>
@@ -1147,6 +1299,8 @@
       <w:r>
         <w:rPr>
           <w:rFonts w:ascii="Times New Roman" w:eastAsia="Times New Roman" w:hAnsi="Times New Roman" w:cs="Times New Roman"/>
+          <w:sz w:val="24"/>
+          <w:szCs w:val="24"/>
           <w:lang w:val="id-ID" w:eastAsia="en-ID"/>
         </w:rPr>
         <w:t>ahir}</w:t>
@@ -1157,12 +1311,16 @@
         <w:spacing w:after="0" w:line="240" w:lineRule="auto"/>
         <w:rPr>
           <w:rFonts w:ascii="Times New Roman" w:eastAsia="Times New Roman" w:hAnsi="Times New Roman" w:cs="Times New Roman"/>
-          <w:lang w:val="id-ID" w:eastAsia="en-ID"/>
-        </w:rPr>
-      </w:pPr>
-      <w:r>
-        <w:rPr>
-          <w:rFonts w:ascii="Times New Roman" w:eastAsia="Times New Roman" w:hAnsi="Times New Roman" w:cs="Times New Roman"/>
+          <w:sz w:val="24"/>
+          <w:szCs w:val="24"/>
+          <w:lang w:val="id-ID" w:eastAsia="en-ID"/>
+        </w:rPr>
+      </w:pPr>
+      <w:r>
+        <w:rPr>
+          <w:rFonts w:ascii="Times New Roman" w:eastAsia="Times New Roman" w:hAnsi="Times New Roman" w:cs="Times New Roman"/>
+          <w:sz w:val="24"/>
+          <w:szCs w:val="24"/>
           <w:lang w:val="id-ID" w:eastAsia="en-ID"/>
         </w:rPr>
         <w:t>Jenis Kelamin</w:t>
@@ -1170,13 +1328,17 @@
       <w:r>
         <w:rPr>
           <w:rFonts w:ascii="Times New Roman" w:eastAsia="Times New Roman" w:hAnsi="Times New Roman" w:cs="Times New Roman"/>
-          <w:lang w:val="id-ID" w:eastAsia="en-ID"/>
-        </w:rPr>
-        <w:tab/>
-      </w:r>
-      <w:r>
-        <w:rPr>
-          <w:rFonts w:ascii="Times New Roman" w:eastAsia="Times New Roman" w:hAnsi="Times New Roman" w:cs="Times New Roman"/>
+          <w:sz w:val="24"/>
+          <w:szCs w:val="24"/>
+          <w:lang w:val="id-ID" w:eastAsia="en-ID"/>
+        </w:rPr>
+        <w:tab/>
+      </w:r>
+      <w:r>
+        <w:rPr>
+          <w:rFonts w:ascii="Times New Roman" w:eastAsia="Times New Roman" w:hAnsi="Times New Roman" w:cs="Times New Roman"/>
+          <w:sz w:val="24"/>
+          <w:szCs w:val="24"/>
           <w:lang w:val="id-ID" w:eastAsia="en-ID"/>
         </w:rPr>
         <w:tab/>
@@ -1185,6 +1347,8 @@
       <w:r>
         <w:rPr>
           <w:rFonts w:ascii="Times New Roman" w:eastAsia="Times New Roman" w:hAnsi="Times New Roman" w:cs="Times New Roman"/>
+          <w:sz w:val="24"/>
+          <w:szCs w:val="24"/>
           <w:lang w:val="id-ID" w:eastAsia="en-ID"/>
         </w:rPr>
         <w:t>{jenisKelamin}</w:t>
@@ -1195,12 +1359,16 @@
         <w:spacing w:after="0" w:line="240" w:lineRule="auto"/>
         <w:rPr>
           <w:rFonts w:ascii="Times New Roman" w:eastAsia="Times New Roman" w:hAnsi="Times New Roman" w:cs="Times New Roman"/>
-          <w:lang w:val="id-ID" w:eastAsia="en-ID"/>
-        </w:rPr>
-      </w:pPr>
-      <w:r>
-        <w:rPr>
-          <w:rFonts w:ascii="Times New Roman" w:eastAsia="Times New Roman" w:hAnsi="Times New Roman" w:cs="Times New Roman"/>
+          <w:sz w:val="24"/>
+          <w:szCs w:val="24"/>
+          <w:lang w:val="id-ID" w:eastAsia="en-ID"/>
+        </w:rPr>
+      </w:pPr>
+      <w:r>
+        <w:rPr>
+          <w:rFonts w:ascii="Times New Roman" w:eastAsia="Times New Roman" w:hAnsi="Times New Roman" w:cs="Times New Roman"/>
+          <w:sz w:val="24"/>
+          <w:szCs w:val="24"/>
           <w:lang w:val="id-ID" w:eastAsia="en-ID"/>
         </w:rPr>
         <w:t>Status</w:t>
@@ -1208,20 +1376,26 @@
       <w:r>
         <w:rPr>
           <w:rFonts w:ascii="Times New Roman" w:eastAsia="Times New Roman" w:hAnsi="Times New Roman" w:cs="Times New Roman"/>
-          <w:lang w:val="id-ID" w:eastAsia="en-ID"/>
-        </w:rPr>
-        <w:tab/>
-      </w:r>
-      <w:r>
-        <w:rPr>
-          <w:rFonts w:ascii="Times New Roman" w:eastAsia="Times New Roman" w:hAnsi="Times New Roman" w:cs="Times New Roman"/>
-          <w:lang w:val="id-ID" w:eastAsia="en-ID"/>
-        </w:rPr>
-        <w:tab/>
-      </w:r>
-      <w:r>
-        <w:rPr>
-          <w:rFonts w:ascii="Times New Roman" w:eastAsia="Times New Roman" w:hAnsi="Times New Roman" w:cs="Times New Roman"/>
+          <w:sz w:val="24"/>
+          <w:szCs w:val="24"/>
+          <w:lang w:val="id-ID" w:eastAsia="en-ID"/>
+        </w:rPr>
+        <w:tab/>
+      </w:r>
+      <w:r>
+        <w:rPr>
+          <w:rFonts w:ascii="Times New Roman" w:eastAsia="Times New Roman" w:hAnsi="Times New Roman" w:cs="Times New Roman"/>
+          <w:sz w:val="24"/>
+          <w:szCs w:val="24"/>
+          <w:lang w:val="id-ID" w:eastAsia="en-ID"/>
+        </w:rPr>
+        <w:tab/>
+      </w:r>
+      <w:r>
+        <w:rPr>
+          <w:rFonts w:ascii="Times New Roman" w:eastAsia="Times New Roman" w:hAnsi="Times New Roman" w:cs="Times New Roman"/>
+          <w:sz w:val="24"/>
+          <w:szCs w:val="24"/>
           <w:lang w:val="id-ID" w:eastAsia="en-ID"/>
         </w:rPr>
         <w:tab/>
@@ -1230,6 +1404,8 @@
       <w:r>
         <w:rPr>
           <w:rFonts w:ascii="Times New Roman" w:eastAsia="Times New Roman" w:hAnsi="Times New Roman" w:cs="Times New Roman"/>
+          <w:sz w:val="24"/>
+          <w:szCs w:val="24"/>
           <w:lang w:val="id-ID" w:eastAsia="en-ID"/>
         </w:rPr>
         <w:t>{statusPerkawinan}</w:t>
@@ -1240,12 +1416,16 @@
         <w:spacing w:after="0" w:line="240" w:lineRule="auto"/>
         <w:rPr>
           <w:rFonts w:ascii="Times New Roman" w:eastAsia="Times New Roman" w:hAnsi="Times New Roman" w:cs="Times New Roman"/>
-          <w:lang w:val="id-ID" w:eastAsia="en-ID"/>
-        </w:rPr>
-      </w:pPr>
-      <w:r>
-        <w:rPr>
-          <w:rFonts w:ascii="Times New Roman" w:eastAsia="Times New Roman" w:hAnsi="Times New Roman" w:cs="Times New Roman"/>
+          <w:sz w:val="24"/>
+          <w:szCs w:val="24"/>
+          <w:lang w:val="id-ID" w:eastAsia="en-ID"/>
+        </w:rPr>
+      </w:pPr>
+      <w:r>
+        <w:rPr>
+          <w:rFonts w:ascii="Times New Roman" w:eastAsia="Times New Roman" w:hAnsi="Times New Roman" w:cs="Times New Roman"/>
+          <w:sz w:val="24"/>
+          <w:szCs w:val="24"/>
           <w:lang w:val="id-ID" w:eastAsia="en-ID"/>
         </w:rPr>
         <w:t>Agama</w:t>
@@ -1253,20 +1433,26 @@
       <w:r>
         <w:rPr>
           <w:rFonts w:ascii="Times New Roman" w:eastAsia="Times New Roman" w:hAnsi="Times New Roman" w:cs="Times New Roman"/>
-          <w:lang w:val="id-ID" w:eastAsia="en-ID"/>
-        </w:rPr>
-        <w:tab/>
-      </w:r>
-      <w:r>
-        <w:rPr>
-          <w:rFonts w:ascii="Times New Roman" w:eastAsia="Times New Roman" w:hAnsi="Times New Roman" w:cs="Times New Roman"/>
-          <w:lang w:val="id-ID" w:eastAsia="en-ID"/>
-        </w:rPr>
-        <w:tab/>
-      </w:r>
-      <w:r>
-        <w:rPr>
-          <w:rFonts w:ascii="Times New Roman" w:eastAsia="Times New Roman" w:hAnsi="Times New Roman" w:cs="Times New Roman"/>
+          <w:sz w:val="24"/>
+          <w:szCs w:val="24"/>
+          <w:lang w:val="id-ID" w:eastAsia="en-ID"/>
+        </w:rPr>
+        <w:tab/>
+      </w:r>
+      <w:r>
+        <w:rPr>
+          <w:rFonts w:ascii="Times New Roman" w:eastAsia="Times New Roman" w:hAnsi="Times New Roman" w:cs="Times New Roman"/>
+          <w:sz w:val="24"/>
+          <w:szCs w:val="24"/>
+          <w:lang w:val="id-ID" w:eastAsia="en-ID"/>
+        </w:rPr>
+        <w:tab/>
+      </w:r>
+      <w:r>
+        <w:rPr>
+          <w:rFonts w:ascii="Times New Roman" w:eastAsia="Times New Roman" w:hAnsi="Times New Roman" w:cs="Times New Roman"/>
+          <w:sz w:val="24"/>
+          <w:szCs w:val="24"/>
           <w:lang w:val="id-ID" w:eastAsia="en-ID"/>
         </w:rPr>
         <w:tab/>
@@ -1275,6 +1461,8 @@
       <w:r>
         <w:rPr>
           <w:rFonts w:ascii="Times New Roman" w:eastAsia="Times New Roman" w:hAnsi="Times New Roman" w:cs="Times New Roman"/>
+          <w:sz w:val="24"/>
+          <w:szCs w:val="24"/>
           <w:lang w:val="id-ID" w:eastAsia="en-ID"/>
         </w:rPr>
         <w:t>{agama}</w:t>
@@ -1285,12 +1473,16 @@
         <w:spacing w:after="0" w:line="240" w:lineRule="auto"/>
         <w:rPr>
           <w:rFonts w:ascii="Times New Roman" w:eastAsia="Times New Roman" w:hAnsi="Times New Roman" w:cs="Times New Roman"/>
-          <w:lang w:val="id-ID" w:eastAsia="en-ID"/>
-        </w:rPr>
-      </w:pPr>
-      <w:r>
-        <w:rPr>
-          <w:rFonts w:ascii="Times New Roman" w:eastAsia="Times New Roman" w:hAnsi="Times New Roman" w:cs="Times New Roman"/>
+          <w:sz w:val="24"/>
+          <w:szCs w:val="24"/>
+          <w:lang w:val="id-ID" w:eastAsia="en-ID"/>
+        </w:rPr>
+      </w:pPr>
+      <w:r>
+        <w:rPr>
+          <w:rFonts w:ascii="Times New Roman" w:eastAsia="Times New Roman" w:hAnsi="Times New Roman" w:cs="Times New Roman"/>
+          <w:sz w:val="24"/>
+          <w:szCs w:val="24"/>
           <w:lang w:val="id-ID" w:eastAsia="en-ID"/>
         </w:rPr>
         <w:t>Pekerjaan</w:t>
@@ -1298,13 +1490,17 @@
       <w:r>
         <w:rPr>
           <w:rFonts w:ascii="Times New Roman" w:eastAsia="Times New Roman" w:hAnsi="Times New Roman" w:cs="Times New Roman"/>
-          <w:lang w:val="id-ID" w:eastAsia="en-ID"/>
-        </w:rPr>
-        <w:tab/>
-      </w:r>
-      <w:r>
-        <w:rPr>
-          <w:rFonts w:ascii="Times New Roman" w:eastAsia="Times New Roman" w:hAnsi="Times New Roman" w:cs="Times New Roman"/>
+          <w:sz w:val="24"/>
+          <w:szCs w:val="24"/>
+          <w:lang w:val="id-ID" w:eastAsia="en-ID"/>
+        </w:rPr>
+        <w:tab/>
+      </w:r>
+      <w:r>
+        <w:rPr>
+          <w:rFonts w:ascii="Times New Roman" w:eastAsia="Times New Roman" w:hAnsi="Times New Roman" w:cs="Times New Roman"/>
+          <w:sz w:val="24"/>
+          <w:szCs w:val="24"/>
           <w:lang w:val="id-ID" w:eastAsia="en-ID"/>
         </w:rPr>
         <w:tab/>
@@ -1313,6 +1509,8 @@
       <w:r>
         <w:rPr>
           <w:rFonts w:ascii="Times New Roman" w:eastAsia="Times New Roman" w:hAnsi="Times New Roman" w:cs="Times New Roman"/>
+          <w:sz w:val="24"/>
+          <w:szCs w:val="24"/>
           <w:lang w:val="id-ID" w:eastAsia="en-ID"/>
         </w:rPr>
         <w:t>{pekerjaan}</w:t>
@@ -1323,34 +1521,44 @@
         <w:spacing w:after="0" w:line="240" w:lineRule="auto"/>
         <w:rPr>
           <w:rFonts w:ascii="Times New Roman" w:eastAsia="Times New Roman" w:hAnsi="Times New Roman" w:cs="Times New Roman"/>
-          <w:lang w:val="id-ID" w:eastAsia="en-ID"/>
-        </w:rPr>
-      </w:pPr>
-      <w:r>
-        <w:rPr>
-          <w:rFonts w:ascii="Times New Roman" w:eastAsia="Times New Roman" w:hAnsi="Times New Roman" w:cs="Times New Roman"/>
-          <w:lang w:eastAsia="en-ID"/>
+          <w:sz w:val="24"/>
+          <w:szCs w:val="24"/>
+          <w:lang w:val="id-ID" w:eastAsia="en-ID"/>
+        </w:rPr>
+      </w:pPr>
+      <w:r>
+        <w:rPr>
+          <w:rFonts w:ascii="Times New Roman" w:eastAsia="Times New Roman" w:hAnsi="Times New Roman" w:cs="Times New Roman"/>
+          <w:sz w:val="24"/>
+          <w:szCs w:val="24"/>
+          <w:lang w:val="id-ID" w:eastAsia="en-ID"/>
         </w:rPr>
         <w:t>Alamat</w:t>
       </w:r>
       <w:r>
         <w:rPr>
           <w:rFonts w:ascii="Times New Roman" w:eastAsia="Times New Roman" w:hAnsi="Times New Roman" w:cs="Times New Roman"/>
-          <w:lang w:eastAsia="en-ID"/>
-        </w:rPr>
-        <w:tab/>
-      </w:r>
-      <w:r>
-        <w:rPr>
-          <w:rFonts w:ascii="Times New Roman" w:eastAsia="Times New Roman" w:hAnsi="Times New Roman" w:cs="Times New Roman"/>
-          <w:lang w:eastAsia="en-ID"/>
-        </w:rPr>
-        <w:tab/>
-      </w:r>
-      <w:r>
-        <w:rPr>
-          <w:rFonts w:ascii="Times New Roman" w:eastAsia="Times New Roman" w:hAnsi="Times New Roman" w:cs="Times New Roman"/>
-          <w:lang w:eastAsia="en-ID"/>
+          <w:sz w:val="24"/>
+          <w:szCs w:val="24"/>
+          <w:lang w:val="id-ID" w:eastAsia="en-ID"/>
+        </w:rPr>
+        <w:tab/>
+      </w:r>
+      <w:r>
+        <w:rPr>
+          <w:rFonts w:ascii="Times New Roman" w:eastAsia="Times New Roman" w:hAnsi="Times New Roman" w:cs="Times New Roman"/>
+          <w:sz w:val="24"/>
+          <w:szCs w:val="24"/>
+          <w:lang w:val="id-ID" w:eastAsia="en-ID"/>
+        </w:rPr>
+        <w:tab/>
+      </w:r>
+      <w:r>
+        <w:rPr>
+          <w:rFonts w:ascii="Times New Roman" w:eastAsia="Times New Roman" w:hAnsi="Times New Roman" w:cs="Times New Roman"/>
+          <w:sz w:val="24"/>
+          <w:szCs w:val="24"/>
+          <w:lang w:val="id-ID" w:eastAsia="en-ID"/>
         </w:rPr>
         <w:tab/>
         <w:t xml:space="preserve">: </w:t>
@@ -1358,25 +1566,11 @@
       <w:r>
         <w:rPr>
           <w:rFonts w:ascii="Times New Roman" w:eastAsia="Times New Roman" w:hAnsi="Times New Roman" w:cs="Times New Roman"/>
-          <w:lang w:eastAsia="en-ID"/>
-        </w:rPr>
-        <w:t>{</w:t>
-      </w:r>
-      <w:proofErr w:type="spellStart"/>
-      <w:r>
-        <w:rPr>
-          <w:rFonts w:ascii="Times New Roman" w:eastAsia="Times New Roman" w:hAnsi="Times New Roman" w:cs="Times New Roman"/>
-          <w:lang w:eastAsia="en-ID"/>
-        </w:rPr>
-        <w:t>alamat</w:t>
-      </w:r>
-      <w:proofErr w:type="spellEnd"/>
-      <w:r>
-        <w:rPr>
-          <w:rFonts w:ascii="Times New Roman" w:eastAsia="Times New Roman" w:hAnsi="Times New Roman" w:cs="Times New Roman"/>
-          <w:lang w:eastAsia="en-ID"/>
-        </w:rPr>
-        <w:t>}</w:t>
+          <w:sz w:val="24"/>
+          <w:szCs w:val="24"/>
+          <w:lang w:val="id-ID" w:eastAsia="en-ID"/>
+        </w:rPr>
+        <w:t>{alamat}</w:t>
       </w:r>
     </w:p>
     <w:p>
@@ -1384,7 +1578,9 @@
         <w:spacing w:after="0" w:line="240" w:lineRule="auto"/>
         <w:rPr>
           <w:rFonts w:ascii="Times New Roman" w:eastAsia="Times New Roman" w:hAnsi="Times New Roman" w:cs="Times New Roman"/>
-          <w:lang w:eastAsia="en-ID"/>
+          <w:sz w:val="24"/>
+          <w:szCs w:val="24"/>
+          <w:lang w:val="id-ID" w:eastAsia="en-ID"/>
         </w:rPr>
       </w:pPr>
     </w:p>
@@ -1397,6 +1593,8 @@
           <w:bCs/>
           <w:i/>
           <w:iCs/>
+          <w:sz w:val="24"/>
+          <w:szCs w:val="24"/>
           <w:lang w:val="id-ID" w:eastAsia="en-ID"/>
         </w:rPr>
       </w:pPr>
@@ -1407,6 +1605,8 @@
           <w:bCs/>
           <w:i/>
           <w:iCs/>
+          <w:sz w:val="24"/>
+          <w:szCs w:val="24"/>
           <w:lang w:eastAsia="en-ID"/>
         </w:rPr>
         <w:t xml:space="preserve">Nama </w:t>
@@ -1419,6 +1619,8 @@
           <w:bCs/>
           <w:i/>
           <w:iCs/>
+          <w:sz w:val="24"/>
+          <w:szCs w:val="24"/>
           <w:lang w:eastAsia="en-ID"/>
         </w:rPr>
         <w:t>Dalam</w:t>
@@ -1431,6 +1633,8 @@
           <w:bCs/>
           <w:i/>
           <w:iCs/>
+          <w:sz w:val="24"/>
+          <w:szCs w:val="24"/>
           <w:lang w:eastAsia="en-ID"/>
         </w:rPr>
         <w:t xml:space="preserve"> </w:t>
@@ -1442,6 +1646,8 @@
           <w:bCs/>
           <w:i/>
           <w:iCs/>
+          <w:sz w:val="24"/>
+          <w:szCs w:val="24"/>
           <w:lang w:val="id-ID" w:eastAsia="en-ID"/>
         </w:rPr>
         <w:t>Kartu Tanda Penduduk (KTP)</w:t>
@@ -1452,34 +1658,44 @@
         <w:spacing w:after="0" w:line="240" w:lineRule="auto"/>
         <w:rPr>
           <w:rFonts w:ascii="Times New Roman" w:eastAsia="Times New Roman" w:hAnsi="Times New Roman" w:cs="Times New Roman"/>
-          <w:lang w:val="id-ID" w:eastAsia="en-ID"/>
-        </w:rPr>
-      </w:pPr>
-      <w:r>
-        <w:rPr>
-          <w:rFonts w:ascii="Times New Roman" w:eastAsia="Times New Roman" w:hAnsi="Times New Roman" w:cs="Times New Roman"/>
-          <w:lang w:eastAsia="en-ID"/>
+          <w:sz w:val="24"/>
+          <w:szCs w:val="24"/>
+          <w:lang w:val="id-ID" w:eastAsia="en-ID"/>
+        </w:rPr>
+      </w:pPr>
+      <w:r>
+        <w:rPr>
+          <w:rFonts w:ascii="Times New Roman" w:eastAsia="Times New Roman" w:hAnsi="Times New Roman" w:cs="Times New Roman"/>
+          <w:sz w:val="24"/>
+          <w:szCs w:val="24"/>
+          <w:lang w:val="id-ID" w:eastAsia="en-ID"/>
         </w:rPr>
         <w:t>Nama</w:t>
       </w:r>
       <w:r>
         <w:rPr>
           <w:rFonts w:ascii="Times New Roman" w:eastAsia="Times New Roman" w:hAnsi="Times New Roman" w:cs="Times New Roman"/>
-          <w:lang w:eastAsia="en-ID"/>
-        </w:rPr>
-        <w:tab/>
-      </w:r>
-      <w:r>
-        <w:rPr>
-          <w:rFonts w:ascii="Times New Roman" w:eastAsia="Times New Roman" w:hAnsi="Times New Roman" w:cs="Times New Roman"/>
-          <w:lang w:eastAsia="en-ID"/>
-        </w:rPr>
-        <w:tab/>
-      </w:r>
-      <w:r>
-        <w:rPr>
-          <w:rFonts w:ascii="Times New Roman" w:eastAsia="Times New Roman" w:hAnsi="Times New Roman" w:cs="Times New Roman"/>
-          <w:lang w:eastAsia="en-ID"/>
+          <w:sz w:val="24"/>
+          <w:szCs w:val="24"/>
+          <w:lang w:val="id-ID" w:eastAsia="en-ID"/>
+        </w:rPr>
+        <w:tab/>
+      </w:r>
+      <w:r>
+        <w:rPr>
+          <w:rFonts w:ascii="Times New Roman" w:eastAsia="Times New Roman" w:hAnsi="Times New Roman" w:cs="Times New Roman"/>
+          <w:sz w:val="24"/>
+          <w:szCs w:val="24"/>
+          <w:lang w:val="id-ID" w:eastAsia="en-ID"/>
+        </w:rPr>
+        <w:tab/>
+      </w:r>
+      <w:r>
+        <w:rPr>
+          <w:rFonts w:ascii="Times New Roman" w:eastAsia="Times New Roman" w:hAnsi="Times New Roman" w:cs="Times New Roman"/>
+          <w:sz w:val="24"/>
+          <w:szCs w:val="24"/>
+          <w:lang w:val="id-ID" w:eastAsia="en-ID"/>
         </w:rPr>
         <w:tab/>
         <w:t xml:space="preserve">: </w:t>
@@ -1487,7 +1703,9 @@
       <w:r>
         <w:rPr>
           <w:rFonts w:ascii="Times New Roman" w:eastAsia="Times New Roman" w:hAnsi="Times New Roman" w:cs="Times New Roman"/>
-          <w:lang w:eastAsia="en-ID"/>
+          <w:sz w:val="24"/>
+          <w:szCs w:val="24"/>
+          <w:lang w:val="id-ID" w:eastAsia="en-ID"/>
         </w:rPr>
         <w:t>{</w:t>
       </w:r>
@@ -1495,7 +1713,9 @@
       <w:r>
         <w:rPr>
           <w:rFonts w:ascii="Times New Roman" w:eastAsia="Times New Roman" w:hAnsi="Times New Roman" w:cs="Times New Roman"/>
-          <w:lang w:eastAsia="en-ID"/>
+          <w:sz w:val="24"/>
+          <w:szCs w:val="24"/>
+          <w:lang w:val="id-ID" w:eastAsia="en-ID"/>
         </w:rPr>
         <w:t>namaKtp</w:t>
       </w:r>
@@ -1503,7 +1723,9 @@
       <w:r>
         <w:rPr>
           <w:rFonts w:ascii="Times New Roman" w:eastAsia="Times New Roman" w:hAnsi="Times New Roman" w:cs="Times New Roman"/>
-          <w:lang w:eastAsia="en-ID"/>
+          <w:sz w:val="24"/>
+          <w:szCs w:val="24"/>
+          <w:lang w:val="id-ID" w:eastAsia="en-ID"/>
         </w:rPr>
         <w:t>}</w:t>
       </w:r>
@@ -1513,12 +1735,16 @@
         <w:spacing w:after="0" w:line="240" w:lineRule="auto"/>
         <w:rPr>
           <w:rFonts w:ascii="Times New Roman" w:eastAsia="Times New Roman" w:hAnsi="Times New Roman" w:cs="Times New Roman"/>
-          <w:lang w:val="id-ID" w:eastAsia="en-ID"/>
-        </w:rPr>
-      </w:pPr>
-      <w:r>
-        <w:rPr>
-          <w:rFonts w:ascii="Times New Roman" w:eastAsia="Times New Roman" w:hAnsi="Times New Roman" w:cs="Times New Roman"/>
+          <w:sz w:val="24"/>
+          <w:szCs w:val="24"/>
+          <w:lang w:val="id-ID" w:eastAsia="en-ID"/>
+        </w:rPr>
+      </w:pPr>
+      <w:r>
+        <w:rPr>
+          <w:rFonts w:ascii="Times New Roman" w:eastAsia="Times New Roman" w:hAnsi="Times New Roman" w:cs="Times New Roman"/>
+          <w:sz w:val="24"/>
+          <w:szCs w:val="24"/>
           <w:lang w:val="id-ID" w:eastAsia="en-ID"/>
         </w:rPr>
         <w:t xml:space="preserve">Nik </w:t>
@@ -1526,20 +1752,26 @@
       <w:r>
         <w:rPr>
           <w:rFonts w:ascii="Times New Roman" w:eastAsia="Times New Roman" w:hAnsi="Times New Roman" w:cs="Times New Roman"/>
-          <w:lang w:val="id-ID" w:eastAsia="en-ID"/>
-        </w:rPr>
-        <w:tab/>
-      </w:r>
-      <w:r>
-        <w:rPr>
-          <w:rFonts w:ascii="Times New Roman" w:eastAsia="Times New Roman" w:hAnsi="Times New Roman" w:cs="Times New Roman"/>
-          <w:lang w:val="id-ID" w:eastAsia="en-ID"/>
-        </w:rPr>
-        <w:tab/>
-      </w:r>
-      <w:r>
-        <w:rPr>
-          <w:rFonts w:ascii="Times New Roman" w:eastAsia="Times New Roman" w:hAnsi="Times New Roman" w:cs="Times New Roman"/>
+          <w:sz w:val="24"/>
+          <w:szCs w:val="24"/>
+          <w:lang w:val="id-ID" w:eastAsia="en-ID"/>
+        </w:rPr>
+        <w:tab/>
+      </w:r>
+      <w:r>
+        <w:rPr>
+          <w:rFonts w:ascii="Times New Roman" w:eastAsia="Times New Roman" w:hAnsi="Times New Roman" w:cs="Times New Roman"/>
+          <w:sz w:val="24"/>
+          <w:szCs w:val="24"/>
+          <w:lang w:val="id-ID" w:eastAsia="en-ID"/>
+        </w:rPr>
+        <w:tab/>
+      </w:r>
+      <w:r>
+        <w:rPr>
+          <w:rFonts w:ascii="Times New Roman" w:eastAsia="Times New Roman" w:hAnsi="Times New Roman" w:cs="Times New Roman"/>
+          <w:sz w:val="24"/>
+          <w:szCs w:val="24"/>
           <w:lang w:val="id-ID" w:eastAsia="en-ID"/>
         </w:rPr>
         <w:tab/>
@@ -1548,6 +1780,8 @@
       <w:r>
         <w:rPr>
           <w:rFonts w:ascii="Times New Roman" w:eastAsia="Times New Roman" w:hAnsi="Times New Roman" w:cs="Times New Roman"/>
+          <w:sz w:val="24"/>
+          <w:szCs w:val="24"/>
           <w:lang w:val="id-ID" w:eastAsia="en-ID"/>
         </w:rPr>
         <w:t>{nik}</w:t>
@@ -1558,12 +1792,16 @@
         <w:spacing w:after="0" w:line="240" w:lineRule="auto"/>
         <w:rPr>
           <w:rFonts w:ascii="Times New Roman" w:eastAsia="Times New Roman" w:hAnsi="Times New Roman" w:cs="Times New Roman"/>
-          <w:lang w:val="id-ID" w:eastAsia="en-ID"/>
-        </w:rPr>
-      </w:pPr>
-      <w:r>
-        <w:rPr>
-          <w:rFonts w:ascii="Times New Roman" w:eastAsia="Times New Roman" w:hAnsi="Times New Roman" w:cs="Times New Roman"/>
+          <w:sz w:val="24"/>
+          <w:szCs w:val="24"/>
+          <w:lang w:val="id-ID" w:eastAsia="en-ID"/>
+        </w:rPr>
+      </w:pPr>
+      <w:r>
+        <w:rPr>
+          <w:rFonts w:ascii="Times New Roman" w:eastAsia="Times New Roman" w:hAnsi="Times New Roman" w:cs="Times New Roman"/>
+          <w:sz w:val="24"/>
+          <w:szCs w:val="24"/>
           <w:lang w:val="id-ID" w:eastAsia="en-ID"/>
         </w:rPr>
         <w:t>Tempat/Tgl lahir</w:t>
@@ -1571,6 +1809,8 @@
       <w:r>
         <w:rPr>
           <w:rFonts w:ascii="Times New Roman" w:eastAsia="Times New Roman" w:hAnsi="Times New Roman" w:cs="Times New Roman"/>
+          <w:sz w:val="24"/>
+          <w:szCs w:val="24"/>
           <w:lang w:val="id-ID" w:eastAsia="en-ID"/>
         </w:rPr>
         <w:tab/>
@@ -1579,6 +1819,8 @@
       <w:r>
         <w:rPr>
           <w:rFonts w:ascii="Times New Roman" w:eastAsia="Times New Roman" w:hAnsi="Times New Roman" w:cs="Times New Roman"/>
+          <w:sz w:val="24"/>
+          <w:szCs w:val="24"/>
           <w:lang w:val="id-ID" w:eastAsia="en-ID"/>
         </w:rPr>
         <w:t>{tempat</w:t>
@@ -1586,6 +1828,8 @@
       <w:r>
         <w:rPr>
           <w:rFonts w:ascii="Times New Roman" w:eastAsia="Times New Roman" w:hAnsi="Times New Roman" w:cs="Times New Roman"/>
+          <w:sz w:val="24"/>
+          <w:szCs w:val="24"/>
           <w:lang w:val="id-ID" w:eastAsia="en-ID"/>
         </w:rPr>
         <w:t>_</w:t>
@@ -1593,6 +1837,8 @@
       <w:r>
         <w:rPr>
           <w:rFonts w:ascii="Times New Roman" w:eastAsia="Times New Roman" w:hAnsi="Times New Roman" w:cs="Times New Roman"/>
+          <w:sz w:val="24"/>
+          <w:szCs w:val="24"/>
           <w:lang w:val="id-ID" w:eastAsia="en-ID"/>
         </w:rPr>
         <w:t>t</w:t>
@@ -1600,6 +1846,8 @@
       <w:r>
         <w:rPr>
           <w:rFonts w:ascii="Times New Roman" w:eastAsia="Times New Roman" w:hAnsi="Times New Roman" w:cs="Times New Roman"/>
+          <w:sz w:val="24"/>
+          <w:szCs w:val="24"/>
           <w:lang w:val="id-ID" w:eastAsia="en-ID"/>
         </w:rPr>
         <w:t>anggal</w:t>
@@ -1607,6 +1855,8 @@
       <w:r>
         <w:rPr>
           <w:rFonts w:ascii="Times New Roman" w:eastAsia="Times New Roman" w:hAnsi="Times New Roman" w:cs="Times New Roman"/>
+          <w:sz w:val="24"/>
+          <w:szCs w:val="24"/>
           <w:lang w:val="id-ID" w:eastAsia="en-ID"/>
         </w:rPr>
         <w:t>_</w:t>
@@ -1614,6 +1864,8 @@
       <w:r>
         <w:rPr>
           <w:rFonts w:ascii="Times New Roman" w:eastAsia="Times New Roman" w:hAnsi="Times New Roman" w:cs="Times New Roman"/>
+          <w:sz w:val="24"/>
+          <w:szCs w:val="24"/>
           <w:lang w:val="id-ID" w:eastAsia="en-ID"/>
         </w:rPr>
         <w:t>l</w:t>
@@ -1621,6 +1873,8 @@
       <w:r>
         <w:rPr>
           <w:rFonts w:ascii="Times New Roman" w:eastAsia="Times New Roman" w:hAnsi="Times New Roman" w:cs="Times New Roman"/>
+          <w:sz w:val="24"/>
+          <w:szCs w:val="24"/>
           <w:lang w:val="id-ID" w:eastAsia="en-ID"/>
         </w:rPr>
         <w:t>ahir}</w:t>
@@ -1631,12 +1885,16 @@
         <w:spacing w:after="0" w:line="240" w:lineRule="auto"/>
         <w:rPr>
           <w:rFonts w:ascii="Times New Roman" w:eastAsia="Times New Roman" w:hAnsi="Times New Roman" w:cs="Times New Roman"/>
-          <w:lang w:val="id-ID" w:eastAsia="en-ID"/>
-        </w:rPr>
-      </w:pPr>
-      <w:r>
-        <w:rPr>
-          <w:rFonts w:ascii="Times New Roman" w:eastAsia="Times New Roman" w:hAnsi="Times New Roman" w:cs="Times New Roman"/>
+          <w:sz w:val="24"/>
+          <w:szCs w:val="24"/>
+          <w:lang w:val="id-ID" w:eastAsia="en-ID"/>
+        </w:rPr>
+      </w:pPr>
+      <w:r>
+        <w:rPr>
+          <w:rFonts w:ascii="Times New Roman" w:eastAsia="Times New Roman" w:hAnsi="Times New Roman" w:cs="Times New Roman"/>
+          <w:sz w:val="24"/>
+          <w:szCs w:val="24"/>
           <w:lang w:val="id-ID" w:eastAsia="en-ID"/>
         </w:rPr>
         <w:t>Jenis Kelamin</w:t>
@@ -1644,13 +1902,17 @@
       <w:r>
         <w:rPr>
           <w:rFonts w:ascii="Times New Roman" w:eastAsia="Times New Roman" w:hAnsi="Times New Roman" w:cs="Times New Roman"/>
-          <w:lang w:val="id-ID" w:eastAsia="en-ID"/>
-        </w:rPr>
-        <w:tab/>
-      </w:r>
-      <w:r>
-        <w:rPr>
-          <w:rFonts w:ascii="Times New Roman" w:eastAsia="Times New Roman" w:hAnsi="Times New Roman" w:cs="Times New Roman"/>
+          <w:sz w:val="24"/>
+          <w:szCs w:val="24"/>
+          <w:lang w:val="id-ID" w:eastAsia="en-ID"/>
+        </w:rPr>
+        <w:tab/>
+      </w:r>
+      <w:r>
+        <w:rPr>
+          <w:rFonts w:ascii="Times New Roman" w:eastAsia="Times New Roman" w:hAnsi="Times New Roman" w:cs="Times New Roman"/>
+          <w:sz w:val="24"/>
+          <w:szCs w:val="24"/>
           <w:lang w:val="id-ID" w:eastAsia="en-ID"/>
         </w:rPr>
         <w:tab/>
@@ -1659,6 +1921,8 @@
       <w:r>
         <w:rPr>
           <w:rFonts w:ascii="Times New Roman" w:eastAsia="Times New Roman" w:hAnsi="Times New Roman" w:cs="Times New Roman"/>
+          <w:sz w:val="24"/>
+          <w:szCs w:val="24"/>
           <w:lang w:val="id-ID" w:eastAsia="en-ID"/>
         </w:rPr>
         <w:t>{jenisKelamin}</w:t>
@@ -1669,12 +1933,16 @@
         <w:spacing w:after="0" w:line="240" w:lineRule="auto"/>
         <w:rPr>
           <w:rFonts w:ascii="Times New Roman" w:eastAsia="Times New Roman" w:hAnsi="Times New Roman" w:cs="Times New Roman"/>
-          <w:lang w:val="id-ID" w:eastAsia="en-ID"/>
-        </w:rPr>
-      </w:pPr>
-      <w:r>
-        <w:rPr>
-          <w:rFonts w:ascii="Times New Roman" w:eastAsia="Times New Roman" w:hAnsi="Times New Roman" w:cs="Times New Roman"/>
+          <w:sz w:val="24"/>
+          <w:szCs w:val="24"/>
+          <w:lang w:val="id-ID" w:eastAsia="en-ID"/>
+        </w:rPr>
+      </w:pPr>
+      <w:r>
+        <w:rPr>
+          <w:rFonts w:ascii="Times New Roman" w:eastAsia="Times New Roman" w:hAnsi="Times New Roman" w:cs="Times New Roman"/>
+          <w:sz w:val="24"/>
+          <w:szCs w:val="24"/>
           <w:lang w:val="id-ID" w:eastAsia="en-ID"/>
         </w:rPr>
         <w:t>Status</w:t>
@@ -1682,20 +1950,26 @@
       <w:r>
         <w:rPr>
           <w:rFonts w:ascii="Times New Roman" w:eastAsia="Times New Roman" w:hAnsi="Times New Roman" w:cs="Times New Roman"/>
-          <w:lang w:val="id-ID" w:eastAsia="en-ID"/>
-        </w:rPr>
-        <w:tab/>
-      </w:r>
-      <w:r>
-        <w:rPr>
-          <w:rFonts w:ascii="Times New Roman" w:eastAsia="Times New Roman" w:hAnsi="Times New Roman" w:cs="Times New Roman"/>
-          <w:lang w:val="id-ID" w:eastAsia="en-ID"/>
-        </w:rPr>
-        <w:tab/>
-      </w:r>
-      <w:r>
-        <w:rPr>
-          <w:rFonts w:ascii="Times New Roman" w:eastAsia="Times New Roman" w:hAnsi="Times New Roman" w:cs="Times New Roman"/>
+          <w:sz w:val="24"/>
+          <w:szCs w:val="24"/>
+          <w:lang w:val="id-ID" w:eastAsia="en-ID"/>
+        </w:rPr>
+        <w:tab/>
+      </w:r>
+      <w:r>
+        <w:rPr>
+          <w:rFonts w:ascii="Times New Roman" w:eastAsia="Times New Roman" w:hAnsi="Times New Roman" w:cs="Times New Roman"/>
+          <w:sz w:val="24"/>
+          <w:szCs w:val="24"/>
+          <w:lang w:val="id-ID" w:eastAsia="en-ID"/>
+        </w:rPr>
+        <w:tab/>
+      </w:r>
+      <w:r>
+        <w:rPr>
+          <w:rFonts w:ascii="Times New Roman" w:eastAsia="Times New Roman" w:hAnsi="Times New Roman" w:cs="Times New Roman"/>
+          <w:sz w:val="24"/>
+          <w:szCs w:val="24"/>
           <w:lang w:val="id-ID" w:eastAsia="en-ID"/>
         </w:rPr>
         <w:tab/>
@@ -1704,6 +1978,8 @@
       <w:r>
         <w:rPr>
           <w:rFonts w:ascii="Times New Roman" w:eastAsia="Times New Roman" w:hAnsi="Times New Roman" w:cs="Times New Roman"/>
+          <w:sz w:val="24"/>
+          <w:szCs w:val="24"/>
           <w:lang w:val="id-ID" w:eastAsia="en-ID"/>
         </w:rPr>
         <w:t>{statusPerkawinan}</w:t>
@@ -1714,12 +1990,16 @@
         <w:spacing w:after="0" w:line="240" w:lineRule="auto"/>
         <w:rPr>
           <w:rFonts w:ascii="Times New Roman" w:eastAsia="Times New Roman" w:hAnsi="Times New Roman" w:cs="Times New Roman"/>
-          <w:lang w:val="id-ID" w:eastAsia="en-ID"/>
-        </w:rPr>
-      </w:pPr>
-      <w:r>
-        <w:rPr>
-          <w:rFonts w:ascii="Times New Roman" w:eastAsia="Times New Roman" w:hAnsi="Times New Roman" w:cs="Times New Roman"/>
+          <w:sz w:val="24"/>
+          <w:szCs w:val="24"/>
+          <w:lang w:val="id-ID" w:eastAsia="en-ID"/>
+        </w:rPr>
+      </w:pPr>
+      <w:r>
+        <w:rPr>
+          <w:rFonts w:ascii="Times New Roman" w:eastAsia="Times New Roman" w:hAnsi="Times New Roman" w:cs="Times New Roman"/>
+          <w:sz w:val="24"/>
+          <w:szCs w:val="24"/>
           <w:lang w:val="id-ID" w:eastAsia="en-ID"/>
         </w:rPr>
         <w:t>Agama</w:t>
@@ -1727,20 +2007,26 @@
       <w:r>
         <w:rPr>
           <w:rFonts w:ascii="Times New Roman" w:eastAsia="Times New Roman" w:hAnsi="Times New Roman" w:cs="Times New Roman"/>
-          <w:lang w:val="id-ID" w:eastAsia="en-ID"/>
-        </w:rPr>
-        <w:tab/>
-      </w:r>
-      <w:r>
-        <w:rPr>
-          <w:rFonts w:ascii="Times New Roman" w:eastAsia="Times New Roman" w:hAnsi="Times New Roman" w:cs="Times New Roman"/>
-          <w:lang w:val="id-ID" w:eastAsia="en-ID"/>
-        </w:rPr>
-        <w:tab/>
-      </w:r>
-      <w:r>
-        <w:rPr>
-          <w:rFonts w:ascii="Times New Roman" w:eastAsia="Times New Roman" w:hAnsi="Times New Roman" w:cs="Times New Roman"/>
+          <w:sz w:val="24"/>
+          <w:szCs w:val="24"/>
+          <w:lang w:val="id-ID" w:eastAsia="en-ID"/>
+        </w:rPr>
+        <w:tab/>
+      </w:r>
+      <w:r>
+        <w:rPr>
+          <w:rFonts w:ascii="Times New Roman" w:eastAsia="Times New Roman" w:hAnsi="Times New Roman" w:cs="Times New Roman"/>
+          <w:sz w:val="24"/>
+          <w:szCs w:val="24"/>
+          <w:lang w:val="id-ID" w:eastAsia="en-ID"/>
+        </w:rPr>
+        <w:tab/>
+      </w:r>
+      <w:r>
+        <w:rPr>
+          <w:rFonts w:ascii="Times New Roman" w:eastAsia="Times New Roman" w:hAnsi="Times New Roman" w:cs="Times New Roman"/>
+          <w:sz w:val="24"/>
+          <w:szCs w:val="24"/>
           <w:lang w:val="id-ID" w:eastAsia="en-ID"/>
         </w:rPr>
         <w:tab/>
@@ -1749,6 +2035,8 @@
       <w:r>
         <w:rPr>
           <w:rFonts w:ascii="Times New Roman" w:eastAsia="Times New Roman" w:hAnsi="Times New Roman" w:cs="Times New Roman"/>
+          <w:sz w:val="24"/>
+          <w:szCs w:val="24"/>
           <w:lang w:val="id-ID" w:eastAsia="en-ID"/>
         </w:rPr>
         <w:t>{agama}</w:t>
@@ -1759,12 +2047,16 @@
         <w:spacing w:after="0" w:line="240" w:lineRule="auto"/>
         <w:rPr>
           <w:rFonts w:ascii="Times New Roman" w:eastAsia="Times New Roman" w:hAnsi="Times New Roman" w:cs="Times New Roman"/>
-          <w:lang w:val="id-ID" w:eastAsia="en-ID"/>
-        </w:rPr>
-      </w:pPr>
-      <w:r>
-        <w:rPr>
-          <w:rFonts w:ascii="Times New Roman" w:eastAsia="Times New Roman" w:hAnsi="Times New Roman" w:cs="Times New Roman"/>
+          <w:sz w:val="24"/>
+          <w:szCs w:val="24"/>
+          <w:lang w:val="id-ID" w:eastAsia="en-ID"/>
+        </w:rPr>
+      </w:pPr>
+      <w:r>
+        <w:rPr>
+          <w:rFonts w:ascii="Times New Roman" w:eastAsia="Times New Roman" w:hAnsi="Times New Roman" w:cs="Times New Roman"/>
+          <w:sz w:val="24"/>
+          <w:szCs w:val="24"/>
           <w:lang w:val="id-ID" w:eastAsia="en-ID"/>
         </w:rPr>
         <w:t>Pekerjaan</w:t>
@@ -1772,13 +2064,17 @@
       <w:r>
         <w:rPr>
           <w:rFonts w:ascii="Times New Roman" w:eastAsia="Times New Roman" w:hAnsi="Times New Roman" w:cs="Times New Roman"/>
-          <w:lang w:val="id-ID" w:eastAsia="en-ID"/>
-        </w:rPr>
-        <w:tab/>
-      </w:r>
-      <w:r>
-        <w:rPr>
-          <w:rFonts w:ascii="Times New Roman" w:eastAsia="Times New Roman" w:hAnsi="Times New Roman" w:cs="Times New Roman"/>
+          <w:sz w:val="24"/>
+          <w:szCs w:val="24"/>
+          <w:lang w:val="id-ID" w:eastAsia="en-ID"/>
+        </w:rPr>
+        <w:tab/>
+      </w:r>
+      <w:r>
+        <w:rPr>
+          <w:rFonts w:ascii="Times New Roman" w:eastAsia="Times New Roman" w:hAnsi="Times New Roman" w:cs="Times New Roman"/>
+          <w:sz w:val="24"/>
+          <w:szCs w:val="24"/>
           <w:lang w:val="id-ID" w:eastAsia="en-ID"/>
         </w:rPr>
         <w:tab/>
@@ -1787,6 +2083,8 @@
       <w:r>
         <w:rPr>
           <w:rFonts w:ascii="Times New Roman" w:eastAsia="Times New Roman" w:hAnsi="Times New Roman" w:cs="Times New Roman"/>
+          <w:sz w:val="24"/>
+          <w:szCs w:val="24"/>
           <w:lang w:val="id-ID" w:eastAsia="en-ID"/>
         </w:rPr>
         <w:t>{pekerjaan}</w:t>
@@ -1797,34 +2095,44 @@
         <w:spacing w:after="0" w:line="240" w:lineRule="auto"/>
         <w:rPr>
           <w:rFonts w:ascii="Times New Roman" w:eastAsia="Times New Roman" w:hAnsi="Times New Roman" w:cs="Times New Roman"/>
-          <w:lang w:val="id-ID" w:eastAsia="en-ID"/>
-        </w:rPr>
-      </w:pPr>
-      <w:r>
-        <w:rPr>
-          <w:rFonts w:ascii="Times New Roman" w:eastAsia="Times New Roman" w:hAnsi="Times New Roman" w:cs="Times New Roman"/>
-          <w:lang w:eastAsia="en-ID"/>
+          <w:sz w:val="24"/>
+          <w:szCs w:val="24"/>
+          <w:lang w:val="id-ID" w:eastAsia="en-ID"/>
+        </w:rPr>
+      </w:pPr>
+      <w:r>
+        <w:rPr>
+          <w:rFonts w:ascii="Times New Roman" w:eastAsia="Times New Roman" w:hAnsi="Times New Roman" w:cs="Times New Roman"/>
+          <w:sz w:val="24"/>
+          <w:szCs w:val="24"/>
+          <w:lang w:val="id-ID" w:eastAsia="en-ID"/>
         </w:rPr>
         <w:t>Alamat</w:t>
       </w:r>
       <w:r>
         <w:rPr>
           <w:rFonts w:ascii="Times New Roman" w:eastAsia="Times New Roman" w:hAnsi="Times New Roman" w:cs="Times New Roman"/>
-          <w:lang w:eastAsia="en-ID"/>
-        </w:rPr>
-        <w:tab/>
-      </w:r>
-      <w:r>
-        <w:rPr>
-          <w:rFonts w:ascii="Times New Roman" w:eastAsia="Times New Roman" w:hAnsi="Times New Roman" w:cs="Times New Roman"/>
-          <w:lang w:eastAsia="en-ID"/>
-        </w:rPr>
-        <w:tab/>
-      </w:r>
-      <w:r>
-        <w:rPr>
-          <w:rFonts w:ascii="Times New Roman" w:eastAsia="Times New Roman" w:hAnsi="Times New Roman" w:cs="Times New Roman"/>
-          <w:lang w:eastAsia="en-ID"/>
+          <w:sz w:val="24"/>
+          <w:szCs w:val="24"/>
+          <w:lang w:val="id-ID" w:eastAsia="en-ID"/>
+        </w:rPr>
+        <w:tab/>
+      </w:r>
+      <w:r>
+        <w:rPr>
+          <w:rFonts w:ascii="Times New Roman" w:eastAsia="Times New Roman" w:hAnsi="Times New Roman" w:cs="Times New Roman"/>
+          <w:sz w:val="24"/>
+          <w:szCs w:val="24"/>
+          <w:lang w:val="id-ID" w:eastAsia="en-ID"/>
+        </w:rPr>
+        <w:tab/>
+      </w:r>
+      <w:r>
+        <w:rPr>
+          <w:rFonts w:ascii="Times New Roman" w:eastAsia="Times New Roman" w:hAnsi="Times New Roman" w:cs="Times New Roman"/>
+          <w:sz w:val="24"/>
+          <w:szCs w:val="24"/>
+          <w:lang w:val="id-ID" w:eastAsia="en-ID"/>
         </w:rPr>
         <w:tab/>
         <w:t xml:space="preserve">: </w:t>
@@ -1832,25 +2140,11 @@
       <w:r>
         <w:rPr>
           <w:rFonts w:ascii="Times New Roman" w:eastAsia="Times New Roman" w:hAnsi="Times New Roman" w:cs="Times New Roman"/>
-          <w:lang w:eastAsia="en-ID"/>
-        </w:rPr>
-        <w:t>{</w:t>
-      </w:r>
-      <w:proofErr w:type="spellStart"/>
-      <w:r>
-        <w:rPr>
-          <w:rFonts w:ascii="Times New Roman" w:eastAsia="Times New Roman" w:hAnsi="Times New Roman" w:cs="Times New Roman"/>
-          <w:lang w:eastAsia="en-ID"/>
-        </w:rPr>
-        <w:t>alamat</w:t>
-      </w:r>
-      <w:proofErr w:type="spellEnd"/>
-      <w:r>
-        <w:rPr>
-          <w:rFonts w:ascii="Times New Roman" w:eastAsia="Times New Roman" w:hAnsi="Times New Roman" w:cs="Times New Roman"/>
-          <w:lang w:eastAsia="en-ID"/>
-        </w:rPr>
-        <w:t>}</w:t>
+          <w:sz w:val="24"/>
+          <w:szCs w:val="24"/>
+          <w:lang w:val="id-ID" w:eastAsia="en-ID"/>
+        </w:rPr>
+        <w:t>{alamat}</w:t>
       </w:r>
     </w:p>
     <w:p>
@@ -1858,7 +2152,9 @@
         <w:spacing w:after="0" w:line="240" w:lineRule="auto"/>
         <w:rPr>
           <w:rFonts w:ascii="Times New Roman" w:eastAsia="Times New Roman" w:hAnsi="Times New Roman" w:cs="Times New Roman"/>
-          <w:lang w:eastAsia="en-ID"/>
+          <w:sz w:val="24"/>
+          <w:szCs w:val="24"/>
+          <w:lang w:val="id-ID" w:eastAsia="en-ID"/>
         </w:rPr>
       </w:pPr>
     </w:p>
@@ -1869,13 +2165,17 @@
         <w:jc w:val="both"/>
         <w:rPr>
           <w:rFonts w:ascii="Times New Roman" w:eastAsia="Times New Roman" w:hAnsi="Times New Roman" w:cs="Times New Roman"/>
-          <w:lang w:eastAsia="en-ID"/>
-        </w:rPr>
-      </w:pPr>
-      <w:proofErr w:type="spellStart"/>
-      <w:r>
-        <w:rPr>
-          <w:rFonts w:ascii="Times New Roman" w:eastAsia="Times New Roman" w:hAnsi="Times New Roman" w:cs="Times New Roman"/>
+          <w:sz w:val="24"/>
+          <w:szCs w:val="24"/>
+          <w:lang w:eastAsia="en-ID"/>
+        </w:rPr>
+      </w:pPr>
+      <w:proofErr w:type="spellStart"/>
+      <w:r>
+        <w:rPr>
+          <w:rFonts w:ascii="Times New Roman" w:eastAsia="Times New Roman" w:hAnsi="Times New Roman" w:cs="Times New Roman"/>
+          <w:sz w:val="24"/>
+          <w:szCs w:val="24"/>
           <w:lang w:eastAsia="en-ID"/>
         </w:rPr>
         <w:t>Menerangkan</w:t>
@@ -1884,6 +2184,8 @@
       <w:r>
         <w:rPr>
           <w:rFonts w:ascii="Times New Roman" w:eastAsia="Times New Roman" w:hAnsi="Times New Roman" w:cs="Times New Roman"/>
+          <w:sz w:val="24"/>
+          <w:szCs w:val="24"/>
           <w:lang w:eastAsia="en-ID"/>
         </w:rPr>
         <w:t xml:space="preserve"> </w:t>
@@ -1892,6 +2194,8 @@
       <w:r>
         <w:rPr>
           <w:rFonts w:ascii="Times New Roman" w:eastAsia="Times New Roman" w:hAnsi="Times New Roman" w:cs="Times New Roman"/>
+          <w:sz w:val="24"/>
+          <w:szCs w:val="24"/>
           <w:lang w:eastAsia="en-ID"/>
         </w:rPr>
         <w:t>b</w:t>
@@ -1899,6 +2203,8 @@
       <w:r>
         <w:rPr>
           <w:rFonts w:ascii="Times New Roman" w:eastAsia="Times New Roman" w:hAnsi="Times New Roman" w:cs="Times New Roman"/>
+          <w:sz w:val="24"/>
+          <w:szCs w:val="24"/>
           <w:lang w:eastAsia="en-ID"/>
         </w:rPr>
         <w:t>ahwa</w:t>
@@ -1907,6 +2213,8 @@
       <w:r>
         <w:rPr>
           <w:rFonts w:ascii="Times New Roman" w:eastAsia="Times New Roman" w:hAnsi="Times New Roman" w:cs="Times New Roman"/>
+          <w:sz w:val="24"/>
+          <w:szCs w:val="24"/>
           <w:lang w:eastAsia="en-ID"/>
         </w:rPr>
         <w:t xml:space="preserve"> </w:t>
@@ -1914,6 +2222,8 @@
       <w:r>
         <w:rPr>
           <w:rFonts w:ascii="Times New Roman" w:eastAsia="Times New Roman" w:hAnsi="Times New Roman" w:cs="Times New Roman"/>
+          <w:sz w:val="24"/>
+          <w:szCs w:val="24"/>
           <w:lang w:eastAsia="en-ID"/>
         </w:rPr>
         <w:t>o</w:t>
@@ -1921,6 +2231,8 @@
       <w:r>
         <w:rPr>
           <w:rFonts w:ascii="Times New Roman" w:eastAsia="Times New Roman" w:hAnsi="Times New Roman" w:cs="Times New Roman"/>
+          <w:sz w:val="24"/>
+          <w:szCs w:val="24"/>
           <w:lang w:eastAsia="en-ID"/>
         </w:rPr>
         <w:t xml:space="preserve">rang </w:t>
@@ -1929,6 +2241,8 @@
       <w:r>
         <w:rPr>
           <w:rFonts w:ascii="Times New Roman" w:eastAsia="Times New Roman" w:hAnsi="Times New Roman" w:cs="Times New Roman"/>
+          <w:sz w:val="24"/>
+          <w:szCs w:val="24"/>
           <w:lang w:eastAsia="en-ID"/>
         </w:rPr>
         <w:t>tersebut</w:t>
@@ -1937,6 +2251,8 @@
       <w:r>
         <w:rPr>
           <w:rFonts w:ascii="Times New Roman" w:eastAsia="Times New Roman" w:hAnsi="Times New Roman" w:cs="Times New Roman"/>
+          <w:sz w:val="24"/>
+          <w:szCs w:val="24"/>
           <w:lang w:eastAsia="en-ID"/>
         </w:rPr>
         <w:t xml:space="preserve"> </w:t>
@@ -1945,6 +2261,8 @@
       <w:r>
         <w:rPr>
           <w:rFonts w:ascii="Times New Roman" w:eastAsia="Times New Roman" w:hAnsi="Times New Roman" w:cs="Times New Roman"/>
+          <w:sz w:val="24"/>
+          <w:szCs w:val="24"/>
           <w:lang w:eastAsia="en-ID"/>
         </w:rPr>
         <w:t>diatas</w:t>
@@ -1953,6 +2271,8 @@
       <w:r>
         <w:rPr>
           <w:rFonts w:ascii="Times New Roman" w:eastAsia="Times New Roman" w:hAnsi="Times New Roman" w:cs="Times New Roman"/>
+          <w:sz w:val="24"/>
+          <w:szCs w:val="24"/>
           <w:lang w:eastAsia="en-ID"/>
         </w:rPr>
         <w:t xml:space="preserve"> Betul Warga Masyarakat </w:t>
@@ -1960,6 +2280,8 @@
       <w:r>
         <w:rPr>
           <w:rFonts w:ascii="Times New Roman" w:eastAsia="Times New Roman" w:hAnsi="Times New Roman" w:cs="Times New Roman"/>
+          <w:sz w:val="24"/>
+          <w:szCs w:val="24"/>
           <w:lang w:val="id-ID" w:eastAsia="en-ID"/>
         </w:rPr>
         <w:t>Desa Sukarama</w:t>
@@ -1967,6 +2289,8 @@
       <w:r>
         <w:rPr>
           <w:rFonts w:ascii="Times New Roman" w:eastAsia="Times New Roman" w:hAnsi="Times New Roman" w:cs="Times New Roman"/>
+          <w:sz w:val="24"/>
+          <w:szCs w:val="24"/>
           <w:lang w:val="id-ID" w:eastAsia="en-ID"/>
         </w:rPr>
         <w:t xml:space="preserve"> </w:t>
@@ -1974,6 +2298,8 @@
       <w:r>
         <w:rPr>
           <w:rFonts w:ascii="Times New Roman" w:eastAsia="Times New Roman" w:hAnsi="Times New Roman" w:cs="Times New Roman"/>
+          <w:sz w:val="24"/>
+          <w:szCs w:val="24"/>
           <w:lang w:eastAsia="en-ID"/>
         </w:rPr>
         <w:t xml:space="preserve">dan </w:t>
@@ -1982,6 +2308,8 @@
       <w:r>
         <w:rPr>
           <w:rFonts w:ascii="Times New Roman" w:eastAsia="Times New Roman" w:hAnsi="Times New Roman" w:cs="Times New Roman"/>
+          <w:sz w:val="24"/>
+          <w:szCs w:val="24"/>
           <w:lang w:eastAsia="en-ID"/>
         </w:rPr>
         <w:t>berdomisili</w:t>
@@ -1990,64 +2318,214 @@
       <w:r>
         <w:rPr>
           <w:rFonts w:ascii="Times New Roman" w:eastAsia="Times New Roman" w:hAnsi="Times New Roman" w:cs="Times New Roman"/>
+          <w:sz w:val="24"/>
+          <w:szCs w:val="24"/>
           <w:lang w:eastAsia="en-ID"/>
         </w:rPr>
         <w:t xml:space="preserve"> </w:t>
       </w:r>
-    </w:p>
-    <w:p>
-      <w:pPr>
-        <w:spacing w:after="0" w:line="240" w:lineRule="auto"/>
-        <w:ind w:right="50"/>
-        <w:jc w:val="both"/>
-        <w:rPr>
-          <w:rFonts w:ascii="Times New Roman" w:eastAsia="Times New Roman" w:hAnsi="Times New Roman" w:cs="Times New Roman"/>
+      <w:r>
+        <w:rPr>
+          <w:rFonts w:ascii="Times New Roman" w:eastAsia="Times New Roman" w:hAnsi="Times New Roman" w:cs="Times New Roman"/>
+          <w:sz w:val="24"/>
+          <w:szCs w:val="24"/>
+          <w:lang w:eastAsia="en-ID"/>
+        </w:rPr>
+        <w:t xml:space="preserve">di Desa </w:t>
+      </w:r>
+      <w:proofErr w:type="spellStart"/>
+      <w:r>
+        <w:rPr>
+          <w:rFonts w:ascii="Times New Roman" w:eastAsia="Times New Roman" w:hAnsi="Times New Roman" w:cs="Times New Roman"/>
+          <w:sz w:val="24"/>
+          <w:szCs w:val="24"/>
+          <w:lang w:eastAsia="en-ID"/>
+        </w:rPr>
+        <w:t>Sukarama</w:t>
+      </w:r>
+      <w:proofErr w:type="spellEnd"/>
+      <w:r>
+        <w:rPr>
+          <w:rFonts w:ascii="Times New Roman" w:eastAsia="Times New Roman" w:hAnsi="Times New Roman" w:cs="Times New Roman"/>
+          <w:sz w:val="24"/>
+          <w:szCs w:val="24"/>
+          <w:lang w:eastAsia="en-ID"/>
+        </w:rPr>
+        <w:t xml:space="preserve">, </w:t>
+      </w:r>
+      <w:proofErr w:type="spellStart"/>
+      <w:r>
+        <w:rPr>
+          <w:rFonts w:ascii="Times New Roman" w:eastAsia="Times New Roman" w:hAnsi="Times New Roman" w:cs="Times New Roman"/>
+          <w:sz w:val="24"/>
+          <w:szCs w:val="24"/>
+          <w:lang w:eastAsia="en-ID"/>
+        </w:rPr>
+        <w:t>K</w:t>
+      </w:r>
+      <w:r>
+        <w:rPr>
+          <w:rFonts w:ascii="Times New Roman" w:eastAsia="Times New Roman" w:hAnsi="Times New Roman" w:cs="Times New Roman"/>
+          <w:sz w:val="24"/>
+          <w:szCs w:val="24"/>
+          <w:lang w:eastAsia="en-ID"/>
+        </w:rPr>
+        <w:t>ecamatan</w:t>
+      </w:r>
+      <w:proofErr w:type="spellEnd"/>
+      <w:r>
+        <w:rPr>
+          <w:rFonts w:ascii="Times New Roman" w:eastAsia="Times New Roman" w:hAnsi="Times New Roman" w:cs="Times New Roman"/>
+          <w:sz w:val="24"/>
+          <w:szCs w:val="24"/>
+          <w:lang w:eastAsia="en-ID"/>
+        </w:rPr>
+        <w:t xml:space="preserve"> </w:t>
+      </w:r>
+      <w:proofErr w:type="spellStart"/>
+      <w:r>
+        <w:rPr>
+          <w:rFonts w:ascii="Times New Roman" w:eastAsia="Times New Roman" w:hAnsi="Times New Roman" w:cs="Times New Roman"/>
+          <w:sz w:val="24"/>
+          <w:szCs w:val="24"/>
+          <w:lang w:eastAsia="en-ID"/>
+        </w:rPr>
+        <w:t>Bojongpicung</w:t>
+      </w:r>
+      <w:proofErr w:type="spellEnd"/>
+      <w:r>
+        <w:rPr>
+          <w:rFonts w:ascii="Times New Roman" w:eastAsia="Times New Roman" w:hAnsi="Times New Roman" w:cs="Times New Roman"/>
+          <w:sz w:val="24"/>
+          <w:szCs w:val="24"/>
+          <w:lang w:eastAsia="en-ID"/>
+        </w:rPr>
+        <w:t xml:space="preserve"> </w:t>
+      </w:r>
+      <w:proofErr w:type="spellStart"/>
+      <w:r>
+        <w:rPr>
+          <w:rFonts w:ascii="Times New Roman" w:eastAsia="Times New Roman" w:hAnsi="Times New Roman" w:cs="Times New Roman"/>
+          <w:sz w:val="24"/>
+          <w:szCs w:val="24"/>
+          <w:lang w:eastAsia="en-ID"/>
+        </w:rPr>
+        <w:t>Kab</w:t>
+      </w:r>
+      <w:proofErr w:type="spellEnd"/>
+      <w:r>
+        <w:rPr>
+          <w:rFonts w:ascii="Times New Roman" w:eastAsia="Times New Roman" w:hAnsi="Times New Roman" w:cs="Times New Roman"/>
+          <w:sz w:val="24"/>
+          <w:szCs w:val="24"/>
+          <w:lang w:eastAsia="en-ID"/>
+        </w:rPr>
+        <w:t>.</w:t>
+      </w:r>
+      <w:r>
+        <w:rPr>
+          <w:rFonts w:ascii="Times New Roman" w:eastAsia="Times New Roman" w:hAnsi="Times New Roman" w:cs="Times New Roman"/>
+          <w:sz w:val="24"/>
+          <w:szCs w:val="24"/>
+          <w:lang w:eastAsia="en-ID"/>
+        </w:rPr>
+        <w:t xml:space="preserve"> </w:t>
+      </w:r>
+      <w:proofErr w:type="spellStart"/>
+      <w:r>
+        <w:rPr>
+          <w:rFonts w:ascii="Times New Roman" w:eastAsia="Times New Roman" w:hAnsi="Times New Roman" w:cs="Times New Roman"/>
+          <w:sz w:val="24"/>
+          <w:szCs w:val="24"/>
+          <w:lang w:eastAsia="en-ID"/>
+        </w:rPr>
+        <w:t>Cianjur</w:t>
+      </w:r>
+      <w:proofErr w:type="spellEnd"/>
+      <w:r>
+        <w:rPr>
+          <w:rFonts w:ascii="Times New Roman" w:eastAsia="Times New Roman" w:hAnsi="Times New Roman" w:cs="Times New Roman"/>
+          <w:sz w:val="24"/>
+          <w:szCs w:val="24"/>
+          <w:lang w:eastAsia="en-ID"/>
+        </w:rPr>
+        <w:t xml:space="preserve"> </w:t>
+      </w:r>
+      <w:proofErr w:type="spellStart"/>
+      <w:r>
+        <w:rPr>
+          <w:rFonts w:ascii="Times New Roman" w:eastAsia="Times New Roman" w:hAnsi="Times New Roman" w:cs="Times New Roman"/>
+          <w:sz w:val="24"/>
+          <w:szCs w:val="24"/>
+          <w:lang w:eastAsia="en-ID"/>
+        </w:rPr>
+        <w:t>ada</w:t>
+      </w:r>
+      <w:proofErr w:type="spellEnd"/>
+      <w:r>
+        <w:rPr>
+          <w:rFonts w:ascii="Times New Roman" w:eastAsia="Times New Roman" w:hAnsi="Times New Roman" w:cs="Times New Roman"/>
+          <w:sz w:val="24"/>
+          <w:szCs w:val="24"/>
+          <w:lang w:eastAsia="en-ID"/>
+        </w:rPr>
+        <w:t xml:space="preserve"> </w:t>
+      </w:r>
+      <w:proofErr w:type="spellStart"/>
+      <w:r>
+        <w:rPr>
+          <w:rFonts w:ascii="Times New Roman" w:eastAsia="Times New Roman" w:hAnsi="Times New Roman" w:cs="Times New Roman"/>
+          <w:sz w:val="24"/>
+          <w:szCs w:val="24"/>
+          <w:lang w:eastAsia="en-ID"/>
+        </w:rPr>
+        <w:t>P</w:t>
+      </w:r>
+      <w:r>
+        <w:rPr>
+          <w:rFonts w:ascii="Times New Roman" w:eastAsia="Times New Roman" w:hAnsi="Times New Roman" w:cs="Times New Roman"/>
+          <w:sz w:val="24"/>
+          <w:szCs w:val="24"/>
+          <w:lang w:eastAsia="en-ID"/>
+        </w:rPr>
+        <w:t>erbedaan</w:t>
+      </w:r>
+      <w:proofErr w:type="spellEnd"/>
+      <w:r>
+        <w:rPr>
+          <w:rFonts w:ascii="Times New Roman" w:eastAsia="Times New Roman" w:hAnsi="Times New Roman" w:cs="Times New Roman"/>
+          <w:sz w:val="24"/>
+          <w:szCs w:val="24"/>
+          <w:lang w:eastAsia="en-ID"/>
+        </w:rPr>
+        <w:t xml:space="preserve"> </w:t>
+      </w:r>
+      <w:r>
+        <w:rPr>
+          <w:rFonts w:ascii="Times New Roman" w:eastAsia="Times New Roman" w:hAnsi="Times New Roman" w:cs="Times New Roman"/>
+          <w:sz w:val="24"/>
+          <w:szCs w:val="24"/>
           <w:lang w:val="en-US" w:eastAsia="en-ID"/>
         </w:rPr>
-      </w:pPr>
-      <w:r>
-        <w:rPr>
-          <w:rFonts w:ascii="Times New Roman" w:eastAsia="Times New Roman" w:hAnsi="Times New Roman" w:cs="Times New Roman"/>
-          <w:lang w:eastAsia="en-ID"/>
-        </w:rPr>
-        <w:t xml:space="preserve">di Desa </w:t>
-      </w:r>
-      <w:proofErr w:type="spellStart"/>
-      <w:r>
-        <w:rPr>
-          <w:rFonts w:ascii="Times New Roman" w:eastAsia="Times New Roman" w:hAnsi="Times New Roman" w:cs="Times New Roman"/>
-          <w:lang w:eastAsia="en-ID"/>
-        </w:rPr>
-        <w:t>Sukarama</w:t>
-      </w:r>
-      <w:proofErr w:type="spellEnd"/>
-      <w:r>
-        <w:rPr>
-          <w:rFonts w:ascii="Times New Roman" w:eastAsia="Times New Roman" w:hAnsi="Times New Roman" w:cs="Times New Roman"/>
-          <w:lang w:eastAsia="en-ID"/>
-        </w:rPr>
-        <w:t xml:space="preserve">, </w:t>
-      </w:r>
-      <w:proofErr w:type="spellStart"/>
-      <w:r>
-        <w:rPr>
-          <w:rFonts w:ascii="Times New Roman" w:eastAsia="Times New Roman" w:hAnsi="Times New Roman" w:cs="Times New Roman"/>
-          <w:lang w:eastAsia="en-ID"/>
-        </w:rPr>
-        <w:t>K</w:t>
-      </w:r>
-      <w:r>
-        <w:rPr>
-          <w:rFonts w:ascii="Times New Roman" w:eastAsia="Times New Roman" w:hAnsi="Times New Roman" w:cs="Times New Roman"/>
-          <w:lang w:eastAsia="en-ID"/>
-        </w:rPr>
-        <w:t>ecamatan</w:t>
-      </w:r>
-      <w:proofErr w:type="spellEnd"/>
-      <w:r>
-        <w:rPr>
-          <w:rFonts w:ascii="Times New Roman" w:eastAsia="Times New Roman" w:hAnsi="Times New Roman" w:cs="Times New Roman"/>
-          <w:lang w:eastAsia="en-ID"/>
+        <w:t xml:space="preserve">Nama yang </w:t>
+      </w:r>
+      <w:proofErr w:type="spellStart"/>
+      <w:r>
+        <w:rPr>
+          <w:rFonts w:ascii="Times New Roman" w:eastAsia="Times New Roman" w:hAnsi="Times New Roman" w:cs="Times New Roman"/>
+          <w:sz w:val="24"/>
+          <w:szCs w:val="24"/>
+          <w:lang w:val="en-US" w:eastAsia="en-ID"/>
+        </w:rPr>
+        <w:t>tercantum</w:t>
+      </w:r>
+      <w:proofErr w:type="spellEnd"/>
+      <w:r>
+        <w:rPr>
+          <w:rFonts w:ascii="Times New Roman" w:eastAsia="Times New Roman" w:hAnsi="Times New Roman" w:cs="Times New Roman"/>
+          <w:sz w:val="24"/>
+          <w:szCs w:val="24"/>
+          <w:lang w:val="en-US" w:eastAsia="en-ID"/>
         </w:rPr>
         <w:t xml:space="preserve"> </w:t>
       </w:r>
@@ -2055,154 +2533,47 @@
       <w:r>
         <w:rPr>
           <w:rFonts w:ascii="Times New Roman" w:eastAsia="Times New Roman" w:hAnsi="Times New Roman" w:cs="Times New Roman"/>
-          <w:lang w:eastAsia="en-ID"/>
-        </w:rPr>
-        <w:t>Bojongpicung</w:t>
-      </w:r>
-      <w:proofErr w:type="spellEnd"/>
-      <w:r>
-        <w:rPr>
-          <w:rFonts w:ascii="Times New Roman" w:eastAsia="Times New Roman" w:hAnsi="Times New Roman" w:cs="Times New Roman"/>
-          <w:lang w:eastAsia="en-ID"/>
-        </w:rPr>
-        <w:t xml:space="preserve"> </w:t>
-      </w:r>
-      <w:proofErr w:type="spellStart"/>
-      <w:r>
-        <w:rPr>
-          <w:rFonts w:ascii="Times New Roman" w:eastAsia="Times New Roman" w:hAnsi="Times New Roman" w:cs="Times New Roman"/>
-          <w:lang w:eastAsia="en-ID"/>
-        </w:rPr>
-        <w:t>Kab</w:t>
-      </w:r>
-      <w:proofErr w:type="spellEnd"/>
-      <w:r>
-        <w:rPr>
-          <w:rFonts w:ascii="Times New Roman" w:eastAsia="Times New Roman" w:hAnsi="Times New Roman" w:cs="Times New Roman"/>
-          <w:lang w:eastAsia="en-ID"/>
-        </w:rPr>
-        <w:t>.</w:t>
-      </w:r>
-      <w:r>
-        <w:rPr>
-          <w:rFonts w:ascii="Times New Roman" w:eastAsia="Times New Roman" w:hAnsi="Times New Roman" w:cs="Times New Roman"/>
-          <w:lang w:eastAsia="en-ID"/>
-        </w:rPr>
-        <w:t xml:space="preserve"> </w:t>
-      </w:r>
-      <w:proofErr w:type="spellStart"/>
-      <w:r>
-        <w:rPr>
-          <w:rFonts w:ascii="Times New Roman" w:eastAsia="Times New Roman" w:hAnsi="Times New Roman" w:cs="Times New Roman"/>
-          <w:lang w:eastAsia="en-ID"/>
-        </w:rPr>
-        <w:t>Cianjur</w:t>
-      </w:r>
-      <w:proofErr w:type="spellEnd"/>
-      <w:r>
-        <w:rPr>
-          <w:rFonts w:ascii="Times New Roman" w:eastAsia="Times New Roman" w:hAnsi="Times New Roman" w:cs="Times New Roman"/>
-          <w:lang w:eastAsia="en-ID"/>
-        </w:rPr>
-        <w:t xml:space="preserve"> </w:t>
-      </w:r>
-      <w:proofErr w:type="spellStart"/>
-      <w:r>
-        <w:rPr>
-          <w:rFonts w:ascii="Times New Roman" w:eastAsia="Times New Roman" w:hAnsi="Times New Roman" w:cs="Times New Roman"/>
-          <w:lang w:eastAsia="en-ID"/>
-        </w:rPr>
-        <w:t>ada</w:t>
-      </w:r>
-      <w:proofErr w:type="spellEnd"/>
-      <w:r>
-        <w:rPr>
-          <w:rFonts w:ascii="Times New Roman" w:eastAsia="Times New Roman" w:hAnsi="Times New Roman" w:cs="Times New Roman"/>
-          <w:lang w:eastAsia="en-ID"/>
-        </w:rPr>
-        <w:t xml:space="preserve"> </w:t>
-      </w:r>
-      <w:proofErr w:type="spellStart"/>
-      <w:r>
-        <w:rPr>
-          <w:rFonts w:ascii="Times New Roman" w:eastAsia="Times New Roman" w:hAnsi="Times New Roman" w:cs="Times New Roman"/>
-          <w:lang w:eastAsia="en-ID"/>
-        </w:rPr>
-        <w:t>P</w:t>
-      </w:r>
-      <w:r>
-        <w:rPr>
-          <w:rFonts w:ascii="Times New Roman" w:eastAsia="Times New Roman" w:hAnsi="Times New Roman" w:cs="Times New Roman"/>
-          <w:lang w:eastAsia="en-ID"/>
-        </w:rPr>
-        <w:t>erbedaan</w:t>
-      </w:r>
-      <w:proofErr w:type="spellEnd"/>
-      <w:r>
-        <w:rPr>
-          <w:rFonts w:ascii="Times New Roman" w:eastAsia="Times New Roman" w:hAnsi="Times New Roman" w:cs="Times New Roman"/>
-          <w:lang w:eastAsia="en-ID"/>
-        </w:rPr>
-        <w:t xml:space="preserve"> </w:t>
-      </w:r>
-      <w:r>
-        <w:rPr>
-          <w:rFonts w:ascii="Times New Roman" w:eastAsia="Times New Roman" w:hAnsi="Times New Roman" w:cs="Times New Roman"/>
+          <w:sz w:val="24"/>
+          <w:szCs w:val="24"/>
           <w:lang w:val="en-US" w:eastAsia="en-ID"/>
         </w:rPr>
-        <w:t xml:space="preserve">Nama yang </w:t>
-      </w:r>
-      <w:proofErr w:type="spellStart"/>
-      <w:r>
-        <w:rPr>
-          <w:rFonts w:ascii="Times New Roman" w:eastAsia="Times New Roman" w:hAnsi="Times New Roman" w:cs="Times New Roman"/>
+        <w:t>dalam</w:t>
+      </w:r>
+      <w:proofErr w:type="spellEnd"/>
+      <w:r>
+        <w:rPr>
+          <w:rFonts w:ascii="Times New Roman" w:eastAsia="Times New Roman" w:hAnsi="Times New Roman" w:cs="Times New Roman"/>
+          <w:sz w:val="24"/>
+          <w:szCs w:val="24"/>
           <w:lang w:val="en-US" w:eastAsia="en-ID"/>
         </w:rPr>
-        <w:t>tercantum</w:t>
-      </w:r>
-      <w:proofErr w:type="spellEnd"/>
-      <w:r>
-        <w:rPr>
-          <w:rFonts w:ascii="Times New Roman" w:eastAsia="Times New Roman" w:hAnsi="Times New Roman" w:cs="Times New Roman"/>
+        <w:t xml:space="preserve"> Kartu </w:t>
+      </w:r>
+      <w:proofErr w:type="spellStart"/>
+      <w:r>
+        <w:rPr>
+          <w:rFonts w:ascii="Times New Roman" w:eastAsia="Times New Roman" w:hAnsi="Times New Roman" w:cs="Times New Roman"/>
+          <w:sz w:val="24"/>
+          <w:szCs w:val="24"/>
           <w:lang w:val="en-US" w:eastAsia="en-ID"/>
         </w:rPr>
-        <w:t xml:space="preserve"> </w:t>
-      </w:r>
-      <w:proofErr w:type="spellStart"/>
-      <w:r>
-        <w:rPr>
-          <w:rFonts w:ascii="Times New Roman" w:eastAsia="Times New Roman" w:hAnsi="Times New Roman" w:cs="Times New Roman"/>
+        <w:t>Keluarga</w:t>
+      </w:r>
+      <w:proofErr w:type="spellEnd"/>
+      <w:r>
+        <w:rPr>
+          <w:rFonts w:ascii="Times New Roman" w:eastAsia="Times New Roman" w:hAnsi="Times New Roman" w:cs="Times New Roman"/>
+          <w:sz w:val="24"/>
+          <w:szCs w:val="24"/>
           <w:lang w:val="en-US" w:eastAsia="en-ID"/>
         </w:rPr>
-        <w:t>dalam</w:t>
-      </w:r>
-      <w:proofErr w:type="spellEnd"/>
-      <w:r>
-        <w:rPr>
-          <w:rFonts w:ascii="Times New Roman" w:eastAsia="Times New Roman" w:hAnsi="Times New Roman" w:cs="Times New Roman"/>
-          <w:lang w:val="en-US" w:eastAsia="en-ID"/>
-        </w:rPr>
-        <w:t xml:space="preserve"> Kartu </w:t>
-      </w:r>
-      <w:proofErr w:type="spellStart"/>
-      <w:r>
-        <w:rPr>
-          <w:rFonts w:ascii="Times New Roman" w:eastAsia="Times New Roman" w:hAnsi="Times New Roman" w:cs="Times New Roman"/>
-          <w:lang w:val="en-US" w:eastAsia="en-ID"/>
-        </w:rPr>
-        <w:t>Keluarga</w:t>
-      </w:r>
-      <w:proofErr w:type="spellEnd"/>
-      <w:r>
-        <w:rPr>
-          <w:rFonts w:ascii="Times New Roman" w:eastAsia="Times New Roman" w:hAnsi="Times New Roman" w:cs="Times New Roman"/>
-          <w:lang w:val="en-US" w:eastAsia="en-ID"/>
-        </w:rPr>
         <w:t xml:space="preserve"> (KK) </w:t>
       </w:r>
       <w:r>
         <w:rPr>
           <w:rFonts w:ascii="Times New Roman" w:eastAsia="Times New Roman" w:hAnsi="Times New Roman" w:cs="Times New Roman"/>
+          <w:sz w:val="24"/>
+          <w:szCs w:val="24"/>
           <w:lang w:val="id-ID" w:eastAsia="en-ID"/>
         </w:rPr>
         <w:t xml:space="preserve">dan Kartu Tanda Penduduk (KTP) </w:t>
@@ -2211,6 +2582,8 @@
       <w:r>
         <w:rPr>
           <w:rFonts w:ascii="Times New Roman" w:eastAsia="Times New Roman" w:hAnsi="Times New Roman" w:cs="Times New Roman"/>
+          <w:sz w:val="24"/>
+          <w:szCs w:val="24"/>
           <w:lang w:eastAsia="en-ID"/>
         </w:rPr>
         <w:t>adalah</w:t>
@@ -2219,6 +2592,8 @@
       <w:r>
         <w:rPr>
           <w:rFonts w:ascii="Times New Roman" w:eastAsia="Times New Roman" w:hAnsi="Times New Roman" w:cs="Times New Roman"/>
+          <w:sz w:val="24"/>
+          <w:szCs w:val="24"/>
           <w:lang w:eastAsia="en-ID"/>
         </w:rPr>
         <w:t xml:space="preserve"> orang yang </w:t>
@@ -2227,6 +2602,8 @@
       <w:r>
         <w:rPr>
           <w:rFonts w:ascii="Times New Roman" w:eastAsia="Times New Roman" w:hAnsi="Times New Roman" w:cs="Times New Roman"/>
+          <w:sz w:val="24"/>
+          <w:szCs w:val="24"/>
           <w:lang w:eastAsia="en-ID"/>
         </w:rPr>
         <w:t>sama</w:t>
@@ -2235,23 +2612,30 @@
       <w:r>
         <w:rPr>
           <w:rFonts w:ascii="Times New Roman" w:eastAsia="Times New Roman" w:hAnsi="Times New Roman" w:cs="Times New Roman"/>
-          <w:lang w:eastAsia="en-ID"/>
-        </w:rPr>
-        <w:t xml:space="preserve"> , </w:t>
+          <w:sz w:val="24"/>
+          <w:szCs w:val="24"/>
+          <w:lang w:eastAsia="en-ID"/>
+        </w:rPr>
+        <w:t xml:space="preserve"> ,</w:t>
       </w:r>
     </w:p>
     <w:p>
       <w:pPr>
         <w:spacing w:after="0" w:line="240" w:lineRule="auto"/>
         <w:ind w:right="-942"/>
-        <w:rPr>
-          <w:rFonts w:ascii="Times New Roman" w:eastAsia="Times New Roman" w:hAnsi="Times New Roman" w:cs="Times New Roman"/>
-          <w:lang w:val="id-ID" w:eastAsia="en-ID"/>
-        </w:rPr>
-      </w:pPr>
-      <w:r>
-        <w:rPr>
-          <w:rFonts w:ascii="Times New Roman" w:eastAsia="Times New Roman" w:hAnsi="Times New Roman" w:cs="Times New Roman"/>
+        <w:jc w:val="both"/>
+        <w:rPr>
+          <w:rFonts w:ascii="Times New Roman" w:eastAsia="Times New Roman" w:hAnsi="Times New Roman" w:cs="Times New Roman"/>
+          <w:sz w:val="24"/>
+          <w:szCs w:val="24"/>
+          <w:lang w:val="id-ID" w:eastAsia="en-ID"/>
+        </w:rPr>
+      </w:pPr>
+      <w:r>
+        <w:rPr>
+          <w:rFonts w:ascii="Times New Roman" w:eastAsia="Times New Roman" w:hAnsi="Times New Roman" w:cs="Times New Roman"/>
+          <w:sz w:val="24"/>
+          <w:szCs w:val="24"/>
           <w:lang w:val="id-ID" w:eastAsia="en-ID"/>
         </w:rPr>
         <w:t>Keterangan ini untuk melengkapi Persyaratan:</w:t>
@@ -2260,9 +2644,14 @@
     <w:p>
       <w:pPr>
         <w:spacing w:after="0" w:line="240" w:lineRule="auto"/>
+        <w:ind w:right="192"/>
         <w:jc w:val="both"/>
         <w:rPr>
           <w:rFonts w:ascii="Times New Roman" w:eastAsia="Times New Roman" w:hAnsi="Times New Roman" w:cs="Times New Roman"/>
+          <w:i/>
+          <w:iCs/>
+          <w:sz w:val="24"/>
+          <w:szCs w:val="24"/>
           <w:lang w:val="id-ID" w:eastAsia="en-ID"/>
         </w:rPr>
       </w:pPr>
@@ -2276,14 +2665,22 @@
           <w:rFonts w:ascii="Times New Roman" w:eastAsia="Times New Roman" w:hAnsi="Times New Roman" w:cs="Times New Roman"/>
           <w:b/>
           <w:bCs/>
-          <w:lang w:val="id-ID" w:eastAsia="en-ID"/>
-        </w:rPr>
-      </w:pPr>
-      <w:r>
-        <w:rPr>
-          <w:rFonts w:ascii="Times New Roman" w:eastAsia="Times New Roman" w:hAnsi="Times New Roman" w:cs="Times New Roman"/>
-          <w:b/>
-          <w:bCs/>
+          <w:i/>
+          <w:iCs/>
+          <w:sz w:val="24"/>
+          <w:szCs w:val="24"/>
+          <w:lang w:val="id-ID" w:eastAsia="en-ID"/>
+        </w:rPr>
+      </w:pPr>
+      <w:r>
+        <w:rPr>
+          <w:rFonts w:ascii="Times New Roman" w:eastAsia="Times New Roman" w:hAnsi="Times New Roman" w:cs="Times New Roman"/>
+          <w:b/>
+          <w:bCs/>
+          <w:i/>
+          <w:iCs/>
+          <w:sz w:val="24"/>
+          <w:szCs w:val="24"/>
           <w:lang w:val="id-ID" w:eastAsia="en-ID"/>
         </w:rPr>
         <w:t>{keperluan}</w:t>
@@ -2295,6 +2692,8 @@
         <w:jc w:val="both"/>
         <w:rPr>
           <w:rFonts w:ascii="Times New Roman" w:eastAsia="Times New Roman" w:hAnsi="Times New Roman" w:cs="Times New Roman"/>
+          <w:sz w:val="24"/>
+          <w:szCs w:val="24"/>
           <w:lang w:eastAsia="en-ID"/>
         </w:rPr>
       </w:pPr>
@@ -2306,13 +2705,17 @@
         <w:jc w:val="both"/>
         <w:rPr>
           <w:rFonts w:ascii="Times New Roman" w:eastAsia="Times New Roman" w:hAnsi="Times New Roman" w:cs="Times New Roman"/>
-          <w:lang w:eastAsia="en-ID"/>
-        </w:rPr>
-      </w:pPr>
-      <w:proofErr w:type="spellStart"/>
-      <w:r>
-        <w:rPr>
-          <w:rFonts w:ascii="Times New Roman" w:eastAsia="Times New Roman" w:hAnsi="Times New Roman" w:cs="Times New Roman"/>
+          <w:sz w:val="24"/>
+          <w:szCs w:val="24"/>
+          <w:lang w:eastAsia="en-ID"/>
+        </w:rPr>
+      </w:pPr>
+      <w:proofErr w:type="spellStart"/>
+      <w:r>
+        <w:rPr>
+          <w:rFonts w:ascii="Times New Roman" w:eastAsia="Times New Roman" w:hAnsi="Times New Roman" w:cs="Times New Roman"/>
+          <w:sz w:val="24"/>
+          <w:szCs w:val="24"/>
           <w:lang w:eastAsia="en-ID"/>
         </w:rPr>
         <w:t>Demikian</w:t>
@@ -2321,6 +2724,8 @@
       <w:r>
         <w:rPr>
           <w:rFonts w:ascii="Times New Roman" w:eastAsia="Times New Roman" w:hAnsi="Times New Roman" w:cs="Times New Roman"/>
+          <w:sz w:val="24"/>
+          <w:szCs w:val="24"/>
           <w:lang w:eastAsia="en-ID"/>
         </w:rPr>
         <w:t xml:space="preserve"> </w:t>
@@ -2329,6 +2734,8 @@
       <w:r>
         <w:rPr>
           <w:rFonts w:ascii="Times New Roman" w:eastAsia="Times New Roman" w:hAnsi="Times New Roman" w:cs="Times New Roman"/>
+          <w:sz w:val="24"/>
+          <w:szCs w:val="24"/>
           <w:lang w:eastAsia="en-ID"/>
         </w:rPr>
         <w:t>surat</w:t>
@@ -2337,6 +2744,8 @@
       <w:r>
         <w:rPr>
           <w:rFonts w:ascii="Times New Roman" w:eastAsia="Times New Roman" w:hAnsi="Times New Roman" w:cs="Times New Roman"/>
+          <w:sz w:val="24"/>
+          <w:szCs w:val="24"/>
           <w:lang w:eastAsia="en-ID"/>
         </w:rPr>
         <w:t xml:space="preserve"> </w:t>
@@ -2345,6 +2754,8 @@
       <w:r>
         <w:rPr>
           <w:rFonts w:ascii="Times New Roman" w:eastAsia="Times New Roman" w:hAnsi="Times New Roman" w:cs="Times New Roman"/>
+          <w:sz w:val="24"/>
+          <w:szCs w:val="24"/>
           <w:lang w:eastAsia="en-ID"/>
         </w:rPr>
         <w:t>keterangan</w:t>
@@ -2353,6 +2764,8 @@
       <w:r>
         <w:rPr>
           <w:rFonts w:ascii="Times New Roman" w:eastAsia="Times New Roman" w:hAnsi="Times New Roman" w:cs="Times New Roman"/>
+          <w:sz w:val="24"/>
+          <w:szCs w:val="24"/>
           <w:lang w:eastAsia="en-ID"/>
         </w:rPr>
         <w:t xml:space="preserve"> </w:t>
@@ -2361,6 +2774,8 @@
       <w:r>
         <w:rPr>
           <w:rFonts w:ascii="Times New Roman" w:eastAsia="Times New Roman" w:hAnsi="Times New Roman" w:cs="Times New Roman"/>
+          <w:sz w:val="24"/>
+          <w:szCs w:val="24"/>
           <w:lang w:eastAsia="en-ID"/>
         </w:rPr>
         <w:t>ini</w:t>
@@ -2369,6 +2784,8 @@
       <w:r>
         <w:rPr>
           <w:rFonts w:ascii="Times New Roman" w:eastAsia="Times New Roman" w:hAnsi="Times New Roman" w:cs="Times New Roman"/>
+          <w:sz w:val="24"/>
+          <w:szCs w:val="24"/>
           <w:lang w:eastAsia="en-ID"/>
         </w:rPr>
         <w:t xml:space="preserve"> </w:t>
@@ -2377,6 +2794,8 @@
       <w:r>
         <w:rPr>
           <w:rFonts w:ascii="Times New Roman" w:eastAsia="Times New Roman" w:hAnsi="Times New Roman" w:cs="Times New Roman"/>
+          <w:sz w:val="24"/>
+          <w:szCs w:val="24"/>
           <w:lang w:eastAsia="en-ID"/>
         </w:rPr>
         <w:t>dibuat</w:t>
@@ -2385,6 +2804,8 @@
       <w:r>
         <w:rPr>
           <w:rFonts w:ascii="Times New Roman" w:eastAsia="Times New Roman" w:hAnsi="Times New Roman" w:cs="Times New Roman"/>
+          <w:sz w:val="24"/>
+          <w:szCs w:val="24"/>
           <w:lang w:eastAsia="en-ID"/>
         </w:rPr>
         <w:t xml:space="preserve"> dan </w:t>
@@ -2393,6 +2814,8 @@
       <w:r>
         <w:rPr>
           <w:rFonts w:ascii="Times New Roman" w:eastAsia="Times New Roman" w:hAnsi="Times New Roman" w:cs="Times New Roman"/>
+          <w:sz w:val="24"/>
+          <w:szCs w:val="24"/>
           <w:lang w:eastAsia="en-ID"/>
         </w:rPr>
         <w:t>diberikan</w:t>
@@ -2401,6 +2824,8 @@
       <w:r>
         <w:rPr>
           <w:rFonts w:ascii="Times New Roman" w:eastAsia="Times New Roman" w:hAnsi="Times New Roman" w:cs="Times New Roman"/>
+          <w:sz w:val="24"/>
+          <w:szCs w:val="24"/>
           <w:lang w:eastAsia="en-ID"/>
         </w:rPr>
         <w:t xml:space="preserve"> </w:t>
@@ -2409,6 +2834,8 @@
       <w:r>
         <w:rPr>
           <w:rFonts w:ascii="Times New Roman" w:eastAsia="Times New Roman" w:hAnsi="Times New Roman" w:cs="Times New Roman"/>
+          <w:sz w:val="24"/>
+          <w:szCs w:val="24"/>
           <w:lang w:eastAsia="en-ID"/>
         </w:rPr>
         <w:t>kepada</w:t>
@@ -2417,6 +2844,8 @@
       <w:r>
         <w:rPr>
           <w:rFonts w:ascii="Times New Roman" w:eastAsia="Times New Roman" w:hAnsi="Times New Roman" w:cs="Times New Roman"/>
+          <w:sz w:val="24"/>
+          <w:szCs w:val="24"/>
           <w:lang w:eastAsia="en-ID"/>
         </w:rPr>
         <w:t xml:space="preserve"> yang </w:t>
@@ -2425,6 +2854,8 @@
       <w:r>
         <w:rPr>
           <w:rFonts w:ascii="Times New Roman" w:eastAsia="Times New Roman" w:hAnsi="Times New Roman" w:cs="Times New Roman"/>
+          <w:sz w:val="24"/>
+          <w:szCs w:val="24"/>
           <w:lang w:eastAsia="en-ID"/>
         </w:rPr>
         <w:t>bersangkutan</w:t>
@@ -2433,6 +2864,8 @@
       <w:r>
         <w:rPr>
           <w:rFonts w:ascii="Times New Roman" w:eastAsia="Times New Roman" w:hAnsi="Times New Roman" w:cs="Times New Roman"/>
+          <w:sz w:val="24"/>
+          <w:szCs w:val="24"/>
           <w:lang w:eastAsia="en-ID"/>
         </w:rPr>
         <w:t xml:space="preserve"> </w:t>
@@ -2441,6 +2874,8 @@
       <w:r>
         <w:rPr>
           <w:rFonts w:ascii="Times New Roman" w:eastAsia="Times New Roman" w:hAnsi="Times New Roman" w:cs="Times New Roman"/>
+          <w:sz w:val="24"/>
+          <w:szCs w:val="24"/>
           <w:lang w:eastAsia="en-ID"/>
         </w:rPr>
         <w:t>untuk</w:t>
@@ -2449,6 +2884,8 @@
       <w:r>
         <w:rPr>
           <w:rFonts w:ascii="Times New Roman" w:eastAsia="Times New Roman" w:hAnsi="Times New Roman" w:cs="Times New Roman"/>
+          <w:sz w:val="24"/>
+          <w:szCs w:val="24"/>
           <w:lang w:eastAsia="en-ID"/>
         </w:rPr>
         <w:t xml:space="preserve"> </w:t>
@@ -2457,6 +2894,8 @@
       <w:r>
         <w:rPr>
           <w:rFonts w:ascii="Times New Roman" w:eastAsia="Times New Roman" w:hAnsi="Times New Roman" w:cs="Times New Roman"/>
+          <w:sz w:val="24"/>
+          <w:szCs w:val="24"/>
           <w:lang w:eastAsia="en-ID"/>
         </w:rPr>
         <w:t>dipergunakan</w:t>
@@ -2465,6 +2904,8 @@
       <w:r>
         <w:rPr>
           <w:rFonts w:ascii="Times New Roman" w:eastAsia="Times New Roman" w:hAnsi="Times New Roman" w:cs="Times New Roman"/>
+          <w:sz w:val="24"/>
+          <w:szCs w:val="24"/>
           <w:lang w:eastAsia="en-ID"/>
         </w:rPr>
         <w:t xml:space="preserve"> </w:t>
@@ -2473,6 +2914,8 @@
       <w:r>
         <w:rPr>
           <w:rFonts w:ascii="Times New Roman" w:eastAsia="Times New Roman" w:hAnsi="Times New Roman" w:cs="Times New Roman"/>
+          <w:sz w:val="24"/>
+          <w:szCs w:val="24"/>
           <w:lang w:eastAsia="en-ID"/>
         </w:rPr>
         <w:t>sebagaimana</w:t>
@@ -2481,6 +2924,8 @@
       <w:r>
         <w:rPr>
           <w:rFonts w:ascii="Times New Roman" w:eastAsia="Times New Roman" w:hAnsi="Times New Roman" w:cs="Times New Roman"/>
+          <w:sz w:val="24"/>
+          <w:szCs w:val="24"/>
           <w:lang w:eastAsia="en-ID"/>
         </w:rPr>
         <w:t xml:space="preserve"> </w:t>
@@ -2489,6 +2934,8 @@
       <w:r>
         <w:rPr>
           <w:rFonts w:ascii="Times New Roman" w:eastAsia="Times New Roman" w:hAnsi="Times New Roman" w:cs="Times New Roman"/>
+          <w:sz w:val="24"/>
+          <w:szCs w:val="24"/>
           <w:lang w:eastAsia="en-ID"/>
         </w:rPr>
         <w:t>mestinya</w:t>
@@ -2497,6 +2944,8 @@
       <w:r>
         <w:rPr>
           <w:rFonts w:ascii="Times New Roman" w:eastAsia="Times New Roman" w:hAnsi="Times New Roman" w:cs="Times New Roman"/>
+          <w:sz w:val="24"/>
+          <w:szCs w:val="24"/>
           <w:lang w:eastAsia="en-ID"/>
         </w:rPr>
         <w:t xml:space="preserve">. </w:t>
@@ -2797,6 +3246,125 @@
           <w:lang w:eastAsia="en-ID"/>
         </w:rPr>
       </w:pPr>
+      <w:r>
+        <w:rPr>
+          <w:rFonts w:ascii="Times New Roman" w:eastAsia="Times New Roman" w:hAnsi="Times New Roman" w:cs="Times New Roman"/>
+          <w:sz w:val="24"/>
+          <w:szCs w:val="24"/>
+          <w:lang w:eastAsia="en-ID"/>
+        </w:rPr>
+        <w:tab/>
+      </w:r>
+      <w:r>
+        <w:rPr>
+          <w:rFonts w:ascii="Times New Roman" w:eastAsia="Times New Roman" w:hAnsi="Times New Roman" w:cs="Times New Roman"/>
+          <w:sz w:val="24"/>
+          <w:szCs w:val="24"/>
+          <w:lang w:eastAsia="en-ID"/>
+        </w:rPr>
+        <w:tab/>
+      </w:r>
+      <w:r>
+        <w:rPr>
+          <w:rFonts w:ascii="Times New Roman" w:eastAsia="Times New Roman" w:hAnsi="Times New Roman" w:cs="Times New Roman"/>
+          <w:sz w:val="24"/>
+          <w:szCs w:val="24"/>
+          <w:lang w:eastAsia="en-ID"/>
+        </w:rPr>
+        <w:tab/>
+      </w:r>
+      <w:r>
+        <w:rPr>
+          <w:rFonts w:ascii="Times New Roman" w:eastAsia="Times New Roman" w:hAnsi="Times New Roman" w:cs="Times New Roman"/>
+          <w:sz w:val="24"/>
+          <w:szCs w:val="24"/>
+          <w:lang w:eastAsia="en-ID"/>
+        </w:rPr>
+        <w:tab/>
+      </w:r>
+      <w:r>
+        <w:rPr>
+          <w:rFonts w:ascii="Times New Roman" w:eastAsia="Times New Roman" w:hAnsi="Times New Roman" w:cs="Times New Roman"/>
+          <w:sz w:val="24"/>
+          <w:szCs w:val="24"/>
+          <w:lang w:eastAsia="en-ID"/>
+        </w:rPr>
+        <w:tab/>
+      </w:r>
+      <w:r>
+        <w:rPr>
+          <w:rFonts w:ascii="Times New Roman" w:eastAsia="Times New Roman" w:hAnsi="Times New Roman" w:cs="Times New Roman"/>
+          <w:sz w:val="24"/>
+          <w:szCs w:val="24"/>
+          <w:lang w:eastAsia="en-ID"/>
+        </w:rPr>
+        <w:tab/>
+      </w:r>
+      <w:r>
+        <w:rPr>
+          <w:rFonts w:ascii="Times New Roman" w:eastAsia="Times New Roman" w:hAnsi="Times New Roman" w:cs="Times New Roman"/>
+          <w:sz w:val="24"/>
+          <w:szCs w:val="24"/>
+          <w:lang w:eastAsia="en-ID"/>
+        </w:rPr>
+        <w:tab/>
+      </w:r>
+      <w:r>
+        <w:rPr>
+          <w:rFonts w:ascii="Times New Roman" w:eastAsia="Times New Roman" w:hAnsi="Times New Roman" w:cs="Times New Roman"/>
+          <w:sz w:val="24"/>
+          <w:szCs w:val="24"/>
+          <w:lang w:eastAsia="en-ID"/>
+        </w:rPr>
+        <w:tab/>
+      </w:r>
+      <w:r>
+        <w:rPr>
+          <w:rFonts w:ascii="Times New Roman" w:eastAsia="Times New Roman" w:hAnsi="Times New Roman" w:cs="Times New Roman"/>
+          <w:sz w:val="24"/>
+          <w:szCs w:val="24"/>
+          <w:lang w:eastAsia="en-ID"/>
+        </w:rPr>
+        <w:t xml:space="preserve">   </w:t>
+      </w:r>
+      <w:r>
+        <w:rPr>
+          <w:rFonts w:ascii="Times New Roman" w:eastAsia="Times New Roman" w:hAnsi="Times New Roman" w:cs="Times New Roman"/>
+          <w:sz w:val="24"/>
+          <w:szCs w:val="24"/>
+          <w:lang w:eastAsia="en-ID"/>
+        </w:rPr>
+        <w:t>{</w:t>
+      </w:r>
+      <w:r>
+        <w:rPr>
+          <w:rFonts w:ascii="Times New Roman" w:eastAsia="Times New Roman" w:hAnsi="Times New Roman" w:cs="Times New Roman"/>
+          <w:sz w:val="24"/>
+          <w:szCs w:val="24"/>
+          <w:lang w:eastAsia="en-ID"/>
+        </w:rPr>
+        <w:t>%</w:t>
+      </w:r>
+      <w:proofErr w:type="spellStart"/>
+      <w:r>
+        <w:rPr>
+          <w:rFonts w:ascii="Times New Roman" w:eastAsia="Times New Roman" w:hAnsi="Times New Roman" w:cs="Times New Roman"/>
+          <w:sz w:val="24"/>
+          <w:szCs w:val="24"/>
+          <w:lang w:eastAsia="en-ID"/>
+        </w:rPr>
+        <w:t>ttd</w:t>
+      </w:r>
+      <w:proofErr w:type="spellEnd"/>
+      <w:r>
+        <w:rPr>
+          <w:rFonts w:ascii="Times New Roman" w:eastAsia="Times New Roman" w:hAnsi="Times New Roman" w:cs="Times New Roman"/>
+          <w:sz w:val="24"/>
+          <w:szCs w:val="24"/>
+          <w:lang w:eastAsia="en-ID"/>
+        </w:rPr>
+        <w:t>}</w:t>
+      </w:r>
     </w:p>
     <w:p>
       <w:pPr>
@@ -2811,348 +3379,176 @@
     </w:p>
     <w:p>
       <w:pPr>
-        <w:spacing w:after="0" w:line="240" w:lineRule="auto"/>
-        <w:rPr>
-          <w:rFonts w:ascii="Times New Roman" w:eastAsia="Times New Roman" w:hAnsi="Times New Roman" w:cs="Times New Roman"/>
-          <w:sz w:val="24"/>
-          <w:szCs w:val="24"/>
-          <w:lang w:eastAsia="en-ID"/>
-        </w:rPr>
-      </w:pPr>
-      <w:r>
-        <w:rPr>
-          <w:rFonts w:ascii="Times New Roman" w:eastAsia="Times New Roman" w:hAnsi="Times New Roman" w:cs="Times New Roman"/>
-          <w:sz w:val="24"/>
-          <w:szCs w:val="24"/>
-          <w:lang w:eastAsia="en-ID"/>
-        </w:rPr>
-        <w:tab/>
-      </w:r>
-      <w:r>
-        <w:rPr>
-          <w:rFonts w:ascii="Times New Roman" w:eastAsia="Times New Roman" w:hAnsi="Times New Roman" w:cs="Times New Roman"/>
-          <w:sz w:val="24"/>
-          <w:szCs w:val="24"/>
-          <w:lang w:eastAsia="en-ID"/>
-        </w:rPr>
-        <w:tab/>
-      </w:r>
-      <w:r>
-        <w:rPr>
-          <w:rFonts w:ascii="Times New Roman" w:eastAsia="Times New Roman" w:hAnsi="Times New Roman" w:cs="Times New Roman"/>
-          <w:sz w:val="24"/>
-          <w:szCs w:val="24"/>
-          <w:lang w:eastAsia="en-ID"/>
-        </w:rPr>
-        <w:tab/>
-      </w:r>
-      <w:r>
-        <w:rPr>
-          <w:rFonts w:ascii="Times New Roman" w:eastAsia="Times New Roman" w:hAnsi="Times New Roman" w:cs="Times New Roman"/>
-          <w:sz w:val="24"/>
-          <w:szCs w:val="24"/>
-          <w:lang w:eastAsia="en-ID"/>
-        </w:rPr>
-        <w:tab/>
-      </w:r>
-      <w:r>
-        <w:rPr>
-          <w:rFonts w:ascii="Times New Roman" w:eastAsia="Times New Roman" w:hAnsi="Times New Roman" w:cs="Times New Roman"/>
-          <w:sz w:val="24"/>
-          <w:szCs w:val="24"/>
-          <w:lang w:eastAsia="en-ID"/>
-        </w:rPr>
-        <w:tab/>
-      </w:r>
-      <w:r>
-        <w:rPr>
-          <w:rFonts w:ascii="Times New Roman" w:eastAsia="Times New Roman" w:hAnsi="Times New Roman" w:cs="Times New Roman"/>
-          <w:sz w:val="24"/>
-          <w:szCs w:val="24"/>
-          <w:lang w:eastAsia="en-ID"/>
-        </w:rPr>
-        <w:tab/>
-      </w:r>
-      <w:r>
-        <w:rPr>
-          <w:rFonts w:ascii="Times New Roman" w:eastAsia="Times New Roman" w:hAnsi="Times New Roman" w:cs="Times New Roman"/>
-          <w:sz w:val="24"/>
-          <w:szCs w:val="24"/>
-          <w:lang w:eastAsia="en-ID"/>
-        </w:rPr>
-        <w:tab/>
-      </w:r>
-      <w:r>
-        <w:rPr>
-          <w:rFonts w:ascii="Times New Roman" w:eastAsia="Times New Roman" w:hAnsi="Times New Roman" w:cs="Times New Roman"/>
-          <w:sz w:val="24"/>
-          <w:szCs w:val="24"/>
-          <w:lang w:eastAsia="en-ID"/>
-        </w:rPr>
-        <w:tab/>
-      </w:r>
-      <w:r>
-        <w:rPr>
-          <w:rFonts w:ascii="Times New Roman" w:eastAsia="Times New Roman" w:hAnsi="Times New Roman" w:cs="Times New Roman"/>
-          <w:sz w:val="24"/>
-          <w:szCs w:val="24"/>
-          <w:lang w:eastAsia="en-ID"/>
-        </w:rPr>
-        <w:t xml:space="preserve">   </w:t>
-      </w:r>
-      <w:r>
-        <w:rPr>
-          <w:rFonts w:ascii="Times New Roman" w:eastAsia="Times New Roman" w:hAnsi="Times New Roman" w:cs="Times New Roman"/>
+        <w:spacing w:after="0"/>
+        <w:rPr>
+          <w:rFonts w:ascii="Times New Roman" w:hAnsi="Times New Roman" w:cs="Times New Roman"/>
+          <w:sz w:val="24"/>
+          <w:szCs w:val="24"/>
+        </w:rPr>
+      </w:pPr>
+      <w:r>
+        <w:rPr>
+          <w:rFonts w:ascii="Times New Roman" w:eastAsia="Times New Roman" w:hAnsi="Times New Roman" w:cs="Times New Roman"/>
+          <w:b/>
+          <w:bCs/>
+          <w:sz w:val="24"/>
+          <w:szCs w:val="24"/>
+          <w:lang w:eastAsia="en-ID"/>
+        </w:rPr>
+        <w:tab/>
+      </w:r>
+      <w:r>
+        <w:rPr>
+          <w:rFonts w:ascii="Times New Roman" w:eastAsia="Times New Roman" w:hAnsi="Times New Roman" w:cs="Times New Roman"/>
+          <w:b/>
+          <w:bCs/>
+          <w:sz w:val="24"/>
+          <w:szCs w:val="24"/>
+          <w:lang w:eastAsia="en-ID"/>
+        </w:rPr>
+        <w:tab/>
+      </w:r>
+      <w:r>
+        <w:rPr>
+          <w:rFonts w:ascii="Times New Roman" w:eastAsia="Times New Roman" w:hAnsi="Times New Roman" w:cs="Times New Roman"/>
+          <w:b/>
+          <w:bCs/>
+          <w:sz w:val="24"/>
+          <w:szCs w:val="24"/>
+          <w:lang w:eastAsia="en-ID"/>
+        </w:rPr>
+        <w:tab/>
+        <w:t xml:space="preserve">      </w:t>
+      </w:r>
+      <w:r>
+        <w:rPr>
+          <w:rFonts w:ascii="Times New Roman" w:eastAsia="Times New Roman" w:hAnsi="Times New Roman" w:cs="Times New Roman"/>
+          <w:b/>
+          <w:bCs/>
+          <w:sz w:val="24"/>
+          <w:szCs w:val="24"/>
+          <w:lang w:eastAsia="en-ID"/>
+        </w:rPr>
+        <w:tab/>
+      </w:r>
+      <w:r>
+        <w:rPr>
+          <w:rFonts w:ascii="Times New Roman" w:eastAsia="Times New Roman" w:hAnsi="Times New Roman" w:cs="Times New Roman"/>
+          <w:b/>
+          <w:bCs/>
+          <w:sz w:val="24"/>
+          <w:szCs w:val="24"/>
+          <w:lang w:eastAsia="en-ID"/>
+        </w:rPr>
+        <w:tab/>
+      </w:r>
+      <w:r>
+        <w:rPr>
+          <w:rFonts w:ascii="Times New Roman" w:eastAsia="Times New Roman" w:hAnsi="Times New Roman" w:cs="Times New Roman"/>
+          <w:b/>
+          <w:bCs/>
+          <w:sz w:val="24"/>
+          <w:szCs w:val="24"/>
+          <w:lang w:eastAsia="en-ID"/>
+        </w:rPr>
+        <w:tab/>
+        <w:t xml:space="preserve"> </w:t>
+      </w:r>
+      <w:r>
+        <w:rPr>
+          <w:rFonts w:ascii="Times New Roman" w:eastAsia="Times New Roman" w:hAnsi="Times New Roman" w:cs="Times New Roman"/>
+          <w:b/>
+          <w:bCs/>
+          <w:sz w:val="24"/>
+          <w:szCs w:val="24"/>
+          <w:lang w:eastAsia="en-ID"/>
+        </w:rPr>
+        <w:tab/>
+      </w:r>
+      <w:r>
+        <w:rPr>
+          <w:rFonts w:ascii="Times New Roman" w:eastAsia="Times New Roman" w:hAnsi="Times New Roman" w:cs="Times New Roman"/>
+          <w:b/>
+          <w:bCs/>
+          <w:sz w:val="24"/>
+          <w:szCs w:val="24"/>
+          <w:lang w:eastAsia="en-ID"/>
+        </w:rPr>
+        <w:tab/>
+      </w:r>
+      <w:r>
+        <w:rPr>
+          <w:rFonts w:ascii="Times New Roman" w:eastAsia="Times New Roman" w:hAnsi="Times New Roman" w:cs="Times New Roman"/>
+          <w:b/>
+          <w:bCs/>
           <w:sz w:val="24"/>
           <w:szCs w:val="24"/>
           <w:lang w:eastAsia="en-ID"/>
         </w:rPr>
         <w:t>{</w:t>
       </w:r>
-      <w:r>
-        <w:rPr>
-          <w:rFonts w:ascii="Times New Roman" w:eastAsia="Times New Roman" w:hAnsi="Times New Roman" w:cs="Times New Roman"/>
-          <w:sz w:val="24"/>
-          <w:szCs w:val="24"/>
-          <w:lang w:eastAsia="en-ID"/>
-        </w:rPr>
-        <w:t>%</w:t>
-      </w:r>
-      <w:proofErr w:type="spellStart"/>
-      <w:r>
-        <w:rPr>
-          <w:rFonts w:ascii="Times New Roman" w:eastAsia="Times New Roman" w:hAnsi="Times New Roman" w:cs="Times New Roman"/>
-          <w:sz w:val="24"/>
-          <w:szCs w:val="24"/>
-          <w:lang w:eastAsia="en-ID"/>
-        </w:rPr>
-        <w:t>ttd</w:t>
-      </w:r>
-      <w:proofErr w:type="spellEnd"/>
-      <w:r>
-        <w:rPr>
-          <w:rFonts w:ascii="Times New Roman" w:eastAsia="Times New Roman" w:hAnsi="Times New Roman" w:cs="Times New Roman"/>
+      <w:proofErr w:type="spellStart"/>
+      <w:r>
+        <w:rPr>
+          <w:rFonts w:ascii="Times New Roman" w:eastAsia="Times New Roman" w:hAnsi="Times New Roman" w:cs="Times New Roman"/>
+          <w:b/>
+          <w:bCs/>
+          <w:sz w:val="24"/>
+          <w:szCs w:val="24"/>
+          <w:lang w:eastAsia="en-ID"/>
+        </w:rPr>
+        <w:t>nama</w:t>
+      </w:r>
+      <w:r>
+        <w:rPr>
+          <w:rFonts w:ascii="Times New Roman" w:eastAsia="Times New Roman" w:hAnsi="Times New Roman" w:cs="Times New Roman"/>
+          <w:b/>
+          <w:bCs/>
+          <w:sz w:val="24"/>
+          <w:szCs w:val="24"/>
+          <w:lang w:eastAsia="en-ID"/>
+        </w:rPr>
+        <w:t>_</w:t>
+      </w:r>
+      <w:r>
+        <w:rPr>
+          <w:rFonts w:ascii="Times New Roman" w:eastAsia="Times New Roman" w:hAnsi="Times New Roman" w:cs="Times New Roman"/>
+          <w:b/>
+          <w:bCs/>
+          <w:sz w:val="24"/>
+          <w:szCs w:val="24"/>
+          <w:lang w:eastAsia="en-ID"/>
+        </w:rPr>
+        <w:t>p</w:t>
+      </w:r>
+      <w:r>
+        <w:rPr>
+          <w:rFonts w:ascii="Times New Roman" w:eastAsia="Times New Roman" w:hAnsi="Times New Roman" w:cs="Times New Roman"/>
+          <w:b/>
+          <w:bCs/>
+          <w:sz w:val="24"/>
+          <w:szCs w:val="24"/>
+          <w:lang w:eastAsia="en-ID"/>
+        </w:rPr>
+        <w:t>enandatangan</w:t>
+      </w:r>
+      <w:proofErr w:type="spellEnd"/>
+      <w:r>
+        <w:rPr>
+          <w:rFonts w:ascii="Times New Roman" w:eastAsia="Times New Roman" w:hAnsi="Times New Roman" w:cs="Times New Roman"/>
+          <w:b/>
+          <w:bCs/>
           <w:sz w:val="24"/>
           <w:szCs w:val="24"/>
           <w:lang w:eastAsia="en-ID"/>
         </w:rPr>
         <w:t>}</w:t>
       </w:r>
-    </w:p>
-    <w:p>
-      <w:pPr>
-        <w:spacing w:after="0" w:line="240" w:lineRule="auto"/>
-        <w:rPr>
-          <w:rFonts w:ascii="Times New Roman" w:eastAsia="Times New Roman" w:hAnsi="Times New Roman" w:cs="Times New Roman"/>
-          <w:sz w:val="24"/>
-          <w:szCs w:val="24"/>
-          <w:lang w:eastAsia="en-ID"/>
-        </w:rPr>
-      </w:pPr>
-    </w:p>
-    <w:p>
-      <w:pPr>
-        <w:spacing w:after="0" w:line="240" w:lineRule="auto"/>
-        <w:rPr>
-          <w:rFonts w:ascii="Times New Roman" w:eastAsia="Times New Roman" w:hAnsi="Times New Roman" w:cs="Times New Roman"/>
-          <w:sz w:val="24"/>
-          <w:szCs w:val="24"/>
-          <w:lang w:eastAsia="en-ID"/>
-        </w:rPr>
-      </w:pPr>
-    </w:p>
-    <w:p>
-      <w:pPr>
-        <w:spacing w:after="0" w:line="240" w:lineRule="auto"/>
-        <w:jc w:val="right"/>
-        <w:rPr>
-          <w:rFonts w:ascii="Times New Roman" w:eastAsia="Times New Roman" w:hAnsi="Times New Roman" w:cs="Times New Roman"/>
-          <w:sz w:val="24"/>
-          <w:szCs w:val="24"/>
-          <w:lang w:eastAsia="en-ID"/>
-        </w:rPr>
-      </w:pPr>
-    </w:p>
-    <w:p>
-      <w:pPr>
-        <w:spacing w:after="0"/>
+      <w:r>
         <w:rPr>
           <w:rFonts w:ascii="Times New Roman" w:hAnsi="Times New Roman" w:cs="Times New Roman"/>
-        </w:rPr>
-      </w:pPr>
-      <w:r>
-        <w:rPr>
-          <w:rFonts w:ascii="Times New Roman" w:eastAsia="Times New Roman" w:hAnsi="Times New Roman" w:cs="Times New Roman"/>
-          <w:b/>
-          <w:bCs/>
-          <w:sz w:val="24"/>
-          <w:szCs w:val="24"/>
-          <w:u w:val="single"/>
-          <w:lang w:eastAsia="en-ID"/>
-        </w:rPr>
-        <w:t xml:space="preserve"> </w:t>
-      </w:r>
-      <w:r>
-        <w:rPr>
-          <w:rFonts w:ascii="Times New Roman" w:eastAsia="Times New Roman" w:hAnsi="Times New Roman" w:cs="Times New Roman"/>
-          <w:b/>
-          <w:bCs/>
-          <w:sz w:val="24"/>
-          <w:szCs w:val="24"/>
-          <w:lang w:eastAsia="en-ID"/>
-        </w:rPr>
-        <w:tab/>
-      </w:r>
-      <w:r>
-        <w:rPr>
-          <w:rFonts w:ascii="Times New Roman" w:eastAsia="Times New Roman" w:hAnsi="Times New Roman" w:cs="Times New Roman"/>
-          <w:b/>
-          <w:bCs/>
-          <w:sz w:val="24"/>
-          <w:szCs w:val="24"/>
-          <w:lang w:eastAsia="en-ID"/>
-        </w:rPr>
-        <w:tab/>
-      </w:r>
-      <w:r>
-        <w:rPr>
-          <w:rFonts w:ascii="Times New Roman" w:eastAsia="Times New Roman" w:hAnsi="Times New Roman" w:cs="Times New Roman"/>
-          <w:b/>
-          <w:bCs/>
-          <w:sz w:val="24"/>
-          <w:szCs w:val="24"/>
-          <w:lang w:eastAsia="en-ID"/>
-        </w:rPr>
-        <w:tab/>
-        <w:t xml:space="preserve">      </w:t>
-      </w:r>
-      <w:r>
-        <w:rPr>
-          <w:rFonts w:ascii="Times New Roman" w:eastAsia="Times New Roman" w:hAnsi="Times New Roman" w:cs="Times New Roman"/>
-          <w:b/>
-          <w:bCs/>
-          <w:sz w:val="24"/>
-          <w:szCs w:val="24"/>
-          <w:lang w:eastAsia="en-ID"/>
-        </w:rPr>
-        <w:tab/>
-      </w:r>
-      <w:r>
-        <w:rPr>
-          <w:rFonts w:ascii="Times New Roman" w:eastAsia="Times New Roman" w:hAnsi="Times New Roman" w:cs="Times New Roman"/>
-          <w:b/>
-          <w:bCs/>
-          <w:sz w:val="24"/>
-          <w:szCs w:val="24"/>
-          <w:lang w:eastAsia="en-ID"/>
-        </w:rPr>
-        <w:tab/>
-      </w:r>
-      <w:r>
-        <w:rPr>
-          <w:rFonts w:ascii="Times New Roman" w:eastAsia="Times New Roman" w:hAnsi="Times New Roman" w:cs="Times New Roman"/>
-          <w:b/>
-          <w:bCs/>
-          <w:sz w:val="24"/>
-          <w:szCs w:val="24"/>
-          <w:lang w:eastAsia="en-ID"/>
-        </w:rPr>
-        <w:tab/>
-        <w:t xml:space="preserve"> </w:t>
-      </w:r>
-      <w:r>
-        <w:rPr>
-          <w:rFonts w:ascii="Times New Roman" w:eastAsia="Times New Roman" w:hAnsi="Times New Roman" w:cs="Times New Roman"/>
-          <w:b/>
-          <w:bCs/>
-          <w:sz w:val="24"/>
-          <w:szCs w:val="24"/>
-          <w:lang w:eastAsia="en-ID"/>
-        </w:rPr>
-        <w:tab/>
-      </w:r>
-      <w:r>
-        <w:rPr>
-          <w:rFonts w:ascii="Times New Roman" w:eastAsia="Times New Roman" w:hAnsi="Times New Roman" w:cs="Times New Roman"/>
-          <w:b/>
-          <w:bCs/>
-          <w:sz w:val="24"/>
-          <w:szCs w:val="24"/>
-          <w:lang w:eastAsia="en-ID"/>
-        </w:rPr>
-        <w:tab/>
-      </w:r>
-      <w:r>
-        <w:rPr>
-          <w:rFonts w:ascii="Times New Roman" w:eastAsia="Times New Roman" w:hAnsi="Times New Roman" w:cs="Times New Roman"/>
-          <w:b/>
-          <w:bCs/>
-          <w:sz w:val="24"/>
-          <w:szCs w:val="24"/>
-          <w:lang w:eastAsia="en-ID"/>
-        </w:rPr>
-        <w:t>{</w:t>
-      </w:r>
-      <w:proofErr w:type="spellStart"/>
-      <w:r>
-        <w:rPr>
-          <w:rFonts w:ascii="Times New Roman" w:eastAsia="Times New Roman" w:hAnsi="Times New Roman" w:cs="Times New Roman"/>
-          <w:b/>
-          <w:bCs/>
-          <w:sz w:val="24"/>
-          <w:szCs w:val="24"/>
-          <w:lang w:eastAsia="en-ID"/>
-        </w:rPr>
-        <w:t>nama</w:t>
-      </w:r>
-      <w:r>
-        <w:rPr>
-          <w:rFonts w:ascii="Times New Roman" w:eastAsia="Times New Roman" w:hAnsi="Times New Roman" w:cs="Times New Roman"/>
-          <w:b/>
-          <w:bCs/>
-          <w:sz w:val="24"/>
-          <w:szCs w:val="24"/>
-          <w:lang w:eastAsia="en-ID"/>
-        </w:rPr>
-        <w:t>_</w:t>
-      </w:r>
-      <w:r>
-        <w:rPr>
-          <w:rFonts w:ascii="Times New Roman" w:eastAsia="Times New Roman" w:hAnsi="Times New Roman" w:cs="Times New Roman"/>
-          <w:b/>
-          <w:bCs/>
-          <w:sz w:val="24"/>
-          <w:szCs w:val="24"/>
-          <w:lang w:eastAsia="en-ID"/>
-        </w:rPr>
-        <w:t>p</w:t>
-      </w:r>
-      <w:r>
-        <w:rPr>
-          <w:rFonts w:ascii="Times New Roman" w:eastAsia="Times New Roman" w:hAnsi="Times New Roman" w:cs="Times New Roman"/>
-          <w:b/>
-          <w:bCs/>
-          <w:sz w:val="24"/>
-          <w:szCs w:val="24"/>
-          <w:lang w:eastAsia="en-ID"/>
-        </w:rPr>
-        <w:t>enandatangan</w:t>
-      </w:r>
-      <w:proofErr w:type="spellEnd"/>
-      <w:r>
-        <w:rPr>
-          <w:rFonts w:ascii="Times New Roman" w:eastAsia="Times New Roman" w:hAnsi="Times New Roman" w:cs="Times New Roman"/>
-          <w:b/>
-          <w:bCs/>
-          <w:sz w:val="24"/>
-          <w:szCs w:val="24"/>
-          <w:lang w:eastAsia="en-ID"/>
-        </w:rPr>
-        <w:t>}</w:t>
-      </w:r>
-      <w:r>
-        <w:rPr>
-          <w:rFonts w:ascii="Times New Roman" w:hAnsi="Times New Roman" w:cs="Times New Roman"/>
+          <w:sz w:val="24"/>
+          <w:szCs w:val="24"/>
         </w:rPr>
         <w:t xml:space="preserve">  </w:t>
       </w:r>
@@ -3199,11 +3595,15 @@
         <w:spacing w:after="0"/>
         <w:rPr>
           <w:rFonts w:ascii="Times New Roman" w:hAnsi="Times New Roman" w:cs="Times New Roman"/>
+          <w:sz w:val="24"/>
+          <w:szCs w:val="24"/>
         </w:rPr>
       </w:pPr>
       <w:r>
         <w:rPr>
           <w:rFonts w:ascii="Times New Roman" w:hAnsi="Times New Roman" w:cs="Times New Roman"/>
+          <w:sz w:val="24"/>
+          <w:szCs w:val="24"/>
         </w:rPr>
         <w:t xml:space="preserve">        </w:t>
       </w:r>
@@ -3223,7 +3623,6 @@
         <w:rPr>
           <w:rFonts w:ascii="Times New Roman" w:hAnsi="Times New Roman" w:cs="Times New Roman"/>
         </w:rPr>
-        <w:lastRenderedPageBreak/>
         <w:tab/>
       </w:r>
       <w:r>
@@ -3256,39 +3655,6 @@
           <w:rFonts w:ascii="Times New Roman" w:hAnsi="Times New Roman" w:cs="Times New Roman"/>
         </w:rPr>
         <w:tab/>
-      </w:r>
-      <w:r>
-        <w:rPr>
-          <w:rFonts w:ascii="Times New Roman" w:hAnsi="Times New Roman" w:cs="Times New Roman"/>
-        </w:rPr>
-        <w:t xml:space="preserve"> </w:t>
-      </w:r>
-      <w:r>
-        <w:rPr>
-          <w:rFonts w:ascii="Times New Roman" w:hAnsi="Times New Roman" w:cs="Times New Roman"/>
-        </w:rPr>
-        <w:tab/>
-      </w:r>
-      <w:r>
-        <w:rPr>
-          <w:rFonts w:ascii="Times New Roman" w:hAnsi="Times New Roman" w:cs="Times New Roman"/>
-        </w:rPr>
-        <w:tab/>
-      </w:r>
-    </w:p>
-    <w:p>
-      <w:pPr>
-        <w:rPr>
-          <w:rFonts w:ascii="Times New Roman" w:hAnsi="Times New Roman" w:cs="Times New Roman"/>
-          <w:b/>
-          <w:bCs/>
-        </w:rPr>
-      </w:pPr>
-      <w:r>
-        <w:rPr>
-          <w:rFonts w:ascii="Times New Roman" w:hAnsi="Times New Roman" w:cs="Times New Roman"/>
-        </w:rPr>
-        <w:t xml:space="preserve">                 </w:t>
       </w:r>
     </w:p>
     <w:sectPr>
@@ -3302,7 +3668,7 @@
 </file>
 
 <file path=word/numbering.xml><?xml version="1.0" encoding="utf-8"?>
-<w:numbering xmlns:wpc="http://schemas.microsoft.com/office/word/2010/wordprocessingCanvas" xmlns:cx="http://schemas.microsoft.com/office/drawing/2014/chartex" xmlns:cx1="http://schemas.microsoft.com/office/drawing/2015/9/8/chartex" xmlns:cx2="http://schemas.microsoft.com/office/drawing/2015/10/21/chartex" xmlns:cx3="http://schemas.microsoft.com/office/drawing/2016/5/9/chartex" xmlns:cx4="http://schemas.microsoft.com/office/drawing/2016/5/10/chartex" xmlns:cx5="http://schemas.microsoft.com/office/drawing/2016/5/11/chartex" xmlns:cx6="http://schemas.microsoft.com/office/drawing/2016/5/12/chartex" xmlns:cx7="http://schemas.microsoft.com/office/drawing/2016/5/13/chartex" xmlns:cx8="http://schemas.microsoft.com/office/drawing/2016/5/14/chartex" xmlns:mc="http://schemas.openxmlformats.org/markup-compatibility/2006" xmlns:aink="http://schemas.microsoft.com/office/drawing/2016/ink" xmlns:am3d="http://schemas.microsoft.com/office/drawing/2017/model3d" xmlns:o="urn:schemas-microsoft-com:office:office" xmlns:oel="http://schemas.microsoft.com/office/2019/extlst" xmlns:r="http://schemas.openxmlformats.org/officeDocument/2006/relationships" xmlns:m="http://schemas.openxmlformats.org/officeDocument/2006/math" xmlns:v="urn:schemas-microsoft-com:vml" xmlns:wp14="http://schemas.microsoft.com/office/word/2010/wordprocessingDrawing" xmlns:wp="http://schemas.openxmlformats.org/drawingml/2006/wordprocessingDrawing" xmlns:w10="urn:schemas-microsoft-com:office:word" xmlns:w="http://schemas.openxmlformats.org/wordprocessingml/2006/main" xmlns:w14="http://schemas.microsoft.com/office/word/2010/wordml" xmlns:w15="http://schemas.microsoft.com/office/word/2012/wordml" xmlns:w16cei="http://schemas.microsoft.com/office/word/2026/wordml/cei" xmlns:w16cex="http://schemas.microsoft.com/office/word/2018/wordml/cex" xmlns:w16cid="http://schemas.microsoft.com/office/word/2016/wordml/cid" xmlns:w16="http://schemas.microsoft.com/office/word/2018/wordml" xmlns:w16du="http://schemas.microsoft.com/office/word/2023/wordml/word16du" xmlns:w16sdtdh="http://schemas.microsoft.com/office/word/2020/wordml/sdtdatahash" xmlns:w16sdtfl="http://schemas.microsoft.com/office/word/2024/wordml/sdtformatlock" xmlns:w16se="http://schemas.microsoft.com/office/word/2015/wordml/symex" xmlns:wpg="http://schemas.microsoft.com/office/word/2010/wordprocessingGroup" xmlns:wpi="http://schemas.microsoft.com/office/word/2010/wordprocessingInk" xmlns:wne="http://schemas.microsoft.com/office/word/2006/wordml" xmlns:wps="http://schemas.microsoft.com/office/word/2010/wordprocessingShape" mc:Ignorable="w14 w15 w16se w16cid w16 w16cex w16sdtdh w16sdtfl w16du wp14">
+<w:numbering xmlns:wpc="http://schemas.microsoft.com/office/word/2010/wordprocessingCanvas" xmlns:cx="http://schemas.microsoft.com/office/drawing/2014/chartex" xmlns:cx1="http://schemas.microsoft.com/office/drawing/2015/9/8/chartex" xmlns:cx2="http://schemas.microsoft.com/office/drawing/2015/10/21/chartex" xmlns:cx3="http://schemas.microsoft.com/office/drawing/2016/5/9/chartex" xmlns:cx4="http://schemas.microsoft.com/office/drawing/2016/5/10/chartex" xmlns:cx5="http://schemas.microsoft.com/office/drawing/2016/5/11/chartex" xmlns:cx6="http://schemas.microsoft.com/office/drawing/2016/5/12/chartex" xmlns:cx7="http://schemas.microsoft.com/office/drawing/2016/5/13/chartex" xmlns:cx8="http://schemas.microsoft.com/office/drawing/2016/5/14/chartex" xmlns:mc="http://schemas.openxmlformats.org/markup-compatibility/2006" xmlns:m="http://schemas.openxmlformats.org/officeDocument/2006/math" xmlns:aink="http://schemas.microsoft.com/office/drawing/2016/ink" xmlns:am3d="http://schemas.microsoft.com/office/drawing/2017/model3d" xmlns:oel="http://schemas.microsoft.com/office/2019/extlst" xmlns:r="http://schemas.openxmlformats.org/officeDocument/2006/relationships" xmlns:wp14="http://schemas.microsoft.com/office/word/2010/wordprocessingDrawing" xmlns:wp="http://schemas.openxmlformats.org/drawingml/2006/wordprocessingDrawing" xmlns:wpg="http://schemas.microsoft.com/office/word/2010/wordprocessingGroup" xmlns:wpi="http://schemas.microsoft.com/office/word/2010/wordprocessingInk" xmlns:wps="http://schemas.microsoft.com/office/word/2010/wordprocessingShape" xmlns:o="urn:schemas-microsoft-com:office:office" xmlns:v="urn:schemas-microsoft-com:vml" xmlns:w10="urn:schemas-microsoft-com:office:word" xmlns:w="http://schemas.openxmlformats.org/wordprocessingml/2006/main" xmlns:w14="http://schemas.microsoft.com/office/word/2010/wordml" xmlns:w15="http://schemas.microsoft.com/office/word/2012/wordml" xmlns:w16cex="http://schemas.microsoft.com/office/word/2018/wordml/cex" xmlns:w16cid="http://schemas.microsoft.com/office/word/2016/wordml/cid" xmlns:w16="http://schemas.microsoft.com/office/word/2018/wordml" xmlns:w16sdtdh="http://schemas.microsoft.com/office/word/2020/wordml/sdtdatahash" xmlns:w16sdtfl="http://schemas.microsoft.com/office/word/2024/wordml/sdtformatlock" xmlns:w16se="http://schemas.microsoft.com/office/word/2015/wordml/symex" xmlns:w16du="http://schemas.microsoft.com/office/word/2023/wordml/word16du" xmlns:wne="http://schemas.microsoft.com/office/word/2006/wordml" mc:Ignorable="w14 w15 w16se w16cid w16 w16cex w16sdtdh w16sdtfl w16du wp14">
   <w:abstractNum w:abstractNumId="0" w15:restartNumberingAfterBreak="0">
     <w:nsid w:val="4CDE300C"/>
     <w:multiLevelType w:val="multilevel"/>
@@ -3539,7 +3905,7 @@
 </file>
 
 <file path=word/styles.xml><?xml version="1.0" encoding="utf-8"?>
-<w:styles xmlns:mc="http://schemas.openxmlformats.org/markup-compatibility/2006" xmlns:r="http://schemas.openxmlformats.org/officeDocument/2006/relationships" xmlns:w="http://schemas.openxmlformats.org/wordprocessingml/2006/main" xmlns:w14="http://schemas.microsoft.com/office/word/2010/wordml" xmlns:w15="http://schemas.microsoft.com/office/word/2012/wordml" xmlns:w16cex="http://schemas.microsoft.com/office/word/2018/wordml/cex" xmlns:w16cid="http://schemas.microsoft.com/office/word/2016/wordml/cid" xmlns:w16="http://schemas.microsoft.com/office/word/2018/wordml" xmlns:w16du="http://schemas.microsoft.com/office/word/2023/wordml/word16du" xmlns:w16sdtdh="http://schemas.microsoft.com/office/word/2020/wordml/sdtdatahash" xmlns:w16sdtfl="http://schemas.microsoft.com/office/word/2024/wordml/sdtformatlock" xmlns:w16se="http://schemas.microsoft.com/office/word/2015/wordml/symex" mc:Ignorable="w14 w15 w16se w16cid w16 w16cex w16sdtdh w16sdtfl w16du">
+<w:styles xmlns:mc="http://schemas.openxmlformats.org/markup-compatibility/2006" xmlns:r="http://schemas.openxmlformats.org/officeDocument/2006/relationships" xmlns:w="http://schemas.openxmlformats.org/wordprocessingml/2006/main" xmlns:w14="http://schemas.microsoft.com/office/word/2010/wordml" xmlns:w15="http://schemas.microsoft.com/office/word/2012/wordml" xmlns:w16cex="http://schemas.microsoft.com/office/word/2018/wordml/cex" xmlns:w16cid="http://schemas.microsoft.com/office/word/2016/wordml/cid" xmlns:w16="http://schemas.microsoft.com/office/word/2018/wordml" xmlns:w16sdtdh="http://schemas.microsoft.com/office/word/2020/wordml/sdtdatahash" xmlns:w16sdtfl="http://schemas.microsoft.com/office/word/2024/wordml/sdtformatlock" xmlns:w16se="http://schemas.microsoft.com/office/word/2015/wordml/symex" xmlns:w16du="http://schemas.microsoft.com/office/word/2023/wordml/word16du" mc:Ignorable="w14 w15 w16se w16cid w16 w16cex w16sdtdh w16sdtfl w16du">
   <w:docDefaults>
     <w:rPrDefault>
       <w:rPr>
@@ -3940,7 +4306,6 @@
   <w:style w:type="character" w:default="1" w:styleId="DefaultParagraphFont">
     <w:name w:val="Default Paragraph Font"/>
     <w:uiPriority w:val="1"/>
-    <w:semiHidden/>
     <w:unhideWhenUsed/>
   </w:style>
   <w:style w:type="table" w:default="1" w:styleId="TableNormal">

</xml_diff>